<commit_message>
fix report first part
</commit_message>
<xml_diff>
--- a/docs/report.docx
+++ b/docs/report.docx
@@ -5,8 +5,8 @@
     <w:p>
       <w:pPr>
         <w:widowControl w:val="0"/>
-        <w:spacing w:line="240" w:lineRule="auto"/>
-        <w:ind w:firstLine="0"/>
+        <w:spacing w:line="360" w:lineRule="auto" w:after="0"/>
+        <w:ind w:firstLine="709"/>
         <w:jc w:val="left"/>
         <w:rPr>
           <w:rFonts w:ascii="Arial" w:eastAsia="Arial" w:hAnsi="Arial" w:cs="Arial"/>
@@ -1224,9 +1224,11 @@
     </w:tbl>
     <w:p>
       <w:pPr>
+        <w:spacing w:line="360" w:lineRule="auto" w:after="0"/>
+        <w:ind w:firstLine="709"/>
         <w:sectPr>
           <w:pgSz w:w="11906" w:h="16838"/>
-          <w:pgMar w:top="1134" w:right="567" w:bottom="1134" w:left="1701" w:header="0" w:footer="0" w:gutter="0"/>
+          <w:pgMar w:top="1134" w:right="567" w:bottom="1134" w:left="1134" w:header="0" w:footer="0" w:gutter="0"/>
           <w:pgNumType w:start="1"/>
           <w:cols w:space="720"/>
           <w:formProt w:val="0"/>
@@ -1266,6 +1268,8 @@
     <w:p>
       <w:pPr>
         <w:pStyle w:val="1"/>
+        <w:spacing w:line="360" w:lineRule="auto" w:after="0"/>
+        <w:ind w:firstLine="709"/>
       </w:pPr>
       <w:bookmarkStart w:id="0" w:name="_1fob9te"/>
       <w:bookmarkStart w:id="1" w:name="_Toc38308895"/>
@@ -2200,7 +2204,12 @@
         </w:p>
       </w:sdtContent>
     </w:sdt>
-    <w:p/>
+    <w:p>
+      <w:pPr>
+        <w:spacing w:line="360" w:lineRule="auto" w:after="0"/>
+        <w:ind w:firstLine="709"/>
+      </w:pPr>
+    </w:p>
     <w:p>
       <w:pPr>
         <w:pStyle w:val="2"/>
@@ -2208,6 +2217,8 @@
           <w:ilvl w:val="0"/>
           <w:numId w:val="0"/>
         </w:numPr>
+        <w:spacing w:line="360" w:lineRule="auto" w:after="0"/>
+        <w:ind w:firstLine="709"/>
         <w:jc w:val="both"/>
       </w:pPr>
       <w:bookmarkStart w:id="4" w:name="_jd4antdc2y2w"/>
@@ -2221,6 +2232,8 @@
     <w:p>
       <w:pPr>
         <w:pStyle w:val="1"/>
+        <w:spacing w:line="360" w:lineRule="auto" w:after="0"/>
+        <w:ind w:firstLine="709"/>
       </w:pPr>
       <w:bookmarkStart w:id="6" w:name="_Toc233319894"/>
       <w:r>
@@ -2230,12 +2243,18 @@
       <w:bookmarkEnd w:id="6"/>
     </w:p>
     <w:p>
+      <w:pPr>
+        <w:spacing w:line="360" w:lineRule="auto" w:after="0"/>
+        <w:ind w:firstLine="709"/>
+      </w:pPr>
       <w:r>
         <w:t>Место прохождения практики – 664033 г. Иркутск, ул. Лермонтова, 126</w:t>
       </w:r>
     </w:p>
     <w:p>
       <w:pPr>
+        <w:spacing w:line="360" w:lineRule="auto" w:after="0"/>
+        <w:ind w:firstLine="709"/>
         <w:rPr>
           <w:rFonts w:eastAsia="Calibri"/>
           <w:lang w:bidi="en-US"/>
@@ -2252,7 +2271,8 @@
     <w:p>
       <w:pPr>
         <w:shd w:val="clear" w:color="auto" w:fill="FFFFFF"/>
-        <w:ind w:left="7" w:right="7" w:firstLine="713"/>
+        <w:spacing w:line="360" w:lineRule="auto" w:after="0"/>
+        <w:ind w:left="7" w:right="7" w:firstLine="709"/>
         <w:rPr>
           <w:color w:val="000000"/>
         </w:rPr>
@@ -2267,7 +2287,8 @@
     <w:p>
       <w:pPr>
         <w:shd w:val="clear" w:color="auto" w:fill="FFFFFF"/>
-        <w:ind w:left="7" w:right="22" w:firstLine="727"/>
+        <w:spacing w:line="360" w:lineRule="auto" w:after="0"/>
+        <w:ind w:left="7" w:right="22" w:firstLine="709"/>
         <w:rPr>
           <w:color w:val="000000"/>
           <w:spacing w:val="-1"/>
@@ -2302,6 +2323,8 @@
     </w:p>
     <w:p>
       <w:pPr>
+        <w:spacing w:line="360" w:lineRule="auto" w:after="0"/>
+        <w:ind w:firstLine="709"/>
         <w:rPr>
           <w:color w:val="000000"/>
           <w:spacing w:val="2"/>
@@ -2324,6 +2347,8 @@
     </w:p>
     <w:p>
       <w:pPr>
+        <w:spacing w:line="360" w:lineRule="auto" w:after="0"/>
+        <w:ind w:firstLine="709"/>
         <w:rPr>
           <w:rFonts w:eastAsia="Calibri"/>
           <w:lang w:bidi="en-US"/>
@@ -2352,7 +2377,8 @@
           <w:ilvl w:val="0"/>
           <w:numId w:val="2"/>
         </w:numPr>
-        <w:ind w:left="1077" w:hanging="357"/>
+        <w:spacing w:line="360" w:lineRule="auto" w:after="0"/>
+        <w:ind w:left="1077" w:firstLine="709"/>
         <w:rPr>
           <w:sz w:val="28"/>
         </w:rPr>
@@ -2375,7 +2401,8 @@
         <w:tabs>
           <w:tab w:val="left" w:pos="1087"/>
         </w:tabs>
-        <w:ind w:left="1077" w:hanging="357"/>
+        <w:spacing w:line="360" w:lineRule="auto" w:after="0"/>
+        <w:ind w:left="1077" w:firstLine="709"/>
         <w:rPr>
           <w:color w:val="000000"/>
         </w:rPr>
@@ -2398,7 +2425,8 @@
         <w:tabs>
           <w:tab w:val="left" w:pos="1087"/>
         </w:tabs>
-        <w:ind w:left="1077" w:hanging="357"/>
+        <w:spacing w:line="360" w:lineRule="auto" w:after="0"/>
+        <w:ind w:left="1077" w:firstLine="709"/>
         <w:rPr>
           <w:color w:val="000000"/>
         </w:rPr>
@@ -2421,7 +2449,8 @@
         <w:tabs>
           <w:tab w:val="left" w:pos="1087"/>
         </w:tabs>
-        <w:ind w:left="1077" w:hanging="357"/>
+        <w:spacing w:line="360" w:lineRule="auto" w:after="0"/>
+        <w:ind w:left="1077" w:firstLine="709"/>
         <w:rPr>
           <w:color w:val="000000"/>
         </w:rPr>
@@ -2444,7 +2473,8 @@
         <w:tabs>
           <w:tab w:val="left" w:pos="1087"/>
         </w:tabs>
-        <w:ind w:left="1077" w:hanging="357"/>
+        <w:spacing w:line="360" w:lineRule="auto" w:after="0"/>
+        <w:ind w:left="1077" w:firstLine="709"/>
         <w:rPr>
           <w:color w:val="000000"/>
         </w:rPr>
@@ -2474,7 +2504,8 @@
         <w:tabs>
           <w:tab w:val="left" w:pos="1087"/>
         </w:tabs>
-        <w:ind w:left="1077" w:hanging="357"/>
+        <w:spacing w:line="360" w:lineRule="auto" w:after="0"/>
+        <w:ind w:left="1077" w:firstLine="709"/>
         <w:rPr>
           <w:color w:val="000000"/>
         </w:rPr>
@@ -2497,7 +2528,8 @@
         <w:tabs>
           <w:tab w:val="left" w:pos="1087"/>
         </w:tabs>
-        <w:ind w:left="1077" w:hanging="357"/>
+        <w:spacing w:line="360" w:lineRule="auto" w:after="0"/>
+        <w:ind w:left="1077" w:firstLine="709"/>
         <w:rPr>
           <w:color w:val="000000"/>
         </w:rPr>
@@ -2527,7 +2559,8 @@
         <w:tabs>
           <w:tab w:val="left" w:pos="1087"/>
         </w:tabs>
-        <w:ind w:left="1077" w:hanging="357"/>
+        <w:spacing w:line="360" w:lineRule="auto" w:after="0"/>
+        <w:ind w:left="1077" w:firstLine="709"/>
         <w:rPr>
           <w:color w:val="000000"/>
         </w:rPr>
@@ -2555,10 +2588,15 @@
     <w:p>
       <w:pPr>
         <w:pStyle w:val="af4"/>
-        <w:ind w:left="1080" w:firstLine="0"/>
-      </w:pPr>
-    </w:p>
-    <w:p>
+        <w:spacing w:line="360" w:lineRule="auto" w:after="0"/>
+        <w:ind w:left="1080" w:firstLine="709"/>
+      </w:pPr>
+    </w:p>
+    <w:p>
+      <w:pPr>
+        <w:spacing w:line="360" w:lineRule="auto" w:after="0"/>
+        <w:ind w:firstLine="709"/>
+      </w:pPr>
       <w:r>
         <w:t>Объектом исследования является</w:t>
       </w:r>
@@ -2579,6 +2617,10 @@
       </w:r>
     </w:p>
     <w:p>
+      <w:pPr>
+        <w:spacing w:line="360" w:lineRule="auto" w:after="0"/>
+        <w:ind w:firstLine="709"/>
+      </w:pPr>
       <w:r>
         <w:t xml:space="preserve">Предметом исследования </w:t>
       </w:r>
@@ -2590,6 +2632,10 @@
       </w:r>
     </w:p>
     <w:p>
+      <w:pPr>
+        <w:spacing w:line="360" w:lineRule="auto" w:after="0"/>
+        <w:ind w:firstLine="709"/>
+      </w:pPr>
       <w:r>
         <w:t>Структура отчета: введение, две главы, заключение, список используемых источников, приложения.</w:t>
       </w:r>
@@ -2597,6 +2643,9 @@
     <w:p>
       <w:pPr>
         <w:pStyle w:val="1"/>
+        <w:spacing w:line="360" w:lineRule="auto" w:after="0"/>
+        <w:ind w:firstLine="709"/>
+        <w:jc w:val="center"/>
       </w:pPr>
       <w:bookmarkStart w:id="7" w:name="_9cfrpph3r51n"/>
       <w:bookmarkEnd w:id="7"/>
@@ -2613,6 +2662,8 @@
     <w:p>
       <w:pPr>
         <w:pStyle w:val="2"/>
+        <w:spacing w:line="360" w:lineRule="auto" w:after="0"/>
+        <w:ind w:firstLine="709"/>
       </w:pPr>
       <w:r>
         <w:t xml:space="preserve"> </w:t>
@@ -2626,7 +2677,8 @@
     <w:p>
       <w:pPr>
         <w:pStyle w:val="ds-markdown-paragraph"/>
-        <w:spacing w:before="240" w:beforeAutospacing="0" w:after="240" w:afterAutospacing="0"/>
+        <w:spacing w:before="240" w:beforeAutospacing="0" w:after="0" w:afterAutospacing="0" w:line="360" w:lineRule="auto"/>
+        <w:ind w:firstLine="709"/>
       </w:pPr>
       <w:r>
         <w:rPr>
@@ -2641,7 +2693,8 @@
     <w:p>
       <w:pPr>
         <w:pStyle w:val="ds-markdown-paragraph"/>
-        <w:spacing w:before="240" w:beforeAutospacing="0" w:after="240" w:afterAutospacing="0"/>
+        <w:spacing w:before="240" w:beforeAutospacing="0" w:after="0" w:afterAutospacing="0" w:line="360" w:lineRule="auto"/>
+        <w:ind w:firstLine="709"/>
       </w:pPr>
       <w:r>
         <w:rPr>
@@ -2656,7 +2709,8 @@
     <w:p>
       <w:pPr>
         <w:pStyle w:val="ds-markdown-paragraph"/>
-        <w:spacing w:before="240" w:beforeAutospacing="0" w:after="240" w:afterAutospacing="0"/>
+        <w:spacing w:before="240" w:beforeAutospacing="0" w:after="0" w:afterAutospacing="0" w:line="360" w:lineRule="auto"/>
+        <w:ind w:firstLine="709"/>
       </w:pPr>
       <w:r>
         <w:rPr>
@@ -2673,6 +2727,7 @@
           <w:numId w:val="7"/>
         </w:numPr>
         <w:spacing w:after="0" w:afterAutospacing="0" w:line="360" w:lineRule="auto"/>
+        <w:ind w:firstLine="709"/>
       </w:pPr>
       <w:r>
         <w:t>Разграничение прав доступа для трёх ролей пользователей: администратор, преподаватель, студент.</w:t>
@@ -2686,6 +2741,7 @@
           <w:numId w:val="7"/>
         </w:numPr>
         <w:spacing w:after="0" w:afterAutospacing="0" w:line="360" w:lineRule="auto"/>
+        <w:ind w:firstLine="709"/>
       </w:pPr>
       <w:r>
         <w:t>Возможность для преподавателя создавать темы с указанием уровня работы (курсовая, ВКР, курсовая/ВКР) и описания.</w:t>
@@ -2699,6 +2755,7 @@
           <w:numId w:val="7"/>
         </w:numPr>
         <w:spacing w:after="0" w:afterAutospacing="0" w:line="360" w:lineRule="auto"/>
+        <w:ind w:firstLine="709"/>
       </w:pPr>
       <w:r>
         <w:t>Возможность для студента просматривать доступные темы и записываться на них.</w:t>
@@ -2712,6 +2769,7 @@
           <w:numId w:val="7"/>
         </w:numPr>
         <w:spacing w:after="0" w:afterAutospacing="0" w:line="360" w:lineRule="auto"/>
+        <w:ind w:firstLine="709"/>
       </w:pPr>
       <w:r>
         <w:t>Возможность для преподавателя подтверждать или отклонять заявки студентов.</w:t>
@@ -2725,6 +2783,7 @@
           <w:numId w:val="7"/>
         </w:numPr>
         <w:spacing w:after="0" w:afterAutospacing="0" w:line="360" w:lineRule="auto"/>
+        <w:ind w:firstLine="709"/>
       </w:pPr>
       <w:r>
         <w:t>Автоматическая проверка дедлайнов: ввод тем (сентябрь), запись (до ноября), смена темы (до середины февраля), формирование приказов (декабрь и апрель).</w:t>
@@ -2738,6 +2797,7 @@
           <w:numId w:val="7"/>
         </w:numPr>
         <w:spacing w:after="0" w:afterAutospacing="0" w:line="360" w:lineRule="auto"/>
+        <w:ind w:firstLine="709"/>
       </w:pPr>
       <w:r>
         <w:t>Генерация предварительного и окончательного приказов в формате Microsoft Word.</w:t>
@@ -2751,6 +2811,7 @@
           <w:numId w:val="7"/>
         </w:numPr>
         <w:spacing w:after="0" w:afterAutospacing="0" w:line="360" w:lineRule="auto"/>
+        <w:ind w:firstLine="709"/>
       </w:pPr>
       <w:r>
         <w:t>Импорт списков студентов и преподавателей из файлов формата Microsoft Excel.</w:t>
@@ -2763,7 +2824,8 @@
           <w:between w:val="single" w:sz="4" w:space="1" w:color="auto"/>
           <w:bar w:val="single" w:sz="4" w:color="auto"/>
         </w:pBdr>
-        <w:spacing w:before="240" w:beforeAutospacing="0" w:after="240" w:afterAutospacing="0"/>
+        <w:spacing w:before="240" w:beforeAutospacing="0" w:after="0" w:afterAutospacing="0" w:line="360" w:lineRule="auto"/>
+        <w:ind w:firstLine="709"/>
       </w:pPr>
       <w:r>
         <w:rPr>
@@ -3795,7 +3857,8 @@
     <w:p>
       <w:pPr>
         <w:pStyle w:val="ds-markdown-paragraph"/>
-        <w:spacing w:before="240" w:beforeAutospacing="0" w:after="240" w:afterAutospacing="0"/>
+        <w:spacing w:before="240" w:beforeAutospacing="0" w:after="0" w:afterAutospacing="0" w:line="360" w:lineRule="auto"/>
+        <w:ind w:firstLine="709"/>
         <w:rPr>
           <w:rStyle w:val="af7"/>
         </w:rPr>
@@ -3865,7 +3928,8 @@
     <w:p>
       <w:pPr>
         <w:pStyle w:val="ds-markdown-paragraph"/>
-        <w:spacing w:before="240" w:beforeAutospacing="0" w:after="240" w:afterAutospacing="0" w:line="360" w:lineRule="auto"/>
+        <w:spacing w:before="240" w:beforeAutospacing="0" w:after="0" w:afterAutospacing="0" w:line="360" w:lineRule="auto"/>
+        <w:ind w:firstLine="709"/>
       </w:pPr>
       <w:r>
         <w:rPr>
@@ -3911,7 +3975,8 @@
     </w:p>
     <w:p>
       <w:pPr>
-        <w:spacing w:before="480" w:after="480"/>
+        <w:spacing w:before="480" w:after="0" w:line="360" w:lineRule="auto"/>
+        <w:ind w:firstLine="709"/>
       </w:pPr>
       <w:r>
         <w:lastRenderedPageBreak/>
@@ -3923,6 +3988,8 @@
     <w:p>
       <w:pPr>
         <w:pStyle w:val="2"/>
+        <w:spacing w:line="360" w:lineRule="auto" w:after="0"/>
+        <w:ind w:firstLine="709"/>
       </w:pPr>
       <w:bookmarkStart w:id="10" w:name="_Toc233319897"/>
       <w:r>
@@ -3933,7 +4000,8 @@
     <w:p>
       <w:pPr>
         <w:pStyle w:val="ds-markdown-paragraph"/>
-        <w:spacing w:before="240" w:beforeAutospacing="0" w:after="240" w:afterAutospacing="0"/>
+        <w:spacing w:before="240" w:beforeAutospacing="0" w:after="0" w:afterAutospacing="0" w:line="360" w:lineRule="auto"/>
+        <w:ind w:firstLine="709"/>
       </w:pPr>
       <w:r>
         <w:rPr>
@@ -3952,7 +4020,8 @@
           <w:ilvl w:val="0"/>
           <w:numId w:val="8"/>
         </w:numPr>
-        <w:spacing w:after="0" w:afterAutospacing="0"/>
+        <w:spacing w:after="0" w:afterAutospacing="0" w:line="360" w:lineRule="auto"/>
+        <w:ind w:firstLine="709"/>
       </w:pPr>
       <w:r>
         <w:t>Управление списком студентов (добавление, редактирование, удаление, загрузка из Excel).</w:t>
@@ -3965,7 +4034,8 @@
           <w:ilvl w:val="0"/>
           <w:numId w:val="8"/>
         </w:numPr>
-        <w:spacing w:after="0" w:afterAutospacing="0"/>
+        <w:spacing w:after="0" w:afterAutospacing="0" w:line="360" w:lineRule="auto"/>
+        <w:ind w:firstLine="709"/>
       </w:pPr>
       <w:r>
         <w:t>Управление списком преподавателей (добавление, редактирование, удаление, загрузка из Excel).</w:t>
@@ -3978,7 +4048,8 @@
           <w:ilvl w:val="0"/>
           <w:numId w:val="8"/>
         </w:numPr>
-        <w:spacing w:after="0" w:afterAutospacing="0"/>
+        <w:spacing w:after="0" w:afterAutospacing="0" w:line="360" w:lineRule="auto"/>
+        <w:ind w:firstLine="709"/>
       </w:pPr>
       <w:r>
         <w:t>Просмотр всех тем и их статусов.</w:t>
@@ -3991,7 +4062,8 @@
           <w:ilvl w:val="0"/>
           <w:numId w:val="8"/>
         </w:numPr>
-        <w:spacing w:after="0" w:afterAutospacing="0"/>
+        <w:spacing w:after="0" w:afterAutospacing="0" w:line="360" w:lineRule="auto"/>
+        <w:ind w:firstLine="709"/>
       </w:pPr>
       <w:r>
         <w:t>Принудительное изменение темы или руководителя для студента (после согласования).</w:t>
@@ -4004,7 +4076,8 @@
           <w:ilvl w:val="0"/>
           <w:numId w:val="8"/>
         </w:numPr>
-        <w:spacing w:after="0" w:afterAutospacing="0"/>
+        <w:spacing w:after="0" w:afterAutospacing="0" w:line="360" w:lineRule="auto"/>
+        <w:ind w:firstLine="709"/>
       </w:pPr>
       <w:r>
         <w:t>Настройка дедлайнов (даты ввода тем, окончания записи, смены темы, формирования приказов).</w:t>
@@ -4017,7 +4090,8 @@
           <w:ilvl w:val="0"/>
           <w:numId w:val="8"/>
         </w:numPr>
-        <w:spacing w:after="0" w:afterAutospacing="0"/>
+        <w:spacing w:after="0" w:afterAutospacing="0" w:line="360" w:lineRule="auto"/>
+        <w:ind w:firstLine="709"/>
       </w:pPr>
       <w:r>
         <w:t>Генерация предварительного и окончательного приказов.</w:t>
@@ -4026,7 +4100,8 @@
     <w:p>
       <w:pPr>
         <w:pStyle w:val="ds-markdown-paragraph"/>
-        <w:spacing w:before="240" w:beforeAutospacing="0" w:after="240" w:afterAutospacing="0"/>
+        <w:spacing w:before="240" w:beforeAutospacing="0" w:after="0" w:afterAutospacing="0" w:line="360" w:lineRule="auto"/>
+        <w:ind w:firstLine="709"/>
       </w:pPr>
       <w:r>
         <w:rPr>
@@ -4045,7 +4120,8 @@
           <w:ilvl w:val="0"/>
           <w:numId w:val="9"/>
         </w:numPr>
-        <w:spacing w:after="0" w:afterAutospacing="0"/>
+        <w:spacing w:after="0" w:afterAutospacing="0" w:line="360" w:lineRule="auto"/>
+        <w:ind w:firstLine="709"/>
       </w:pPr>
       <w:r>
         <w:t>Создание тем с указанием уровня (Курсовая / ВКР / Курсовая-ВКР), названия и описания.</w:t>
@@ -4058,7 +4134,8 @@
           <w:ilvl w:val="0"/>
           <w:numId w:val="9"/>
         </w:numPr>
-        <w:spacing w:after="0" w:afterAutospacing="0"/>
+        <w:spacing w:after="0" w:afterAutospacing="0" w:line="360" w:lineRule="auto"/>
+        <w:ind w:firstLine="709"/>
       </w:pPr>
       <w:r>
         <w:t>Просмотр своих тем и количества записавшихся студентов.</w:t>
@@ -4071,7 +4148,8 @@
           <w:ilvl w:val="0"/>
           <w:numId w:val="9"/>
         </w:numPr>
-        <w:spacing w:after="0" w:afterAutospacing="0"/>
+        <w:spacing w:after="0" w:afterAutospacing="0" w:line="360" w:lineRule="auto"/>
+        <w:ind w:firstLine="709"/>
       </w:pPr>
       <w:r>
         <w:t>Подтверждение или отклонение заявок студентов на свои темы.</w:t>
@@ -4084,7 +4162,8 @@
           <w:ilvl w:val="0"/>
           <w:numId w:val="9"/>
         </w:numPr>
-        <w:spacing w:after="0" w:afterAutospacing="0"/>
+        <w:spacing w:after="0" w:afterAutospacing="0" w:line="360" w:lineRule="auto"/>
+        <w:ind w:firstLine="709"/>
       </w:pPr>
       <w:r>
         <w:t>Редактирование своих контактных данных (телефон, почта, мессенджер).</w:t>
@@ -4093,7 +4172,8 @@
     <w:p>
       <w:pPr>
         <w:pStyle w:val="ds-markdown-paragraph"/>
-        <w:spacing w:before="240" w:beforeAutospacing="0" w:after="240" w:afterAutospacing="0"/>
+        <w:spacing w:before="240" w:beforeAutospacing="0" w:after="0" w:afterAutospacing="0" w:line="360" w:lineRule="auto"/>
+        <w:ind w:firstLine="709"/>
       </w:pPr>
       <w:r>
         <w:rPr>
@@ -4112,7 +4192,8 @@
           <w:ilvl w:val="0"/>
           <w:numId w:val="10"/>
         </w:numPr>
-        <w:spacing w:after="0" w:afterAutospacing="0"/>
+        <w:spacing w:after="0" w:afterAutospacing="0" w:line="360" w:lineRule="auto"/>
+        <w:ind w:firstLine="709"/>
       </w:pPr>
       <w:r>
         <w:t>Просмотр всех доступных тем с фильтром по уровню (в зависимости от курса).</w:t>
@@ -4125,7 +4206,8 @@
           <w:ilvl w:val="0"/>
           <w:numId w:val="10"/>
         </w:numPr>
-        <w:spacing w:after="0" w:afterAutospacing="0"/>
+        <w:spacing w:after="0" w:afterAutospacing="0" w:line="360" w:lineRule="auto"/>
+        <w:ind w:firstLine="709"/>
       </w:pPr>
       <w:r>
         <w:t>Запись на свободную тему (занятые темы недоступны для выбора).</w:t>
@@ -4138,7 +4220,8 @@
           <w:ilvl w:val="0"/>
           <w:numId w:val="10"/>
         </w:numPr>
-        <w:spacing w:after="0" w:afterAutospacing="0"/>
+        <w:spacing w:after="0" w:afterAutospacing="0" w:line="360" w:lineRule="auto"/>
+        <w:ind w:firstLine="709"/>
       </w:pPr>
       <w:r>
         <w:t>Просмотр статуса своей записи (ожидание / подтверждено / отказано).</w:t>
@@ -4147,7 +4230,9 @@
     <w:p>
       <w:pPr>
         <w:pStyle w:val="ds-markdown-paragraph"/>
-        <w:spacing w:after="0" w:afterAutospacing="0"/>
+        <w:spacing w:after="0" w:afterAutospacing="0" w:line="360" w:lineRule="auto"/>
+        <w:ind w:firstLine="709"/>
+        <w:jc w:val="center"/>
         <w:rPr>
           <w:highlight w:val="red"/>
         </w:rPr>
@@ -4162,7 +4247,9 @@
     <w:p>
       <w:pPr>
         <w:pStyle w:val="ds-markdown-paragraph"/>
-        <w:spacing w:after="0" w:afterAutospacing="0"/>
+        <w:spacing w:after="0" w:afterAutospacing="0" w:line="360" w:lineRule="auto"/>
+        <w:ind w:firstLine="709"/>
+        <w:jc w:val="center"/>
       </w:pPr>
       <w:r>
         <w:rPr>
@@ -4188,7 +4275,9 @@
     <w:p>
       <w:pPr>
         <w:pStyle w:val="ds-markdown-paragraph"/>
-        <w:spacing w:after="0" w:afterAutospacing="0"/>
+        <w:spacing w:after="0" w:afterAutospacing="0" w:line="360" w:lineRule="auto"/>
+        <w:ind w:firstLine="709"/>
+        <w:jc w:val="center"/>
       </w:pPr>
       <w:r>
         <w:t>ГОСТ ПО ОФОРМЛЕНИЮ ОФ. ДОК</w:t>
@@ -4197,8 +4286,8 @@
     <w:p>
       <w:pPr>
         <w:pStyle w:val="5"/>
-        <w:spacing w:after="240" w:line="420" w:lineRule="atLeast"/>
-        <w:ind w:firstLine="0"/>
+        <w:spacing w:after="0" w:line="360" w:lineRule="auto"/>
+        <w:ind w:firstLine="709"/>
         <w:rPr>
           <w:color w:val="auto"/>
           <w:sz w:val="24"/>
@@ -4270,7 +4359,8 @@
     <w:p>
       <w:pPr>
         <w:pStyle w:val="ds-markdown-paragraph"/>
-        <w:spacing w:before="240" w:beforeAutospacing="0" w:after="240" w:afterAutospacing="0"/>
+        <w:spacing w:before="240" w:beforeAutospacing="0" w:after="0" w:afterAutospacing="0" w:line="360" w:lineRule="auto"/>
+        <w:ind w:firstLine="709"/>
       </w:pPr>
       <w:r>
         <w:rPr>
@@ -4286,7 +4376,8 @@
           <w:ilvl w:val="0"/>
           <w:numId w:val="11"/>
         </w:numPr>
-        <w:spacing w:after="0" w:afterAutospacing="0"/>
+        <w:spacing w:after="0" w:afterAutospacing="0" w:line="360" w:lineRule="auto"/>
+        <w:ind w:firstLine="709"/>
       </w:pPr>
       <w:r>
         <w:t>Администратор загружает в систему списки студентов и преподавателей (вручную или из Excel).</w:t>
@@ -4299,7 +4390,8 @@
           <w:ilvl w:val="0"/>
           <w:numId w:val="11"/>
         </w:numPr>
-        <w:spacing w:after="0" w:afterAutospacing="0"/>
+        <w:spacing w:after="0" w:afterAutospacing="0" w:line="360" w:lineRule="auto"/>
+        <w:ind w:firstLine="709"/>
       </w:pPr>
       <w:r>
         <w:t>Преподаватель вводит тему с указанием уровня, названия и описания.</w:t>
@@ -4312,7 +4404,8 @@
           <w:ilvl w:val="0"/>
           <w:numId w:val="11"/>
         </w:numPr>
-        <w:spacing w:after="0" w:afterAutospacing="0"/>
+        <w:spacing w:after="0" w:afterAutospacing="0" w:line="360" w:lineRule="auto"/>
+        <w:ind w:firstLine="709"/>
       </w:pPr>
       <w:r>
         <w:t>Студент просматривает доступные темы и записывается на одну из них (статус заявки — «ожидание»).</w:t>
@@ -4325,7 +4418,8 @@
           <w:ilvl w:val="0"/>
           <w:numId w:val="11"/>
         </w:numPr>
-        <w:spacing w:after="0" w:afterAutospacing="0"/>
+        <w:spacing w:after="0" w:afterAutospacing="0" w:line="360" w:lineRule="auto"/>
+        <w:ind w:firstLine="709"/>
       </w:pPr>
       <w:r>
         <w:t>Преподаватель рассматривает заявки студентов и подтверждает или отклоняет их.</w:t>
@@ -4338,7 +4432,8 @@
           <w:ilvl w:val="0"/>
           <w:numId w:val="11"/>
         </w:numPr>
-        <w:spacing w:after="0" w:afterAutospacing="0"/>
+        <w:spacing w:after="0" w:afterAutospacing="0" w:line="360" w:lineRule="auto"/>
+        <w:ind w:firstLine="709"/>
       </w:pPr>
       <w:r>
         <w:t>В установленный срок (декабрь) администратор формирует предварительный приказ.</w:t>
@@ -4351,7 +4446,8 @@
           <w:ilvl w:val="0"/>
           <w:numId w:val="11"/>
         </w:numPr>
-        <w:spacing w:after="0" w:afterAutospacing="0"/>
+        <w:spacing w:after="0" w:afterAutospacing="0" w:line="360" w:lineRule="auto"/>
+        <w:ind w:firstLine="709"/>
       </w:pPr>
       <w:r>
         <w:t>В установленный срок (апрель) администратор формирует окончательный приказ для защиты.</w:t>
@@ -4360,7 +4456,8 @@
     <w:p>
       <w:pPr>
         <w:pStyle w:val="ds-markdown-paragraph"/>
-        <w:spacing w:before="240" w:beforeAutospacing="0" w:after="240" w:afterAutospacing="0"/>
+        <w:spacing w:before="240" w:beforeAutospacing="0" w:after="0" w:afterAutospacing="0" w:line="360" w:lineRule="auto"/>
+        <w:ind w:firstLine="709"/>
       </w:pPr>
       <w:r>
         <w:rPr>
@@ -4377,7 +4474,8 @@
           <w:ilvl w:val="0"/>
           <w:numId w:val="12"/>
         </w:numPr>
-        <w:spacing w:after="0" w:afterAutospacing="0"/>
+        <w:spacing w:after="0" w:afterAutospacing="0" w:line="360" w:lineRule="auto"/>
+        <w:ind w:firstLine="709"/>
       </w:pPr>
       <w:r>
         <w:t>Преподаватель может сразу вписать студента в тему, минуя этап подачи заявки.</w:t>
@@ -4390,7 +4488,8 @@
           <w:ilvl w:val="0"/>
           <w:numId w:val="12"/>
         </w:numPr>
-        <w:spacing w:after="0" w:afterAutospacing="0"/>
+        <w:spacing w:after="0" w:afterAutospacing="0" w:line="360" w:lineRule="auto"/>
+        <w:ind w:firstLine="709"/>
       </w:pPr>
       <w:r>
         <w:t>Студент может сменить тему или руководителя до установленного дедлайна (середина февраля) только через администратора.</w:t>
@@ -4403,7 +4502,8 @@
           <w:ilvl w:val="0"/>
           <w:numId w:val="12"/>
         </w:numPr>
-        <w:spacing w:after="0" w:afterAutospacing="0"/>
+        <w:spacing w:after="0" w:afterAutospacing="0" w:line="360" w:lineRule="auto"/>
+        <w:ind w:firstLine="709"/>
       </w:pPr>
       <w:r>
         <w:t>После подтверждения заявки преподавателем студент не может самостоятельно отменить запись или сменить тему.</w:t>
@@ -4412,7 +4512,8 @@
     <w:p>
       <w:pPr>
         <w:pStyle w:val="5"/>
-        <w:spacing w:after="240" w:line="420" w:lineRule="atLeast"/>
+        <w:spacing w:after="0" w:line="360" w:lineRule="auto"/>
+        <w:ind w:firstLine="709"/>
         <w:rPr>
           <w:color w:val="auto"/>
           <w:sz w:val="24"/>
@@ -4431,7 +4532,8 @@
     <w:p>
       <w:pPr>
         <w:pStyle w:val="ds-markdown-paragraph"/>
-        <w:spacing w:before="240" w:beforeAutospacing="0" w:after="240" w:afterAutospacing="0"/>
+        <w:spacing w:before="240" w:beforeAutospacing="0" w:after="0" w:afterAutospacing="0" w:line="360" w:lineRule="auto"/>
+        <w:ind w:firstLine="709"/>
       </w:pPr>
       <w:r>
         <w:t>База данных спроектирована на основе реляционной модели и содержит следующие таблицы:</w:t>
@@ -4444,7 +4546,8 @@
           <w:ilvl w:val="0"/>
           <w:numId w:val="13"/>
         </w:numPr>
-        <w:spacing w:after="0" w:afterAutospacing="0"/>
+        <w:spacing w:after="0" w:afterAutospacing="0" w:line="360" w:lineRule="auto"/>
+        <w:ind w:firstLine="709"/>
         <w:rPr>
           <w:u w:val="single" w:color="FFFFFF" w:themeColor="background1"/>
         </w:rPr>
@@ -4472,7 +4575,8 @@
           <w:ilvl w:val="0"/>
           <w:numId w:val="13"/>
         </w:numPr>
-        <w:spacing w:after="0" w:afterAutospacing="0"/>
+        <w:spacing w:after="0" w:afterAutospacing="0" w:line="360" w:lineRule="auto"/>
+        <w:ind w:firstLine="709"/>
         <w:rPr>
           <w:u w:val="single" w:color="FFFFFF" w:themeColor="background1"/>
         </w:rPr>
@@ -4500,7 +4604,8 @@
           <w:ilvl w:val="0"/>
           <w:numId w:val="13"/>
         </w:numPr>
-        <w:spacing w:after="0" w:afterAutospacing="0"/>
+        <w:spacing w:after="0" w:afterAutospacing="0" w:line="360" w:lineRule="auto"/>
+        <w:ind w:firstLine="709"/>
         <w:rPr>
           <w:u w:val="single" w:color="FFFFFF" w:themeColor="background1"/>
         </w:rPr>
@@ -4528,7 +4633,8 @@
           <w:ilvl w:val="0"/>
           <w:numId w:val="13"/>
         </w:numPr>
-        <w:spacing w:after="0" w:afterAutospacing="0"/>
+        <w:spacing w:after="0" w:afterAutospacing="0" w:line="360" w:lineRule="auto"/>
+        <w:ind w:firstLine="709"/>
         <w:rPr>
           <w:u w:val="single" w:color="FFFFFF" w:themeColor="background1"/>
         </w:rPr>
@@ -4590,7 +4696,8 @@
           <w:ilvl w:val="0"/>
           <w:numId w:val="13"/>
         </w:numPr>
-        <w:spacing w:after="0" w:afterAutospacing="0"/>
+        <w:spacing w:after="0" w:afterAutospacing="0" w:line="360" w:lineRule="auto"/>
+        <w:ind w:firstLine="709"/>
         <w:rPr>
           <w:u w:val="single" w:color="FFFFFF" w:themeColor="background1"/>
         </w:rPr>
@@ -4614,7 +4721,8 @@
     <w:p>
       <w:pPr>
         <w:pStyle w:val="ds-markdown-paragraph"/>
-        <w:spacing w:before="240" w:beforeAutospacing="0" w:after="240" w:afterAutospacing="0"/>
+        <w:spacing w:before="240" w:beforeAutospacing="0" w:after="0" w:afterAutospacing="0" w:line="360" w:lineRule="auto"/>
+        <w:ind w:firstLine="709"/>
         <w:rPr>
           <w:u w:val="single" w:color="FFFFFF" w:themeColor="background1"/>
         </w:rPr>
@@ -4634,7 +4742,8 @@
           <w:ilvl w:val="0"/>
           <w:numId w:val="14"/>
         </w:numPr>
-        <w:spacing w:after="0" w:afterAutospacing="0"/>
+        <w:spacing w:after="0" w:afterAutospacing="0" w:line="360" w:lineRule="auto"/>
+        <w:ind w:firstLine="709"/>
         <w:rPr>
           <w:u w:val="single" w:color="FFFFFF" w:themeColor="background1"/>
         </w:rPr>
@@ -4667,7 +4776,8 @@
           <w:ilvl w:val="0"/>
           <w:numId w:val="14"/>
         </w:numPr>
-        <w:spacing w:after="0" w:afterAutospacing="0"/>
+        <w:spacing w:after="0" w:afterAutospacing="0" w:line="360" w:lineRule="auto"/>
+        <w:ind w:firstLine="709"/>
         <w:rPr>
           <w:u w:val="single" w:color="FFFFFF" w:themeColor="background1"/>
         </w:rPr>
@@ -4686,7 +4796,8 @@
           <w:ilvl w:val="0"/>
           <w:numId w:val="14"/>
         </w:numPr>
-        <w:spacing w:after="0" w:afterAutospacing="0"/>
+        <w:spacing w:after="0" w:afterAutospacing="0" w:line="360" w:lineRule="auto"/>
+        <w:ind w:firstLine="709"/>
         <w:rPr>
           <w:u w:val="single" w:color="FFFFFF" w:themeColor="background1"/>
         </w:rPr>
@@ -4701,7 +4812,8 @@
     <w:p>
       <w:pPr>
         <w:pStyle w:val="ds-markdown-paragraph"/>
-        <w:spacing w:after="0" w:afterAutospacing="0"/>
+        <w:spacing w:after="0" w:afterAutospacing="0" w:line="360" w:lineRule="auto"/>
+        <w:ind w:firstLine="709"/>
         <w:rPr>
           <w:u w:val="single" w:color="FFFFFF" w:themeColor="background1"/>
         </w:rPr>
@@ -4772,7 +4884,8 @@
     <w:p>
       <w:pPr>
         <w:pStyle w:val="ds-markdown-paragraph"/>
-        <w:spacing w:before="240" w:beforeAutospacing="0" w:after="240" w:afterAutospacing="0"/>
+        <w:spacing w:before="240" w:beforeAutospacing="0" w:after="0" w:afterAutospacing="0" w:line="360" w:lineRule="auto"/>
+        <w:ind w:firstLine="709"/>
         <w:rPr>
           <w:u w:val="single" w:color="FFFFFF" w:themeColor="background1"/>
         </w:rPr>
@@ -4787,7 +4900,9 @@
     <w:p>
       <w:pPr>
         <w:pStyle w:val="ds-markdown-paragraph"/>
-        <w:spacing w:before="240" w:beforeAutospacing="0" w:after="240" w:afterAutospacing="0"/>
+        <w:spacing w:before="240" w:beforeAutospacing="0" w:after="0" w:afterAutospacing="0" w:line="360" w:lineRule="auto"/>
+        <w:ind w:firstLine="709"/>
+        <w:jc w:val="center"/>
         <w:rPr>
           <w:u w:val="single" w:color="FFFFFF" w:themeColor="background1"/>
           <w:lang w:val="en-US"/>
@@ -4812,7 +4927,8 @@
     <w:p>
       <w:pPr>
         <w:pStyle w:val="ds-markdown-paragraph"/>
-        <w:spacing w:before="240" w:beforeAutospacing="0" w:after="240" w:afterAutospacing="0"/>
+        <w:spacing w:before="240" w:beforeAutospacing="0" w:after="0" w:afterAutospacing="0" w:line="360" w:lineRule="auto"/>
+        <w:ind w:firstLine="709"/>
         <w:rPr>
           <w:u w:val="single" w:color="FFFFFF" w:themeColor="background1"/>
         </w:rPr>
@@ -4825,7 +4941,8 @@
           <w:ilvl w:val="0"/>
           <w:numId w:val="15"/>
         </w:numPr>
-        <w:spacing w:after="0" w:afterAutospacing="0"/>
+        <w:spacing w:after="0" w:afterAutospacing="0" w:line="360" w:lineRule="auto"/>
+        <w:ind w:firstLine="709"/>
         <w:rPr>
           <w:u w:val="single" w:color="FFFFFF" w:themeColor="background1"/>
         </w:rPr>
@@ -4929,7 +5046,8 @@
           <w:ilvl w:val="0"/>
           <w:numId w:val="15"/>
         </w:numPr>
-        <w:spacing w:after="0" w:afterAutospacing="0"/>
+        <w:spacing w:after="0" w:afterAutospacing="0" w:line="360" w:lineRule="auto"/>
+        <w:ind w:firstLine="709"/>
         <w:rPr>
           <w:u w:val="single" w:color="FFFFFF" w:themeColor="background1"/>
         </w:rPr>
@@ -4957,7 +5075,8 @@
           <w:ilvl w:val="0"/>
           <w:numId w:val="15"/>
         </w:numPr>
-        <w:spacing w:after="0" w:afterAutospacing="0"/>
+        <w:spacing w:after="0" w:afterAutospacing="0" w:line="360" w:lineRule="auto"/>
+        <w:ind w:firstLine="709"/>
         <w:rPr>
           <w:u w:val="single" w:color="FFFFFF" w:themeColor="background1"/>
         </w:rPr>
@@ -4985,7 +5104,8 @@
           <w:ilvl w:val="0"/>
           <w:numId w:val="15"/>
         </w:numPr>
-        <w:spacing w:after="0" w:afterAutospacing="0"/>
+        <w:spacing w:after="0" w:afterAutospacing="0" w:line="360" w:lineRule="auto"/>
+        <w:ind w:firstLine="709"/>
         <w:rPr>
           <w:u w:val="single" w:color="FFFFFF" w:themeColor="background1"/>
         </w:rPr>
@@ -5040,7 +5160,8 @@
           <w:ilvl w:val="0"/>
           <w:numId w:val="15"/>
         </w:numPr>
-        <w:spacing w:after="0" w:afterAutospacing="0"/>
+        <w:spacing w:after="0" w:afterAutospacing="0" w:line="360" w:lineRule="auto"/>
+        <w:ind w:firstLine="709"/>
         <w:rPr>
           <w:u w:val="single" w:color="FFFFFF" w:themeColor="background1"/>
         </w:rPr>
@@ -5068,7 +5189,8 @@
           <w:ilvl w:val="0"/>
           <w:numId w:val="15"/>
         </w:numPr>
-        <w:spacing w:after="0" w:afterAutospacing="0"/>
+        <w:spacing w:after="0" w:afterAutospacing="0" w:line="360" w:lineRule="auto"/>
+        <w:ind w:firstLine="709"/>
         <w:rPr>
           <w:u w:val="single" w:color="FFFFFF" w:themeColor="background1"/>
         </w:rPr>
@@ -5096,7 +5218,8 @@
           <w:ilvl w:val="0"/>
           <w:numId w:val="15"/>
         </w:numPr>
-        <w:spacing w:after="0" w:afterAutospacing="0"/>
+        <w:spacing w:after="0" w:afterAutospacing="0" w:line="360" w:lineRule="auto"/>
+        <w:ind w:firstLine="709"/>
         <w:rPr>
           <w:u w:val="single" w:color="FFFFFF" w:themeColor="background1"/>
         </w:rPr>
@@ -5124,7 +5247,8 @@
           <w:ilvl w:val="0"/>
           <w:numId w:val="15"/>
         </w:numPr>
-        <w:spacing w:after="0" w:afterAutospacing="0"/>
+        <w:spacing w:after="0" w:afterAutospacing="0" w:line="360" w:lineRule="auto"/>
+        <w:ind w:firstLine="709"/>
         <w:rPr>
           <w:u w:val="single" w:color="FFFFFF" w:themeColor="background1"/>
         </w:rPr>
@@ -5228,7 +5352,8 @@
     <w:p>
       <w:pPr>
         <w:pStyle w:val="ds-markdown-paragraph"/>
-        <w:spacing w:before="240" w:beforeAutospacing="0" w:after="240" w:afterAutospacing="0"/>
+        <w:spacing w:before="240" w:beforeAutospacing="0" w:after="0" w:afterAutospacing="0" w:line="360" w:lineRule="auto"/>
+        <w:ind w:firstLine="709"/>
         <w:rPr>
           <w:u w:val="single" w:color="FFFFFF" w:themeColor="background1"/>
         </w:rPr>
@@ -5248,7 +5373,8 @@
           <w:ilvl w:val="0"/>
           <w:numId w:val="16"/>
         </w:numPr>
-        <w:spacing w:after="0" w:afterAutospacing="0"/>
+        <w:spacing w:after="0" w:afterAutospacing="0" w:line="360" w:lineRule="auto"/>
+        <w:ind w:firstLine="709"/>
         <w:rPr>
           <w:u w:val="single" w:color="FFFFFF" w:themeColor="background1"/>
         </w:rPr>
@@ -5289,7 +5415,8 @@
           <w:ilvl w:val="0"/>
           <w:numId w:val="16"/>
         </w:numPr>
-        <w:spacing w:after="0" w:afterAutospacing="0"/>
+        <w:spacing w:after="0" w:afterAutospacing="0" w:line="360" w:lineRule="auto"/>
+        <w:ind w:firstLine="709"/>
         <w:rPr>
           <w:u w:val="single" w:color="FFFFFF" w:themeColor="background1"/>
         </w:rPr>
@@ -5330,7 +5457,8 @@
           <w:ilvl w:val="0"/>
           <w:numId w:val="16"/>
         </w:numPr>
-        <w:spacing w:after="0" w:afterAutospacing="0"/>
+        <w:spacing w:after="0" w:afterAutospacing="0" w:line="360" w:lineRule="auto"/>
+        <w:ind w:firstLine="709"/>
         <w:rPr>
           <w:u w:val="single" w:color="FFFFFF" w:themeColor="background1"/>
         </w:rPr>
@@ -5386,7 +5514,8 @@
           <w:ilvl w:val="0"/>
           <w:numId w:val="16"/>
         </w:numPr>
-        <w:spacing w:after="0" w:afterAutospacing="0"/>
+        <w:spacing w:after="0" w:afterAutospacing="0" w:line="360" w:lineRule="auto"/>
+        <w:ind w:firstLine="709"/>
         <w:rPr>
           <w:u w:val="single" w:color="FFFFFF" w:themeColor="background1"/>
         </w:rPr>
@@ -5423,6 +5552,8 @@
     <w:p>
       <w:pPr>
         <w:pStyle w:val="1"/>
+        <w:spacing w:line="360" w:lineRule="auto" w:after="0"/>
+        <w:ind w:firstLine="709"/>
       </w:pPr>
       <w:bookmarkStart w:id="11" w:name="_Toc233319898"/>
       <w:r>
@@ -5439,7 +5570,8 @@
           <w:ilvl w:val="0"/>
           <w:numId w:val="3"/>
         </w:numPr>
-        <w:spacing w:before="50" w:after="50"/>
+        <w:spacing w:before="50" w:after="0" w:line="360" w:lineRule="auto"/>
+        <w:ind w:firstLine="709"/>
         <w:contextualSpacing w:val="0"/>
         <w:jc w:val="left"/>
         <w:outlineLvl w:val="1"/>
@@ -5467,6 +5599,8 @@
     <w:p>
       <w:pPr>
         <w:pStyle w:val="2"/>
+        <w:spacing w:line="360" w:lineRule="auto" w:after="0"/>
+        <w:ind w:firstLine="709"/>
         <w:jc w:val="both"/>
       </w:pPr>
       <w:bookmarkStart w:id="19" w:name="_Toc233319900"/>
@@ -5477,7 +5611,8 @@
     </w:p>
     <w:p>
       <w:pPr>
-        <w:spacing w:before="50" w:after="50"/>
+        <w:spacing w:before="50" w:after="0" w:line="360" w:lineRule="auto"/>
+        <w:ind w:firstLine="709"/>
         <w:rPr>
           <w:i/>
           <w:color w:val="C00000"/>
@@ -5494,6 +5629,8 @@
     <w:p>
       <w:pPr>
         <w:pStyle w:val="2"/>
+        <w:spacing w:line="360" w:lineRule="auto" w:after="0"/>
+        <w:ind w:firstLine="709"/>
       </w:pPr>
       <w:bookmarkStart w:id="20" w:name="_Toc233319901"/>
       <w:r>
@@ -5503,6 +5640,8 @@
     </w:p>
     <w:p>
       <w:pPr>
+        <w:spacing w:line="360" w:lineRule="auto" w:after="0"/>
+        <w:ind w:firstLine="709"/>
         <w:rPr>
           <w:i/>
           <w:color w:val="C00000"/>
@@ -5518,6 +5657,8 @@
     </w:p>
     <w:p>
       <w:pPr>
+        <w:spacing w:line="360" w:lineRule="auto" w:after="0"/>
+        <w:ind w:firstLine="709"/>
         <w:rPr>
           <w:i/>
           <w:color w:val="C00000"/>
@@ -5527,6 +5668,8 @@
     <w:p>
       <w:pPr>
         <w:pStyle w:val="1"/>
+        <w:spacing w:line="360" w:lineRule="auto" w:after="0"/>
+        <w:ind w:firstLine="709"/>
       </w:pPr>
       <w:bookmarkStart w:id="21" w:name="_Toc233319902"/>
       <w:r>
@@ -5536,7 +5679,8 @@
     </w:p>
     <w:p>
       <w:pPr>
-        <w:spacing w:before="50" w:after="50"/>
+        <w:spacing w:before="50" w:after="0" w:line="360" w:lineRule="auto"/>
+        <w:ind w:firstLine="709"/>
         <w:rPr>
           <w:i/>
           <w:color w:val="C00000"/>
@@ -5569,7 +5713,8 @@
     </w:p>
     <w:p>
       <w:pPr>
-        <w:spacing w:before="50" w:after="50"/>
+        <w:spacing w:before="50" w:after="0" w:line="360" w:lineRule="auto"/>
+        <w:ind w:firstLine="709"/>
         <w:rPr>
           <w:i/>
           <w:color w:val="C00000"/>
@@ -5585,6 +5730,8 @@
     </w:p>
     <w:p>
       <w:pPr>
+        <w:spacing w:line="360" w:lineRule="auto" w:after="0"/>
+        <w:ind w:firstLine="709"/>
         <w:rPr>
           <w:i/>
           <w:color w:val="C00000"/>
@@ -5600,6 +5747,8 @@
     </w:p>
     <w:p>
       <w:pPr>
+        <w:spacing w:line="360" w:lineRule="auto" w:after="0"/>
+        <w:ind w:firstLine="709"/>
         <w:rPr>
           <w:i/>
           <w:color w:val="C00000"/>
@@ -5615,7 +5764,8 @@
     </w:p>
     <w:p>
       <w:pPr>
-        <w:spacing w:before="50" w:after="50"/>
+        <w:spacing w:before="50" w:after="0" w:line="360" w:lineRule="auto"/>
+        <w:ind w:firstLine="709"/>
       </w:pPr>
       <w:r>
         <w:br w:type="page"/>
@@ -5624,6 +5774,8 @@
     <w:p>
       <w:pPr>
         <w:pStyle w:val="1"/>
+        <w:spacing w:line="360" w:lineRule="auto" w:after="0"/>
+        <w:ind w:firstLine="709"/>
       </w:pPr>
       <w:bookmarkStart w:id="22" w:name="_Toc233319903"/>
       <w:r>
@@ -5641,7 +5793,8 @@
           <w:ilvl w:val="0"/>
           <w:numId w:val="1"/>
         </w:numPr>
-        <w:spacing w:before="50" w:after="50"/>
+        <w:spacing w:before="50" w:after="0" w:line="360" w:lineRule="auto"/>
+        <w:ind w:firstLine="709"/>
         <w:rPr>
           <w:lang w:val="en-US"/>
         </w:rPr>
@@ -5649,6 +5802,8 @@
     </w:p>
     <w:p>
       <w:pPr>
+        <w:spacing w:line="360" w:lineRule="auto" w:after="0"/>
+        <w:ind w:firstLine="709"/>
         <w:rPr>
           <w:lang w:val="en-US"/>
         </w:rPr>
@@ -5662,6 +5817,8 @@
     <w:p>
       <w:pPr>
         <w:pStyle w:val="1"/>
+        <w:spacing w:line="360" w:lineRule="auto" w:after="0"/>
+        <w:ind w:firstLine="709"/>
         <w:rPr>
           <w:rStyle w:val="a7"/>
           <w:i w:val="0"/>
@@ -6639,7 +6796,8 @@
     </w:tbl>
     <w:p>
       <w:pPr>
-        <w:ind w:firstLine="0"/>
+        <w:spacing w:line="360" w:lineRule="auto" w:after="0"/>
+        <w:ind w:firstLine="709"/>
         <w:jc w:val="left"/>
         <w:rPr>
           <w:rStyle w:val="a7"/>
@@ -6648,7 +6806,8 @@
     </w:p>
     <w:p>
       <w:pPr>
-        <w:ind w:firstLine="0"/>
+        <w:spacing w:line="360" w:lineRule="auto" w:after="0"/>
+        <w:ind w:firstLine="709"/>
         <w:jc w:val="left"/>
         <w:rPr>
           <w:rStyle w:val="a7"/>
@@ -6667,6 +6826,8 @@
     <w:p>
       <w:pPr>
         <w:pStyle w:val="1"/>
+        <w:spacing w:line="360" w:lineRule="auto" w:after="0"/>
+        <w:ind w:firstLine="709"/>
         <w:jc w:val="right"/>
         <w:rPr>
           <w:rStyle w:val="a7"/>
@@ -6703,7 +6864,8 @@
     </w:p>
     <w:p>
       <w:pPr>
-        <w:ind w:firstLine="0"/>
+        <w:spacing w:line="360" w:lineRule="auto" w:after="0"/>
+        <w:ind w:firstLine="709"/>
         <w:jc w:val="left"/>
         <w:rPr>
           <w:rStyle w:val="a7"/>
@@ -9310,6 +9472,10 @@
       <w:ind w:firstLine="720"/>
       <w:jc w:val="both"/>
     </w:pPr>
+    <w:rPr>
+      <w:rFonts w:ascii="Times New Roman" w:hAnsi="Times New Roman"/>
+      <w:sz w:val="28"/>
+    </w:rPr>
   </w:style>
   <w:style w:type="paragraph" w:styleId="1">
     <w:name w:val="heading 1"/>
@@ -9327,8 +9493,10 @@
       <w:outlineLvl w:val="0"/>
     </w:pPr>
     <w:rPr>
+      <w:rFonts w:ascii="Times New Roman" w:hAnsi="Times New Roman"/>
       <w:b/>
       <w:caps/>
+      <w:sz w:val="28"/>
       <w:szCs w:val="40"/>
     </w:rPr>
   </w:style>
@@ -9352,7 +9520,9 @@
       <w:outlineLvl w:val="1"/>
     </w:pPr>
     <w:rPr>
+      <w:rFonts w:ascii="Times New Roman" w:hAnsi="Times New Roman"/>
       <w:b/>
+      <w:sz w:val="28"/>
       <w:szCs w:val="36"/>
     </w:rPr>
   </w:style>
@@ -9374,8 +9544,9 @@
       <w:outlineLvl w:val="2"/>
     </w:pPr>
     <w:rPr>
+      <w:rFonts w:ascii="Times New Roman" w:hAnsi="Times New Roman"/>
       <w:i/>
-      <w:sz w:val="32"/>
+      <w:sz w:val="28"/>
       <w:szCs w:val="32"/>
     </w:rPr>
   </w:style>
@@ -9394,8 +9565,9 @@
       <w:outlineLvl w:val="3"/>
     </w:pPr>
     <w:rPr>
+      <w:rFonts w:ascii="Times New Roman" w:hAnsi="Times New Roman"/>
       <w:color w:val="666666"/>
-      <w:sz w:val="24"/>
+      <w:sz w:val="28"/>
       <w:szCs w:val="24"/>
     </w:rPr>
   </w:style>
@@ -9414,8 +9586,9 @@
       <w:outlineLvl w:val="4"/>
     </w:pPr>
     <w:rPr>
+      <w:rFonts w:ascii="Times New Roman" w:hAnsi="Times New Roman"/>
       <w:color w:val="666666"/>
-      <w:sz w:val="22"/>
+      <w:sz w:val="28"/>
       <w:szCs w:val="22"/>
     </w:rPr>
   </w:style>
@@ -9434,9 +9607,10 @@
       <w:outlineLvl w:val="5"/>
     </w:pPr>
     <w:rPr>
+      <w:rFonts w:ascii="Times New Roman" w:hAnsi="Times New Roman"/>
       <w:i/>
       <w:color w:val="666666"/>
-      <w:sz w:val="22"/>
+      <w:sz w:val="28"/>
       <w:szCs w:val="22"/>
     </w:rPr>
   </w:style>
@@ -9560,7 +9734,8 @@
       <w:spacing w:after="60"/>
     </w:pPr>
     <w:rPr>
-      <w:sz w:val="52"/>
+      <w:rFonts w:ascii="Times New Roman" w:hAnsi="Times New Roman"/>
+      <w:sz w:val="28"/>
       <w:szCs w:val="52"/>
     </w:rPr>
   </w:style>
@@ -9570,12 +9745,17 @@
     <w:pPr>
       <w:spacing w:after="140" w:line="276" w:lineRule="auto"/>
     </w:pPr>
+    <w:rPr>
+      <w:rFonts w:ascii="Times New Roman" w:hAnsi="Times New Roman"/>
+      <w:sz w:val="28"/>
+    </w:rPr>
   </w:style>
   <w:style w:type="paragraph" w:styleId="af">
     <w:name w:val="List"/>
     <w:basedOn w:val="ae"/>
     <w:rPr>
-      <w:rFonts w:cs="Lohit Devanagari"/>
+      <w:rFonts w:cs="Lohit Devanagari" w:ascii="Times New Roman" w:hAnsi="Times New Roman"/>
+      <w:sz w:val="28"/>
     </w:rPr>
   </w:style>
   <w:style w:type="paragraph" w:styleId="af0">
@@ -9591,13 +9771,19 @@
       <w:jc w:val="center"/>
     </w:pPr>
     <w:rPr>
+      <w:rFonts w:ascii="Times New Roman" w:hAnsi="Times New Roman"/>
       <w:iCs/>
+      <w:sz w:val="28"/>
       <w:szCs w:val="18"/>
     </w:rPr>
   </w:style>
   <w:style w:type="paragraph" w:styleId="af1">
     <w:name w:val="index heading"/>
     <w:basedOn w:val="ad"/>
+    <w:rPr>
+      <w:rFonts w:ascii="Times New Roman" w:hAnsi="Times New Roman"/>
+      <w:sz w:val="28"/>
+    </w:rPr>
   </w:style>
   <w:style w:type="paragraph" w:styleId="af2">
     <w:name w:val="Subtitle"/>
@@ -9611,9 +9797,9 @@
       <w:spacing w:after="320"/>
     </w:pPr>
     <w:rPr>
-      <w:rFonts w:ascii="Arial" w:eastAsia="Arial" w:hAnsi="Arial" w:cs="Arial"/>
+      <w:rFonts w:ascii="Times New Roman" w:eastAsia="Arial" w:hAnsi="Times New Roman" w:cs="Arial"/>
       <w:color w:val="666666"/>
-      <w:sz w:val="30"/>
+      <w:sz w:val="28"/>
       <w:szCs w:val="30"/>
     </w:rPr>
   </w:style>
@@ -9621,6 +9807,10 @@
     <w:name w:val="Колонтитул"/>
     <w:basedOn w:val="a"/>
     <w:qFormat/>
+    <w:rPr>
+      <w:rFonts w:ascii="Times New Roman" w:hAnsi="Times New Roman"/>
+      <w:sz w:val="28"/>
+    </w:rPr>
   </w:style>
   <w:style w:type="paragraph" w:styleId="a4">
     <w:name w:val="header"/>
@@ -9636,6 +9826,10 @@
       </w:tabs>
       <w:spacing w:line="240" w:lineRule="auto"/>
     </w:pPr>
+    <w:rPr>
+      <w:rFonts w:ascii="Times New Roman" w:hAnsi="Times New Roman"/>
+      <w:sz w:val="28"/>
+    </w:rPr>
   </w:style>
   <w:style w:type="paragraph" w:styleId="a6">
     <w:name w:val="footer"/>
@@ -9651,6 +9845,10 @@
       </w:tabs>
       <w:spacing w:line="240" w:lineRule="auto"/>
     </w:pPr>
+    <w:rPr>
+      <w:rFonts w:ascii="Times New Roman" w:hAnsi="Times New Roman"/>
+      <w:sz w:val="28"/>
+    </w:rPr>
   </w:style>
   <w:style w:type="paragraph" w:styleId="af4">
     <w:name w:val="List Paragraph"/>
@@ -9662,6 +9860,10 @@
       <w:ind w:left="720"/>
       <w:contextualSpacing/>
     </w:pPr>
+    <w:rPr>
+      <w:rFonts w:ascii="Times New Roman" w:hAnsi="Times New Roman"/>
+      <w:sz w:val="28"/>
+    </w:rPr>
   </w:style>
   <w:style w:type="paragraph" w:styleId="20">
     <w:name w:val="toc 2"/>
@@ -9675,6 +9877,10 @@
       <w:spacing w:after="100"/>
       <w:ind w:left="280"/>
     </w:pPr>
+    <w:rPr>
+      <w:rFonts w:ascii="Times New Roman" w:hAnsi="Times New Roman"/>
+      <w:sz w:val="28"/>
+    </w:rPr>
   </w:style>
   <w:style w:type="paragraph" w:styleId="30">
     <w:name w:val="toc 3"/>
@@ -9688,6 +9894,10 @@
       <w:spacing w:after="100"/>
       <w:ind w:left="560"/>
     </w:pPr>
+    <w:rPr>
+      <w:rFonts w:ascii="Times New Roman" w:hAnsi="Times New Roman"/>
+      <w:sz w:val="28"/>
+    </w:rPr>
   </w:style>
   <w:style w:type="paragraph" w:styleId="af5">
     <w:name w:val="TOC Heading"/>
@@ -9703,9 +9913,9 @@
       <w:outlineLvl w:val="9"/>
     </w:pPr>
     <w:rPr>
-      <w:rFonts w:asciiTheme="majorHAnsi" w:eastAsiaTheme="majorEastAsia" w:hAnsiTheme="majorHAnsi" w:cstheme="majorBidi"/>
+      <w:rFonts w:asciiTheme="majorHAnsi" w:eastAsiaTheme="majorEastAsia" w:hAnsiTheme="majorHAnsi" w:cstheme="majorBidi" w:ascii="Times New Roman" w:hAnsi="Times New Roman"/>
       <w:color w:val="365F91" w:themeColor="accent1" w:themeShade="BF"/>
-      <w:sz w:val="32"/>
+      <w:sz w:val="28"/>
       <w:szCs w:val="32"/>
       <w:highlight w:val="none"/>
     </w:rPr>
@@ -9723,8 +9933,8 @@
       <w:spacing w:line="240" w:lineRule="auto"/>
     </w:pPr>
     <w:rPr>
-      <w:rFonts w:ascii="Segoe UI" w:hAnsi="Segoe UI" w:cs="Segoe UI"/>
-      <w:sz w:val="18"/>
+      <w:rFonts w:ascii="Times New Roman" w:hAnsi="Times New Roman" w:cs="Segoe UI"/>
+      <w:sz w:val="28"/>
       <w:szCs w:val="18"/>
     </w:rPr>
   </w:style>
@@ -9739,6 +9949,10 @@
     <w:pPr>
       <w:spacing w:after="100"/>
     </w:pPr>
+    <w:rPr>
+      <w:rFonts w:ascii="Times New Roman" w:hAnsi="Times New Roman"/>
+      <w:sz w:val="28"/>
+    </w:rPr>
   </w:style>
   <w:style w:type="paragraph" w:styleId="af6">
     <w:name w:val="Normal (Web)"/>
@@ -9754,7 +9968,8 @@
       <w:jc w:val="left"/>
     </w:pPr>
     <w:rPr>
-      <w:sz w:val="24"/>
+      <w:rFonts w:ascii="Times New Roman" w:hAnsi="Times New Roman"/>
+      <w:sz w:val="28"/>
       <w:szCs w:val="24"/>
       <w:highlight w:val="none"/>
     </w:rPr>
@@ -9769,7 +9984,8 @@
       <w:ind w:firstLine="709"/>
     </w:pPr>
     <w:rPr>
-      <w:sz w:val="24"/>
+      <w:rFonts w:ascii="Times New Roman" w:hAnsi="Times New Roman"/>
+      <w:sz w:val="28"/>
       <w:highlight w:val="none"/>
     </w:rPr>
   </w:style>
@@ -9795,7 +10011,8 @@
       <w:jc w:val="left"/>
     </w:pPr>
     <w:rPr>
-      <w:sz w:val="24"/>
+      <w:rFonts w:ascii="Times New Roman" w:hAnsi="Times New Roman"/>
+      <w:sz w:val="28"/>
       <w:szCs w:val="24"/>
       <w:highlight w:val="none"/>
     </w:rPr>

</xml_diff>

<commit_message>
fix report first part lil fix
</commit_message>
<xml_diff>
--- a/docs/report.docx
+++ b/docs/report.docx
@@ -4035,6 +4035,21 @@
     </w:p>
     <w:p>
       <w:pPr>
+        <w:spacing w:before="100" w:beforeAutospacing="1"/>
+        <w:jc w:val="left"/>
+        <w:rPr>
+          <w:highlight w:val="none"/>
+        </w:rPr>
+      </w:pPr>
+      <w:r>
+        <w:rPr>
+          <w:highlight w:val="none"/>
+        </w:rPr>
+        <w:t>На основании выбранных технологий была спроектирована общая архитектура приложения. Архитектурное решение определяет взаимодействие клиентской и серверной частей системы, а также порядок обмена данными между ними. Общая схема взаимодействия компонентов представлена на рисунке 1.</w:t>
+      </w:r>
+    </w:p>
+    <w:p>
+      <w:pPr>
         <w:pStyle w:val="ds-markdown-paragraph"/>
         <w:spacing w:before="0" w:beforeAutospacing="0" w:after="0" w:afterAutospacing="0" w:line="360" w:lineRule="auto"/>
         <w:jc w:val="center"/>
@@ -4045,6 +4060,7 @@
       <w:r>
         <w:rPr>
           <w:rStyle w:val="af7"/>
+          <w:noProof/>
         </w:rPr>
         <w:lastRenderedPageBreak/>
         <w:drawing>
@@ -4141,41 +4157,36 @@
         <w:pStyle w:val="ds-markdown-paragraph"/>
         <w:spacing w:before="0" w:beforeAutospacing="0" w:after="0" w:afterAutospacing="0" w:line="360" w:lineRule="auto"/>
         <w:ind w:firstLine="709"/>
-        <w:jc w:val="center"/>
+        <w:rPr>
+          <w:sz w:val="28"/>
+          <w:szCs w:val="28"/>
+          <w:lang w:val="ru-KZ"/>
+        </w:rPr>
+      </w:pPr>
+      <w:r>
         <w:rPr>
           <w:b/>
           <w:bCs/>
-        </w:rPr>
-      </w:pPr>
-      <w:r>
-        <w:rPr>
-          <w:rStyle w:val="af7"/>
-          <w:sz w:val="28"/>
+          <w:sz w:val="28"/>
+          <w:szCs w:val="28"/>
+          <w:lang w:val="ru-KZ"/>
         </w:rPr>
         <w:t>Архитектура приложения</w:t>
       </w:r>
       <w:r>
         <w:rPr>
           <w:sz w:val="28"/>
-        </w:rPr>
-        <w:t> — клиент-серверная</w:t>
-      </w:r>
-      <w:r>
-        <w:rPr>
-          <w:sz w:val="28"/>
-        </w:rPr>
-        <w:t xml:space="preserve"> (см. Рисунок 1)</w:t>
-      </w:r>
-      <w:r>
-        <w:rPr>
-          <w:sz w:val="28"/>
-        </w:rPr>
-        <w:t xml:space="preserve">. Клиентская часть реализована на </w:t>
+          <w:szCs w:val="28"/>
+          <w:lang w:val="ru-KZ"/>
+        </w:rPr>
+        <w:t xml:space="preserve"> — клиент-серверная (см. рисунок 1). Клиентская часть реализована на </w:t>
       </w:r>
       <w:proofErr w:type="spellStart"/>
       <w:r>
         <w:rPr>
           <w:sz w:val="28"/>
+          <w:szCs w:val="28"/>
+          <w:lang w:val="ru-KZ"/>
         </w:rPr>
         <w:t>Tkinter</w:t>
       </w:r>
@@ -4183,13 +4194,17 @@
       <w:r>
         <w:rPr>
           <w:sz w:val="28"/>
-        </w:rPr>
-        <w:t xml:space="preserve"> и взаимодействует с серверной частью через HTTP-запросы. Серверная часть построена на </w:t>
+          <w:szCs w:val="28"/>
+          <w:lang w:val="ru-KZ"/>
+        </w:rPr>
+        <w:t xml:space="preserve"> и взаимодействует с серверной частью посредством HTTP-запросов. Серверная часть построена на </w:t>
       </w:r>
       <w:proofErr w:type="spellStart"/>
       <w:r>
         <w:rPr>
           <w:sz w:val="28"/>
+          <w:szCs w:val="28"/>
+          <w:lang w:val="ru-KZ"/>
         </w:rPr>
         <w:t>FastAPI</w:t>
       </w:r>
@@ -4197,13 +4212,17 @@
       <w:r>
         <w:rPr>
           <w:sz w:val="28"/>
-        </w:rPr>
-        <w:t xml:space="preserve"> и обеспечивает всю бизнес-логику, взаимодействие с базой данных </w:t>
+          <w:szCs w:val="28"/>
+          <w:lang w:val="ru-KZ"/>
+        </w:rPr>
+        <w:t xml:space="preserve"> и реализует бизнес-логику приложения, взаимодействие с базой данных </w:t>
       </w:r>
       <w:proofErr w:type="spellStart"/>
       <w:r>
         <w:rPr>
           <w:sz w:val="28"/>
+          <w:szCs w:val="28"/>
+          <w:lang w:val="ru-KZ"/>
         </w:rPr>
         <w:t>SQLite</w:t>
       </w:r>
@@ -4211,13 +4230,17 @@
       <w:r>
         <w:rPr>
           <w:sz w:val="28"/>
-        </w:rPr>
-        <w:t xml:space="preserve"> и генерацию документов. Серверная часть и база данных работают в </w:t>
+          <w:szCs w:val="28"/>
+          <w:lang w:val="ru-KZ"/>
+        </w:rPr>
+        <w:t xml:space="preserve"> и формирование документов. Для обеспечения переносимости и упрощения развертывания сервер и база данных размещаются в </w:t>
       </w:r>
       <w:proofErr w:type="spellStart"/>
       <w:r>
         <w:rPr>
           <w:sz w:val="28"/>
+          <w:szCs w:val="28"/>
+          <w:lang w:val="ru-KZ"/>
         </w:rPr>
         <w:t>Docker</w:t>
       </w:r>
@@ -4225,30 +4248,31 @@
       <w:r>
         <w:rPr>
           <w:sz w:val="28"/>
-        </w:rPr>
-        <w:t>-контейнерах для обеспечения переносимости и изоляции окружения.</w:t>
-      </w:r>
-      <w:r>
-        <w:br w:type="page"/>
-      </w:r>
-      <w:bookmarkStart w:id="10" w:name="_Toc233319897"/>
-      <w:r>
+          <w:szCs w:val="28"/>
+          <w:lang w:val="ru-KZ"/>
+        </w:rPr>
+        <w:t>-контейнерах.</w:t>
+      </w:r>
+    </w:p>
+    <w:p>
+      <w:pPr>
+        <w:pStyle w:val="ds-markdown-paragraph"/>
+        <w:numPr>
+          <w:ilvl w:val="0"/>
+          <w:numId w:val="19"/>
+        </w:numPr>
+        <w:spacing w:before="0" w:beforeAutospacing="0" w:after="0" w:afterAutospacing="0" w:line="360" w:lineRule="auto"/>
         <w:rPr>
           <w:b/>
           <w:bCs/>
           <w:sz w:val="28"/>
           <w:szCs w:val="28"/>
         </w:rPr>
-        <w:lastRenderedPageBreak/>
-        <w:t>1.</w:t>
-      </w:r>
-      <w:r>
-        <w:rPr>
-          <w:sz w:val="28"/>
-          <w:szCs w:val="28"/>
-        </w:rPr>
-        <w:t xml:space="preserve"> </w:t>
-      </w:r>
+      </w:pPr>
+      <w:r>
+        <w:br w:type="page"/>
+      </w:r>
+      <w:bookmarkStart w:id="10" w:name="_Toc233319897"/>
       <w:r>
         <w:rPr>
           <w:b/>
@@ -4256,6 +4280,7 @@
           <w:sz w:val="28"/>
           <w:szCs w:val="28"/>
         </w:rPr>
+        <w:lastRenderedPageBreak/>
         <w:t xml:space="preserve">2. </w:t>
       </w:r>
       <w:r>
@@ -4268,6 +4293,17 @@
         <w:t>Проектирование функциональности приложения</w:t>
       </w:r>
       <w:bookmarkEnd w:id="10"/>
+    </w:p>
+    <w:p>
+      <w:pPr>
+        <w:pStyle w:val="ds-markdown-paragraph"/>
+        <w:spacing w:before="0" w:beforeAutospacing="0" w:after="0" w:afterAutospacing="0" w:line="360" w:lineRule="auto"/>
+        <w:ind w:left="709"/>
+        <w:rPr>
+          <w:b/>
+          <w:bCs/>
+        </w:rPr>
+      </w:pPr>
     </w:p>
     <w:p>
       <w:pPr>
@@ -4307,7 +4343,23 @@
           <w:sz w:val="28"/>
           <w:u w:val="single" w:color="FFFFFF" w:themeColor="background1"/>
         </w:rPr>
-        <w:t>Один преподаватель может создать несколько тем (связь 1:N).</w:t>
+        <w:t xml:space="preserve">Один преподаватель может создать несколько тем (связь </w:t>
+      </w:r>
+      <w:proofErr w:type="gramStart"/>
+      <w:r>
+        <w:rPr>
+          <w:sz w:val="28"/>
+          <w:u w:val="single" w:color="FFFFFF" w:themeColor="background1"/>
+        </w:rPr>
+        <w:t>1:N</w:t>
+      </w:r>
+      <w:proofErr w:type="gramEnd"/>
+      <w:r>
+        <w:rPr>
+          <w:sz w:val="28"/>
+          <w:u w:val="single" w:color="FFFFFF" w:themeColor="background1"/>
+        </w:rPr>
+        <w:t>).</w:t>
       </w:r>
     </w:p>
     <w:p>
@@ -4351,14 +4403,7 @@
           <w:sz w:val="28"/>
           <w:u w:val="single" w:color="FFFFFF" w:themeColor="background1"/>
         </w:rPr>
-        <w:t>Один студент может иметь только одну активную запись на тему (контролируется на уровне приложения</w:t>
-      </w:r>
-      <w:r>
-        <w:rPr>
-          <w:sz w:val="28"/>
-          <w:u w:val="single" w:color="FFFFFF" w:themeColor="background1"/>
-        </w:rPr>
-        <w:t xml:space="preserve">). </w:t>
+        <w:t xml:space="preserve">Один студент может иметь только одну активную запись на тему (контролируется на уровне приложения). </w:t>
       </w:r>
     </w:p>
     <w:p>
@@ -4386,11 +4431,12 @@
       </w:pPr>
       <w:r>
         <w:rPr>
+          <w:noProof/>
           <w:sz w:val="28"/>
           <w:u w:val="single" w:color="FFFFFF" w:themeColor="background1"/>
         </w:rPr>
         <w:drawing>
-          <wp:anchor distT="0" distB="0" distL="114300" distR="114300" simplePos="0" relativeHeight="251658240" behindDoc="0" locked="0" layoutInCell="1" allowOverlap="1" wp14:anchorId="767BB483" wp14:editId="70F4471E">
+          <wp:anchor distT="0" distB="0" distL="114300" distR="114300" simplePos="0" relativeHeight="251658240" behindDoc="0" locked="0" layoutInCell="1" allowOverlap="1" wp14:anchorId="767BB483" wp14:editId="345F8D61">
             <wp:simplePos x="0" y="0"/>
             <wp:positionH relativeFrom="margin">
               <wp:align>right</wp:align>
@@ -4518,19 +4564,7 @@
         <w:rPr>
           <w:sz w:val="28"/>
         </w:rPr>
-        <w:t xml:space="preserve">(см. Рисунок </w:t>
-      </w:r>
-      <w:r>
-        <w:rPr>
-          <w:sz w:val="28"/>
-        </w:rPr>
-        <w:t>3</w:t>
-      </w:r>
-      <w:r>
-        <w:rPr>
-          <w:sz w:val="28"/>
-        </w:rPr>
-        <w:t>)</w:t>
+        <w:t>(см. Рисунок 3)</w:t>
       </w:r>
       <w:r>
         <w:rPr>
@@ -4680,6 +4714,7 @@
           <w:sz w:val="28"/>
           <w:u w:val="single" w:color="FFFFFF" w:themeColor="background1"/>
         </w:rPr>
+        <w:lastRenderedPageBreak/>
         <w:t>Student</w:t>
       </w:r>
       <w:proofErr w:type="spellEnd"/>
@@ -4712,7 +4747,6 @@
           <w:sz w:val="28"/>
           <w:u w:val="single" w:color="FFFFFF" w:themeColor="background1"/>
         </w:rPr>
-        <w:lastRenderedPageBreak/>
         <w:t>Teacher</w:t>
       </w:r>
       <w:proofErr w:type="spellEnd"/>
@@ -5273,6 +5307,7 @@
       </w:pPr>
       <w:r>
         <w:rPr>
+          <w:noProof/>
           <w:sz w:val="28"/>
         </w:rPr>
         <w:lastRenderedPageBreak/>
@@ -6133,7 +6168,23 @@
           <w:sz w:val="28"/>
           <w:u w:val="single" w:color="FFFFFF" w:themeColor="background1"/>
         </w:rPr>
-        <w:t xml:space="preserve"> (0..1) — одна тема может быть занята не более чем одним студентом.</w:t>
+        <w:t xml:space="preserve"> (</w:t>
+      </w:r>
+      <w:proofErr w:type="gramStart"/>
+      <w:r>
+        <w:rPr>
+          <w:sz w:val="28"/>
+          <w:u w:val="single" w:color="FFFFFF" w:themeColor="background1"/>
+        </w:rPr>
+        <w:t>0..</w:t>
+      </w:r>
+      <w:proofErr w:type="gramEnd"/>
+      <w:r>
+        <w:rPr>
+          <w:sz w:val="28"/>
+          <w:u w:val="single" w:color="FFFFFF" w:themeColor="background1"/>
+        </w:rPr>
+        <w:t>1) — одна тема может быть занята не более чем одним студентом.</w:t>
       </w:r>
     </w:p>
     <w:p>
@@ -6199,6 +6250,7 @@
         <w:rPr>
           <w:b/>
           <w:bCs/>
+          <w:noProof/>
           <w:u w:val="single" w:color="FFFFFF" w:themeColor="background1"/>
         </w:rPr>
         <w:lastRenderedPageBreak/>
@@ -6561,7 +6613,23 @@
           <w:i/>
           <w:color w:val="C00000"/>
         </w:rPr>
-        <w:t>В ходе практики было разработано …..</w:t>
+        <w:t>В ходе практики было разработано</w:t>
+      </w:r>
+      <w:proofErr w:type="gramStart"/>
+      <w:r>
+        <w:rPr>
+          <w:i/>
+          <w:color w:val="C00000"/>
+        </w:rPr>
+        <w:t xml:space="preserve"> ….</w:t>
+      </w:r>
+      <w:proofErr w:type="gramEnd"/>
+      <w:r>
+        <w:rPr>
+          <w:i/>
+          <w:color w:val="C00000"/>
+        </w:rPr>
+        <w:t>.</w:t>
       </w:r>
     </w:p>
     <w:p>
@@ -8549,6 +8617,95 @@
     </w:lvl>
   </w:abstractNum>
   <w:abstractNum w:abstractNumId="6" w15:restartNumberingAfterBreak="0">
+    <w:nsid w:val="1B6065B1"/>
+    <w:multiLevelType w:val="hybridMultilevel"/>
+    <w:tmpl w:val="0122F506"/>
+    <w:lvl w:ilvl="0" w:tplc="E4FEAB7A">
+      <w:start w:val="1"/>
+      <w:numFmt w:val="decimal"/>
+      <w:lvlText w:val="%1."/>
+      <w:lvlJc w:val="left"/>
+      <w:pPr>
+        <w:ind w:left="1069" w:hanging="360"/>
+      </w:pPr>
+      <w:rPr>
+        <w:rFonts w:hint="default"/>
+      </w:rPr>
+    </w:lvl>
+    <w:lvl w:ilvl="1" w:tplc="0C000019" w:tentative="1">
+      <w:start w:val="1"/>
+      <w:numFmt w:val="lowerLetter"/>
+      <w:lvlText w:val="%2."/>
+      <w:lvlJc w:val="left"/>
+      <w:pPr>
+        <w:ind w:left="1789" w:hanging="360"/>
+      </w:pPr>
+    </w:lvl>
+    <w:lvl w:ilvl="2" w:tplc="0C00001B" w:tentative="1">
+      <w:start w:val="1"/>
+      <w:numFmt w:val="lowerRoman"/>
+      <w:lvlText w:val="%3."/>
+      <w:lvlJc w:val="right"/>
+      <w:pPr>
+        <w:ind w:left="2509" w:hanging="180"/>
+      </w:pPr>
+    </w:lvl>
+    <w:lvl w:ilvl="3" w:tplc="0C00000F" w:tentative="1">
+      <w:start w:val="1"/>
+      <w:numFmt w:val="decimal"/>
+      <w:lvlText w:val="%4."/>
+      <w:lvlJc w:val="left"/>
+      <w:pPr>
+        <w:ind w:left="3229" w:hanging="360"/>
+      </w:pPr>
+    </w:lvl>
+    <w:lvl w:ilvl="4" w:tplc="0C000019" w:tentative="1">
+      <w:start w:val="1"/>
+      <w:numFmt w:val="lowerLetter"/>
+      <w:lvlText w:val="%5."/>
+      <w:lvlJc w:val="left"/>
+      <w:pPr>
+        <w:ind w:left="3949" w:hanging="360"/>
+      </w:pPr>
+    </w:lvl>
+    <w:lvl w:ilvl="5" w:tplc="0C00001B" w:tentative="1">
+      <w:start w:val="1"/>
+      <w:numFmt w:val="lowerRoman"/>
+      <w:lvlText w:val="%6."/>
+      <w:lvlJc w:val="right"/>
+      <w:pPr>
+        <w:ind w:left="4669" w:hanging="180"/>
+      </w:pPr>
+    </w:lvl>
+    <w:lvl w:ilvl="6" w:tplc="0C00000F" w:tentative="1">
+      <w:start w:val="1"/>
+      <w:numFmt w:val="decimal"/>
+      <w:lvlText w:val="%7."/>
+      <w:lvlJc w:val="left"/>
+      <w:pPr>
+        <w:ind w:left="5389" w:hanging="360"/>
+      </w:pPr>
+    </w:lvl>
+    <w:lvl w:ilvl="7" w:tplc="0C000019" w:tentative="1">
+      <w:start w:val="1"/>
+      <w:numFmt w:val="lowerLetter"/>
+      <w:lvlText w:val="%8."/>
+      <w:lvlJc w:val="left"/>
+      <w:pPr>
+        <w:ind w:left="6109" w:hanging="360"/>
+      </w:pPr>
+    </w:lvl>
+    <w:lvl w:ilvl="8" w:tplc="0C00001B" w:tentative="1">
+      <w:start w:val="1"/>
+      <w:numFmt w:val="lowerRoman"/>
+      <w:lvlText w:val="%9."/>
+      <w:lvlJc w:val="right"/>
+      <w:pPr>
+        <w:ind w:left="6829" w:hanging="180"/>
+      </w:pPr>
+    </w:lvl>
+  </w:abstractNum>
+  <w:abstractNum w:abstractNumId="7" w15:restartNumberingAfterBreak="0">
     <w:nsid w:val="1DD81A47"/>
     <w:multiLevelType w:val="multilevel"/>
     <w:tmpl w:val="B2A4E9AE"/>
@@ -8661,7 +8818,7 @@
       </w:pPr>
     </w:lvl>
   </w:abstractNum>
-  <w:abstractNum w:abstractNumId="7" w15:restartNumberingAfterBreak="0">
+  <w:abstractNum w:abstractNumId="8" w15:restartNumberingAfterBreak="0">
     <w:nsid w:val="203245FE"/>
     <w:multiLevelType w:val="multilevel"/>
     <w:tmpl w:val="E0BAC584"/>
@@ -8810,7 +8967,7 @@
       </w:rPr>
     </w:lvl>
   </w:abstractNum>
-  <w:abstractNum w:abstractNumId="8" w15:restartNumberingAfterBreak="0">
+  <w:abstractNum w:abstractNumId="9" w15:restartNumberingAfterBreak="0">
     <w:nsid w:val="25945D4F"/>
     <w:multiLevelType w:val="multilevel"/>
     <w:tmpl w:val="CEBC8232"/>
@@ -8959,7 +9116,7 @@
       </w:rPr>
     </w:lvl>
   </w:abstractNum>
-  <w:abstractNum w:abstractNumId="9" w15:restartNumberingAfterBreak="0">
+  <w:abstractNum w:abstractNumId="10" w15:restartNumberingAfterBreak="0">
     <w:nsid w:val="3A1F6D91"/>
     <w:multiLevelType w:val="hybridMultilevel"/>
     <w:tmpl w:val="C79416FC"/>
@@ -9048,7 +9205,7 @@
       </w:pPr>
     </w:lvl>
   </w:abstractNum>
-  <w:abstractNum w:abstractNumId="10" w15:restartNumberingAfterBreak="0">
+  <w:abstractNum w:abstractNumId="11" w15:restartNumberingAfterBreak="0">
     <w:nsid w:val="3C4F65C8"/>
     <w:multiLevelType w:val="multilevel"/>
     <w:tmpl w:val="0D328BD2"/>
@@ -9170,7 +9327,7 @@
       </w:pPr>
     </w:lvl>
   </w:abstractNum>
-  <w:abstractNum w:abstractNumId="11" w15:restartNumberingAfterBreak="0">
+  <w:abstractNum w:abstractNumId="12" w15:restartNumberingAfterBreak="0">
     <w:nsid w:val="4CDF5908"/>
     <w:multiLevelType w:val="multilevel"/>
     <w:tmpl w:val="97D8ADFC"/>
@@ -9319,7 +9476,7 @@
       </w:rPr>
     </w:lvl>
   </w:abstractNum>
-  <w:abstractNum w:abstractNumId="12" w15:restartNumberingAfterBreak="0">
+  <w:abstractNum w:abstractNumId="13" w15:restartNumberingAfterBreak="0">
     <w:nsid w:val="4D12701D"/>
     <w:multiLevelType w:val="multilevel"/>
     <w:tmpl w:val="B64863EC"/>
@@ -9468,7 +9625,7 @@
       </w:rPr>
     </w:lvl>
   </w:abstractNum>
-  <w:abstractNum w:abstractNumId="13" w15:restartNumberingAfterBreak="0">
+  <w:abstractNum w:abstractNumId="14" w15:restartNumberingAfterBreak="0">
     <w:nsid w:val="7315455C"/>
     <w:multiLevelType w:val="multilevel"/>
     <w:tmpl w:val="50CAA6CC"/>
@@ -9617,7 +9774,7 @@
       </w:rPr>
     </w:lvl>
   </w:abstractNum>
-  <w:abstractNum w:abstractNumId="14" w15:restartNumberingAfterBreak="0">
+  <w:abstractNum w:abstractNumId="15" w15:restartNumberingAfterBreak="0">
     <w:nsid w:val="76C940E9"/>
     <w:multiLevelType w:val="multilevel"/>
     <w:tmpl w:val="F96652AC"/>
@@ -9730,7 +9887,7 @@
       </w:pPr>
     </w:lvl>
   </w:abstractNum>
-  <w:abstractNum w:abstractNumId="15" w15:restartNumberingAfterBreak="0">
+  <w:abstractNum w:abstractNumId="16" w15:restartNumberingAfterBreak="0">
     <w:nsid w:val="79D07753"/>
     <w:multiLevelType w:val="multilevel"/>
     <w:tmpl w:val="1A9E79EE"/>
@@ -9870,7 +10027,7 @@
       </w:rPr>
     </w:lvl>
   </w:abstractNum>
-  <w:abstractNum w:abstractNumId="16" w15:restartNumberingAfterBreak="0">
+  <w:abstractNum w:abstractNumId="17" w15:restartNumberingAfterBreak="0">
     <w:nsid w:val="7EB1275D"/>
     <w:multiLevelType w:val="multilevel"/>
     <w:tmpl w:val="B3CAE0E6"/>
@@ -10023,7 +10180,7 @@
     <w:abstractNumId w:val="1"/>
   </w:num>
   <w:num w:numId="2" w16cid:durableId="477303400">
-    <w:abstractNumId w:val="15"/>
+    <w:abstractNumId w:val="16"/>
   </w:num>
   <w:num w:numId="3" w16cid:durableId="1819346471">
     <w:abstractNumId w:val="2"/>
@@ -10032,7 +10189,7 @@
     <w:abstractNumId w:val="0"/>
   </w:num>
   <w:num w:numId="5" w16cid:durableId="126972834">
-    <w:abstractNumId w:val="10"/>
+    <w:abstractNumId w:val="11"/>
   </w:num>
   <w:num w:numId="6" w16cid:durableId="1787771079">
     <w:abstractNumId w:val="2"/>
@@ -10045,37 +10202,40 @@
     <w:abstractNumId w:val="4"/>
   </w:num>
   <w:num w:numId="8" w16cid:durableId="984940862">
-    <w:abstractNumId w:val="16"/>
+    <w:abstractNumId w:val="17"/>
   </w:num>
   <w:num w:numId="9" w16cid:durableId="1557856420">
-    <w:abstractNumId w:val="11"/>
+    <w:abstractNumId w:val="12"/>
   </w:num>
   <w:num w:numId="10" w16cid:durableId="1029798247">
+    <w:abstractNumId w:val="9"/>
+  </w:num>
+  <w:num w:numId="11" w16cid:durableId="838545592">
+    <w:abstractNumId w:val="7"/>
+  </w:num>
+  <w:num w:numId="12" w16cid:durableId="390857734">
     <w:abstractNumId w:val="8"/>
   </w:num>
-  <w:num w:numId="11" w16cid:durableId="838545592">
-    <w:abstractNumId w:val="6"/>
-  </w:num>
-  <w:num w:numId="12" w16cid:durableId="390857734">
-    <w:abstractNumId w:val="7"/>
-  </w:num>
   <w:num w:numId="13" w16cid:durableId="1062142460">
-    <w:abstractNumId w:val="14"/>
+    <w:abstractNumId w:val="15"/>
   </w:num>
   <w:num w:numId="14" w16cid:durableId="693573212">
     <w:abstractNumId w:val="3"/>
   </w:num>
   <w:num w:numId="15" w16cid:durableId="827940717">
-    <w:abstractNumId w:val="12"/>
+    <w:abstractNumId w:val="13"/>
   </w:num>
   <w:num w:numId="16" w16cid:durableId="456531053">
-    <w:abstractNumId w:val="13"/>
+    <w:abstractNumId w:val="14"/>
   </w:num>
   <w:num w:numId="17" w16cid:durableId="1990940660">
-    <w:abstractNumId w:val="9"/>
+    <w:abstractNumId w:val="10"/>
   </w:num>
   <w:num w:numId="18" w16cid:durableId="646908067">
     <w:abstractNumId w:val="5"/>
+  </w:num>
+  <w:num w:numId="19" w16cid:durableId="1330674545">
+    <w:abstractNumId w:val="6"/>
   </w:num>
 </w:numbering>
 </file>

</xml_diff>

<commit_message>
fix report first part structure fix
</commit_message>
<xml_diff>
--- a/docs/report.docx
+++ b/docs/report.docx
@@ -4308,113 +4308,22 @@
     <w:p>
       <w:pPr>
         <w:pStyle w:val="ds-markdown-paragraph"/>
-        <w:spacing w:after="0" w:afterAutospacing="0" w:line="360" w:lineRule="auto"/>
+        <w:spacing w:before="0" w:beforeAutospacing="0" w:after="0" w:afterAutospacing="0" w:line="360" w:lineRule="auto"/>
         <w:ind w:firstLine="709"/>
-        <w:jc w:val="both"/>
-        <w:rPr>
-          <w:u w:val="single" w:color="FFFFFF" w:themeColor="background1"/>
-        </w:rPr>
-      </w:pPr>
-      <w:r>
-        <w:rPr>
-          <w:rStyle w:val="af7"/>
-          <w:sz w:val="28"/>
-          <w:u w:val="single" w:color="FFFFFF" w:themeColor="background1"/>
-        </w:rPr>
-        <w:t>Связи между таблицами:</w:t>
-      </w:r>
-    </w:p>
-    <w:p>
-      <w:pPr>
-        <w:pStyle w:val="ds-markdown-paragraph"/>
-        <w:numPr>
-          <w:ilvl w:val="0"/>
-          <w:numId w:val="14"/>
-        </w:numPr>
-        <w:spacing w:before="0" w:after="0" w:afterAutospacing="0" w:line="360" w:lineRule="auto"/>
-        <w:ind w:firstLine="709"/>
-        <w:jc w:val="both"/>
-        <w:rPr>
-          <w:u w:val="single" w:color="FFFFFF" w:themeColor="background1"/>
-        </w:rPr>
-      </w:pPr>
-      <w:r>
-        <w:rPr>
-          <w:sz w:val="28"/>
-          <w:u w:val="single" w:color="FFFFFF" w:themeColor="background1"/>
-        </w:rPr>
-        <w:t xml:space="preserve">Один преподаватель может создать несколько тем (связь </w:t>
-      </w:r>
-      <w:proofErr w:type="gramStart"/>
-      <w:r>
-        <w:rPr>
-          <w:sz w:val="28"/>
-          <w:u w:val="single" w:color="FFFFFF" w:themeColor="background1"/>
-        </w:rPr>
-        <w:t>1:N</w:t>
-      </w:r>
-      <w:proofErr w:type="gramEnd"/>
-      <w:r>
-        <w:rPr>
-          <w:sz w:val="28"/>
-          <w:u w:val="single" w:color="FFFFFF" w:themeColor="background1"/>
-        </w:rPr>
-        <w:t>).</w:t>
-      </w:r>
-    </w:p>
-    <w:p>
-      <w:pPr>
-        <w:pStyle w:val="ds-markdown-paragraph"/>
-        <w:numPr>
-          <w:ilvl w:val="0"/>
-          <w:numId w:val="14"/>
-        </w:numPr>
-        <w:spacing w:before="0" w:after="0" w:afterAutospacing="0" w:line="360" w:lineRule="auto"/>
-        <w:ind w:firstLine="709"/>
-        <w:jc w:val="both"/>
-        <w:rPr>
-          <w:u w:val="single" w:color="FFFFFF" w:themeColor="background1"/>
-        </w:rPr>
-      </w:pPr>
-      <w:r>
-        <w:rPr>
-          <w:sz w:val="28"/>
-          <w:u w:val="single" w:color="FFFFFF" w:themeColor="background1"/>
-        </w:rPr>
-        <w:t xml:space="preserve">Одна тема может быть связана с одной подтверждённой записью студента (связь 1:1 для занятых </w:t>
-      </w:r>
-    </w:p>
-    <w:p>
-      <w:pPr>
-        <w:pStyle w:val="ds-markdown-paragraph"/>
-        <w:numPr>
-          <w:ilvl w:val="0"/>
-          <w:numId w:val="14"/>
-        </w:numPr>
-        <w:spacing w:before="0" w:after="0" w:afterAutospacing="0" w:line="360" w:lineRule="auto"/>
-        <w:ind w:firstLine="709"/>
-        <w:jc w:val="both"/>
-        <w:rPr>
-          <w:u w:val="single" w:color="FFFFFF" w:themeColor="background1"/>
-        </w:rPr>
-      </w:pPr>
-      <w:r>
-        <w:rPr>
-          <w:sz w:val="28"/>
-          <w:u w:val="single" w:color="FFFFFF" w:themeColor="background1"/>
-        </w:rPr>
-        <w:t xml:space="preserve">Один студент может иметь только одну активную запись на тему (контролируется на уровне приложения). </w:t>
-      </w:r>
-    </w:p>
-    <w:p>
-      <w:pPr>
-        <w:pStyle w:val="ds-markdown-paragraph"/>
-        <w:spacing w:before="0" w:after="0" w:afterAutospacing="0" w:line="360" w:lineRule="auto"/>
-        <w:jc w:val="both"/>
-        <w:rPr>
-          <w:u w:val="single" w:color="FFFFFF" w:themeColor="background1"/>
-        </w:rPr>
-      </w:pPr>
+        <w:rPr>
+          <w:sz w:val="28"/>
+          <w:szCs w:val="28"/>
+          <w:u w:val="single" w:color="FFFFFF" w:themeColor="background1"/>
+        </w:rPr>
+      </w:pPr>
+      <w:r>
+        <w:rPr>
+          <w:sz w:val="28"/>
+          <w:szCs w:val="28"/>
+          <w:u w:val="single" w:color="FFFFFF" w:themeColor="background1"/>
+        </w:rPr>
+        <w:t>После определения общей архитектуры приложения было выполнено проектирование его внутренней структуры. На данном этапе были определены основные программные сущности, разработана структура хранения данных, описаны сценарии взаимодействия пользователей с системой и подготовлен прототип пользовательского интерфейса. Такой порядок проектирования позволяет последовательно перейти от внутреннего устройства приложения к его функциональным возможностям и средствам взаимодействия с пользователем.</w:t>
+      </w:r>
     </w:p>
     <w:p>
       <w:pPr>
@@ -4436,13 +4345,13 @@
           <w:u w:val="single" w:color="FFFFFF" w:themeColor="background1"/>
         </w:rPr>
         <w:drawing>
-          <wp:anchor distT="0" distB="0" distL="114300" distR="114300" simplePos="0" relativeHeight="251658240" behindDoc="0" locked="0" layoutInCell="1" allowOverlap="1" wp14:anchorId="767BB483" wp14:editId="345F8D61">
+          <wp:anchor distT="0" distB="0" distL="114300" distR="114300" simplePos="0" relativeHeight="251658240" behindDoc="0" locked="0" layoutInCell="1" allowOverlap="1" wp14:anchorId="767BB483" wp14:editId="1BB7C4C1">
             <wp:simplePos x="0" y="0"/>
             <wp:positionH relativeFrom="margin">
-              <wp:align>right</wp:align>
+              <wp:align>left</wp:align>
             </wp:positionH>
             <wp:positionV relativeFrom="paragraph">
-              <wp:posOffset>84455</wp:posOffset>
+              <wp:posOffset>1244388</wp:posOffset>
             </wp:positionV>
             <wp:extent cx="6050280" cy="3390265"/>
             <wp:effectExtent l="0" t="0" r="7620" b="635"/>
@@ -4493,6 +4402,14 @@
       </w:r>
       <w:r>
         <w:rPr>
+          <w:sz w:val="28"/>
+          <w:szCs w:val="28"/>
+          <w:u w:val="single" w:color="FFFFFF" w:themeColor="background1"/>
+        </w:rPr>
+        <w:t>Первым этапом проектирования стала разработка объектно-ориентированной модели приложения. Диаграмма классов позволяет определить основные сущности системы, их атрибуты, методы и взаимосвязи, которые впоследствии используются при реализации бизнес-логики приложения.</w:t>
+      </w:r>
+      <w:r>
+        <w:rPr>
           <w:b/>
           <w:bCs/>
           <w:sz w:val="28"/>
@@ -4500,6 +4417,30 @@
           <w:u w:val="single" w:color="FFFFFF" w:themeColor="background1"/>
         </w:rPr>
         <w:t xml:space="preserve">              </w:t>
+      </w:r>
+    </w:p>
+    <w:p>
+      <w:pPr>
+        <w:pStyle w:val="ds-markdown-paragraph"/>
+        <w:spacing w:before="0" w:beforeAutospacing="0" w:after="0" w:afterAutospacing="0" w:line="360" w:lineRule="auto"/>
+        <w:ind w:firstLine="709"/>
+        <w:rPr>
+          <w:b/>
+          <w:bCs/>
+          <w:sz w:val="28"/>
+          <w:szCs w:val="28"/>
+          <w:u w:val="single" w:color="FFFFFF" w:themeColor="background1"/>
+        </w:rPr>
+      </w:pPr>
+      <w:r>
+        <w:rPr>
+          <w:b/>
+          <w:bCs/>
+          <w:sz w:val="28"/>
+          <w:szCs w:val="28"/>
+          <w:u w:val="single" w:color="FFFFFF" w:themeColor="background1"/>
+        </w:rPr>
+        <w:t xml:space="preserve">           </w:t>
       </w:r>
       <w:r>
         <w:rPr>
@@ -4594,6 +4535,7 @@
           <w:sz w:val="28"/>
           <w:u w:val="single" w:color="FFFFFF" w:themeColor="background1"/>
         </w:rPr>
+        <w:lastRenderedPageBreak/>
         <w:t>User (абстрактный)</w:t>
       </w:r>
       <w:r>
@@ -4714,7 +4656,6 @@
           <w:sz w:val="28"/>
           <w:u w:val="single" w:color="FFFFFF" w:themeColor="background1"/>
         </w:rPr>
-        <w:lastRenderedPageBreak/>
         <w:t>Student</w:t>
       </w:r>
       <w:proofErr w:type="spellEnd"/>
@@ -5082,6 +5023,26 @@
         <w:spacing w:before="0" w:after="0"/>
         <w:ind w:firstLine="709"/>
         <w:rPr>
+          <w:color w:val="auto"/>
+          <w:sz w:val="28"/>
+          <w:szCs w:val="24"/>
+        </w:rPr>
+      </w:pPr>
+      <w:r>
+        <w:rPr>
+          <w:color w:val="auto"/>
+          <w:sz w:val="28"/>
+          <w:szCs w:val="24"/>
+        </w:rPr>
+        <w:t>На основе разработанной объектной модели была спроектирована структура базы данных. Каждая сущность диаграммы классов получила соответствующее представление в виде таблиц реляционной базы данных, что обеспечивает согласованность логической и физической моделей хранения информации.</w:t>
+      </w:r>
+    </w:p>
+    <w:p>
+      <w:pPr>
+        <w:pStyle w:val="5"/>
+        <w:spacing w:before="100" w:beforeAutospacing="1" w:after="0"/>
+        <w:ind w:firstLine="709"/>
+        <w:rPr>
           <w:b/>
           <w:bCs/>
           <w:color w:val="auto"/>
@@ -5146,6 +5107,7 @@
           <w:sz w:val="28"/>
           <w:u w:val="single" w:color="FFFFFF" w:themeColor="background1"/>
         </w:rPr>
+        <w:lastRenderedPageBreak/>
         <w:t>students</w:t>
       </w:r>
       <w:proofErr w:type="spellEnd"/>
@@ -5305,20 +5267,444 @@
           <w:u w:val="single" w:color="FFFFFF" w:themeColor="background1"/>
         </w:rPr>
       </w:pPr>
+      <w:proofErr w:type="spellStart"/>
+      <w:r>
+        <w:rPr>
+          <w:rStyle w:val="af7"/>
+          <w:sz w:val="28"/>
+          <w:u w:val="single" w:color="FFFFFF" w:themeColor="background1"/>
+        </w:rPr>
+        <w:t>deadlines</w:t>
+      </w:r>
+      <w:proofErr w:type="spellEnd"/>
+      <w:r>
+        <w:rPr>
+          <w:sz w:val="28"/>
+          <w:u w:val="single" w:color="FFFFFF" w:themeColor="background1"/>
+        </w:rPr>
+        <w:t> — хранит даты дедлайнов (ID, название, дата, активность).</w:t>
+      </w:r>
+    </w:p>
+    <w:p>
+      <w:pPr>
+        <w:pStyle w:val="ds-markdown-paragraph"/>
+        <w:spacing w:after="0" w:afterAutospacing="0" w:line="360" w:lineRule="auto"/>
+        <w:ind w:firstLine="709"/>
+        <w:jc w:val="both"/>
+        <w:rPr>
+          <w:rStyle w:val="af7"/>
+          <w:sz w:val="28"/>
+          <w:u w:val="single" w:color="FFFFFF" w:themeColor="background1"/>
+        </w:rPr>
+      </w:pPr>
+      <w:r>
+        <w:rPr>
+          <w:sz w:val="28"/>
+          <w:u w:val="single" w:color="FFFFFF" w:themeColor="background1"/>
+        </w:rPr>
+        <w:t>Связи между таблицами отражают отношения между основными сущностями системы и обеспечивают целостность данных при выполнении операций записи, изменения и удаления информации.</w:t>
+      </w:r>
+    </w:p>
+    <w:p>
+      <w:pPr>
+        <w:pStyle w:val="ds-markdown-paragraph"/>
+        <w:spacing w:after="0" w:afterAutospacing="0" w:line="360" w:lineRule="auto"/>
+        <w:ind w:firstLine="709"/>
+        <w:jc w:val="both"/>
+        <w:rPr>
+          <w:u w:val="single" w:color="FFFFFF" w:themeColor="background1"/>
+        </w:rPr>
+      </w:pPr>
+      <w:r>
+        <w:rPr>
+          <w:rStyle w:val="af7"/>
+          <w:sz w:val="28"/>
+          <w:u w:val="single" w:color="FFFFFF" w:themeColor="background1"/>
+        </w:rPr>
+        <w:t>Связи между таблицами:</w:t>
+      </w:r>
+    </w:p>
+    <w:p>
+      <w:pPr>
+        <w:pStyle w:val="ds-markdown-paragraph"/>
+        <w:numPr>
+          <w:ilvl w:val="0"/>
+          <w:numId w:val="14"/>
+        </w:numPr>
+        <w:spacing w:before="0" w:after="0" w:afterAutospacing="0" w:line="360" w:lineRule="auto"/>
+        <w:ind w:firstLine="709"/>
+        <w:jc w:val="both"/>
+        <w:rPr>
+          <w:u w:val="single" w:color="FFFFFF" w:themeColor="background1"/>
+        </w:rPr>
+      </w:pPr>
+      <w:r>
+        <w:rPr>
+          <w:sz w:val="28"/>
+          <w:u w:val="single" w:color="FFFFFF" w:themeColor="background1"/>
+        </w:rPr>
+        <w:t xml:space="preserve">Один преподаватель может создать несколько тем (связь </w:t>
+      </w:r>
+      <w:proofErr w:type="gramStart"/>
+      <w:r>
+        <w:rPr>
+          <w:sz w:val="28"/>
+          <w:u w:val="single" w:color="FFFFFF" w:themeColor="background1"/>
+        </w:rPr>
+        <w:t>1:N</w:t>
+      </w:r>
+      <w:proofErr w:type="gramEnd"/>
+      <w:r>
+        <w:rPr>
+          <w:sz w:val="28"/>
+          <w:u w:val="single" w:color="FFFFFF" w:themeColor="background1"/>
+        </w:rPr>
+        <w:t>).</w:t>
+      </w:r>
+    </w:p>
+    <w:p>
+      <w:pPr>
+        <w:pStyle w:val="ds-markdown-paragraph"/>
+        <w:numPr>
+          <w:ilvl w:val="0"/>
+          <w:numId w:val="14"/>
+        </w:numPr>
+        <w:spacing w:before="0" w:after="0" w:afterAutospacing="0" w:line="360" w:lineRule="auto"/>
+        <w:ind w:firstLine="709"/>
+        <w:jc w:val="both"/>
+        <w:rPr>
+          <w:u w:val="single" w:color="FFFFFF" w:themeColor="background1"/>
+        </w:rPr>
+      </w:pPr>
+      <w:r>
+        <w:rPr>
+          <w:sz w:val="28"/>
+          <w:u w:val="single" w:color="FFFFFF" w:themeColor="background1"/>
+        </w:rPr>
+        <w:t xml:space="preserve">Одна тема может быть связана с одной подтверждённой записью студента (связь 1:1 для занятых </w:t>
+      </w:r>
+    </w:p>
+    <w:p>
+      <w:pPr>
+        <w:pStyle w:val="ds-markdown-paragraph"/>
+        <w:numPr>
+          <w:ilvl w:val="0"/>
+          <w:numId w:val="14"/>
+        </w:numPr>
+        <w:spacing w:before="0" w:after="0" w:afterAutospacing="0" w:line="360" w:lineRule="auto"/>
+        <w:ind w:firstLine="709"/>
+        <w:jc w:val="both"/>
+        <w:rPr>
+          <w:u w:val="single" w:color="FFFFFF" w:themeColor="background1"/>
+        </w:rPr>
+      </w:pPr>
+      <w:r>
+        <w:rPr>
+          <w:sz w:val="28"/>
+          <w:u w:val="single" w:color="FFFFFF" w:themeColor="background1"/>
+        </w:rPr>
+        <w:t xml:space="preserve">Один студент может иметь только одну активную запись на тему (контролируется на уровне приложения). </w:t>
+      </w:r>
+    </w:p>
+    <w:p>
+      <w:pPr>
+        <w:pStyle w:val="ds-markdown-paragraph"/>
+        <w:spacing w:after="0" w:afterAutospacing="0" w:line="360" w:lineRule="auto"/>
+        <w:ind w:firstLine="709"/>
+        <w:jc w:val="both"/>
+        <w:rPr>
+          <w:u w:val="single" w:color="FFFFFF" w:themeColor="background1"/>
+        </w:rPr>
+      </w:pPr>
+      <w:r>
+        <w:rPr>
+          <w:rStyle w:val="af7"/>
+          <w:sz w:val="28"/>
+          <w:u w:val="single" w:color="FFFFFF" w:themeColor="background1"/>
+        </w:rPr>
+        <w:t>Кратность связей:</w:t>
+      </w:r>
+    </w:p>
+    <w:p>
+      <w:pPr>
+        <w:pStyle w:val="ds-markdown-paragraph"/>
+        <w:numPr>
+          <w:ilvl w:val="0"/>
+          <w:numId w:val="16"/>
+        </w:numPr>
+        <w:spacing w:before="0" w:after="0" w:afterAutospacing="0" w:line="360" w:lineRule="auto"/>
+        <w:ind w:firstLine="709"/>
+        <w:jc w:val="both"/>
+        <w:rPr>
+          <w:u w:val="single" w:color="FFFFFF" w:themeColor="background1"/>
+        </w:rPr>
+      </w:pPr>
+      <w:proofErr w:type="spellStart"/>
+      <w:r>
+        <w:rPr>
+          <w:sz w:val="28"/>
+          <w:u w:val="single" w:color="FFFFFF" w:themeColor="background1"/>
+        </w:rPr>
+        <w:t>Teacher</w:t>
+      </w:r>
+      <w:proofErr w:type="spellEnd"/>
+      <w:r>
+        <w:rPr>
+          <w:sz w:val="28"/>
+          <w:u w:val="single" w:color="FFFFFF" w:themeColor="background1"/>
+        </w:rPr>
+        <w:t xml:space="preserve"> (1) → </w:t>
+      </w:r>
+      <w:proofErr w:type="spellStart"/>
+      <w:r>
+        <w:rPr>
+          <w:sz w:val="28"/>
+          <w:u w:val="single" w:color="FFFFFF" w:themeColor="background1"/>
+        </w:rPr>
+        <w:t>Topic</w:t>
+      </w:r>
+      <w:proofErr w:type="spellEnd"/>
+      <w:r>
+        <w:rPr>
+          <w:sz w:val="28"/>
+          <w:u w:val="single" w:color="FFFFFF" w:themeColor="background1"/>
+        </w:rPr>
+        <w:t xml:space="preserve"> (*) — один преподаватель может создать несколько тем.</w:t>
+      </w:r>
+    </w:p>
+    <w:p>
+      <w:pPr>
+        <w:pStyle w:val="ds-markdown-paragraph"/>
+        <w:numPr>
+          <w:ilvl w:val="0"/>
+          <w:numId w:val="16"/>
+        </w:numPr>
+        <w:spacing w:before="0" w:after="0" w:afterAutospacing="0" w:line="360" w:lineRule="auto"/>
+        <w:ind w:firstLine="709"/>
+        <w:jc w:val="both"/>
+        <w:rPr>
+          <w:u w:val="single" w:color="FFFFFF" w:themeColor="background1"/>
+        </w:rPr>
+      </w:pPr>
+      <w:proofErr w:type="spellStart"/>
+      <w:r>
+        <w:rPr>
+          <w:sz w:val="28"/>
+          <w:u w:val="single" w:color="FFFFFF" w:themeColor="background1"/>
+        </w:rPr>
+        <w:t>Student</w:t>
+      </w:r>
+      <w:proofErr w:type="spellEnd"/>
+      <w:r>
+        <w:rPr>
+          <w:sz w:val="28"/>
+          <w:u w:val="single" w:color="FFFFFF" w:themeColor="background1"/>
+        </w:rPr>
+        <w:t xml:space="preserve"> (1) → </w:t>
+      </w:r>
+      <w:proofErr w:type="spellStart"/>
+      <w:r>
+        <w:rPr>
+          <w:sz w:val="28"/>
+          <w:u w:val="single" w:color="FFFFFF" w:themeColor="background1"/>
+        </w:rPr>
+        <w:t>Enrollment</w:t>
+      </w:r>
+      <w:proofErr w:type="spellEnd"/>
+      <w:r>
+        <w:rPr>
+          <w:sz w:val="28"/>
+          <w:u w:val="single" w:color="FFFFFF" w:themeColor="background1"/>
+        </w:rPr>
+        <w:t xml:space="preserve"> (*) — один студент может иметь несколько записей в истории.</w:t>
+      </w:r>
+    </w:p>
+    <w:p>
+      <w:pPr>
+        <w:pStyle w:val="ds-markdown-paragraph"/>
+        <w:numPr>
+          <w:ilvl w:val="0"/>
+          <w:numId w:val="16"/>
+        </w:numPr>
+        <w:spacing w:before="0" w:after="0" w:afterAutospacing="0" w:line="360" w:lineRule="auto"/>
+        <w:ind w:firstLine="709"/>
+        <w:jc w:val="both"/>
+        <w:rPr>
+          <w:u w:val="single" w:color="FFFFFF" w:themeColor="background1"/>
+        </w:rPr>
+      </w:pPr>
+      <w:proofErr w:type="spellStart"/>
+      <w:r>
+        <w:rPr>
+          <w:sz w:val="28"/>
+          <w:u w:val="single" w:color="FFFFFF" w:themeColor="background1"/>
+        </w:rPr>
+        <w:t>Topic</w:t>
+      </w:r>
+      <w:proofErr w:type="spellEnd"/>
+      <w:r>
+        <w:rPr>
+          <w:sz w:val="28"/>
+          <w:u w:val="single" w:color="FFFFFF" w:themeColor="background1"/>
+        </w:rPr>
+        <w:t xml:space="preserve"> (1) → </w:t>
+      </w:r>
+      <w:proofErr w:type="spellStart"/>
+      <w:r>
+        <w:rPr>
+          <w:sz w:val="28"/>
+          <w:u w:val="single" w:color="FFFFFF" w:themeColor="background1"/>
+        </w:rPr>
+        <w:t>Enrollment</w:t>
+      </w:r>
+      <w:proofErr w:type="spellEnd"/>
+      <w:r>
+        <w:rPr>
+          <w:sz w:val="28"/>
+          <w:u w:val="single" w:color="FFFFFF" w:themeColor="background1"/>
+        </w:rPr>
+        <w:t xml:space="preserve"> (</w:t>
+      </w:r>
+      <w:proofErr w:type="gramStart"/>
+      <w:r>
+        <w:rPr>
+          <w:sz w:val="28"/>
+          <w:u w:val="single" w:color="FFFFFF" w:themeColor="background1"/>
+        </w:rPr>
+        <w:t>0..</w:t>
+      </w:r>
+      <w:proofErr w:type="gramEnd"/>
+      <w:r>
+        <w:rPr>
+          <w:sz w:val="28"/>
+          <w:u w:val="single" w:color="FFFFFF" w:themeColor="background1"/>
+        </w:rPr>
+        <w:t>1) — одна тема может быть занята не более чем одним студентом.</w:t>
+      </w:r>
+      <w:r>
+        <w:rPr>
+          <w:sz w:val="28"/>
+          <w:u w:val="single" w:color="FFFFFF" w:themeColor="background1"/>
+        </w:rPr>
+        <w:t xml:space="preserve"> </w:t>
+      </w:r>
+    </w:p>
+    <w:p>
+      <w:pPr>
+        <w:pStyle w:val="ds-markdown-paragraph"/>
+        <w:numPr>
+          <w:ilvl w:val="0"/>
+          <w:numId w:val="16"/>
+        </w:numPr>
+        <w:spacing w:before="0" w:after="0" w:afterAutospacing="0" w:line="360" w:lineRule="auto"/>
+        <w:ind w:firstLine="709"/>
+        <w:jc w:val="both"/>
+        <w:rPr>
+          <w:u w:val="single" w:color="FFFFFF" w:themeColor="background1"/>
+        </w:rPr>
+      </w:pPr>
+      <w:proofErr w:type="spellStart"/>
+      <w:r>
+        <w:rPr>
+          <w:sz w:val="28"/>
+          <w:u w:val="single" w:color="FFFFFF" w:themeColor="background1"/>
+        </w:rPr>
+        <w:lastRenderedPageBreak/>
+        <w:t>DeadlineChecker</w:t>
+      </w:r>
+      <w:proofErr w:type="spellEnd"/>
+      <w:r>
+        <w:rPr>
+          <w:sz w:val="28"/>
+          <w:u w:val="single" w:color="FFFFFF" w:themeColor="background1"/>
+        </w:rPr>
+        <w:t xml:space="preserve"> (1) → </w:t>
+      </w:r>
+      <w:proofErr w:type="spellStart"/>
+      <w:r>
+        <w:rPr>
+          <w:sz w:val="28"/>
+          <w:u w:val="single" w:color="FFFFFF" w:themeColor="background1"/>
+        </w:rPr>
+        <w:t>Deadline</w:t>
+      </w:r>
+      <w:proofErr w:type="spellEnd"/>
+      <w:r>
+        <w:rPr>
+          <w:sz w:val="28"/>
+          <w:u w:val="single" w:color="FFFFFF" w:themeColor="background1"/>
+        </w:rPr>
+        <w:t xml:space="preserve"> (*) — один сервис использует несколько дедлайнов</w:t>
+      </w:r>
+      <w:r>
+        <w:rPr>
+          <w:sz w:val="28"/>
+          <w:u w:val="single" w:color="FFFFFF" w:themeColor="background1"/>
+        </w:rPr>
+        <w:t>.</w:t>
+      </w:r>
+    </w:p>
+    <w:p>
+      <w:pPr>
+        <w:pStyle w:val="ds-markdown-paragraph"/>
+        <w:spacing w:after="0" w:afterAutospacing="0" w:line="360" w:lineRule="auto"/>
+        <w:ind w:firstLine="720"/>
+        <w:jc w:val="both"/>
+        <w:rPr>
+          <w:sz w:val="28"/>
+          <w:szCs w:val="28"/>
+          <w:u w:val="single" w:color="FFFFFF" w:themeColor="background1"/>
+        </w:rPr>
+      </w:pPr>
+      <w:r>
+        <w:rPr>
+          <w:sz w:val="28"/>
+          <w:szCs w:val="28"/>
+          <w:u w:val="single" w:color="FFFFFF" w:themeColor="background1"/>
+        </w:rPr>
+        <w:t>После определения внутренней структуры приложения были описаны сценарии взаимодействия пользователей с системой. Для этого была разработана диаграмма вариантов использования (</w:t>
+      </w:r>
+      <w:proofErr w:type="spellStart"/>
+      <w:r>
+        <w:rPr>
+          <w:sz w:val="28"/>
+          <w:szCs w:val="28"/>
+          <w:u w:val="single" w:color="FFFFFF" w:themeColor="background1"/>
+        </w:rPr>
+        <w:t>Use</w:t>
+      </w:r>
+      <w:proofErr w:type="spellEnd"/>
+      <w:r>
+        <w:rPr>
+          <w:sz w:val="28"/>
+          <w:szCs w:val="28"/>
+          <w:u w:val="single" w:color="FFFFFF" w:themeColor="background1"/>
+        </w:rPr>
+        <w:t xml:space="preserve"> Case), отражающая функциональные возможности приложения в зависимости от роли пользователя.</w:t>
+      </w:r>
+    </w:p>
+    <w:p>
+      <w:pPr>
+        <w:pStyle w:val="ds-markdown-paragraph"/>
+        <w:spacing w:before="0" w:after="0" w:afterAutospacing="0" w:line="360" w:lineRule="auto"/>
+        <w:jc w:val="both"/>
+        <w:rPr>
+          <w:u w:val="single" w:color="FFFFFF" w:themeColor="background1"/>
+        </w:rPr>
+      </w:pPr>
       <w:r>
         <w:rPr>
           <w:noProof/>
           <w:sz w:val="28"/>
         </w:rPr>
-        <w:lastRenderedPageBreak/>
         <w:drawing>
-          <wp:anchor distT="0" distB="0" distL="114300" distR="114300" simplePos="0" relativeHeight="251660288" behindDoc="0" locked="0" layoutInCell="1" allowOverlap="1" wp14:anchorId="24EF09B6" wp14:editId="2626DC98">
+          <wp:anchor distT="0" distB="0" distL="114300" distR="114300" simplePos="0" relativeHeight="251660288" behindDoc="0" locked="0" layoutInCell="1" allowOverlap="1" wp14:anchorId="24EF09B6" wp14:editId="53FE5CD7">
             <wp:simplePos x="0" y="0"/>
             <wp:positionH relativeFrom="margin">
-              <wp:align>left</wp:align>
+              <wp:align>right</wp:align>
             </wp:positionH>
             <wp:positionV relativeFrom="paragraph">
-              <wp:posOffset>603885</wp:posOffset>
+              <wp:posOffset>847</wp:posOffset>
             </wp:positionV>
             <wp:extent cx="6049010" cy="6677025"/>
             <wp:effectExtent l="0" t="0" r="8890" b="9525"/>
@@ -5367,23 +5753,6 @@
           </wp:anchor>
         </w:drawing>
       </w:r>
-      <w:proofErr w:type="spellStart"/>
-      <w:r>
-        <w:rPr>
-          <w:rStyle w:val="af7"/>
-          <w:sz w:val="28"/>
-          <w:u w:val="single" w:color="FFFFFF" w:themeColor="background1"/>
-        </w:rPr>
-        <w:t>deadlines</w:t>
-      </w:r>
-      <w:proofErr w:type="spellEnd"/>
-      <w:r>
-        <w:rPr>
-          <w:sz w:val="28"/>
-          <w:u w:val="single" w:color="FFFFFF" w:themeColor="background1"/>
-        </w:rPr>
-        <w:t> — хранит даты дедлайнов (ID, название, дата, активность).</w:t>
-      </w:r>
     </w:p>
     <w:p>
       <w:pPr>
@@ -5406,6 +5775,7 @@
           <w:szCs w:val="28"/>
           <w:u w:val="single" w:color="FFFFFF" w:themeColor="background1"/>
         </w:rPr>
+        <w:lastRenderedPageBreak/>
         <w:t xml:space="preserve">   </w:t>
       </w:r>
       <w:r>
@@ -5526,7 +5896,6 @@
         <w:rPr>
           <w:sz w:val="28"/>
         </w:rPr>
-        <w:lastRenderedPageBreak/>
         <w:t>Управление списком преподавателей (добавление, редактирование, удаление, загрузка из Excel).</w:t>
       </w:r>
     </w:p>
@@ -5866,7 +6235,6 @@
         <w:rPr>
           <w:sz w:val="28"/>
         </w:rPr>
-        <w:lastRenderedPageBreak/>
         <w:t>Преподаватель вводит тему с указанием уровня, названия и описания.</w:t>
       </w:r>
     </w:p>
@@ -6013,236 +6381,9 @@
     </w:p>
     <w:p>
       <w:pPr>
-        <w:pStyle w:val="ds-markdown-paragraph"/>
-        <w:spacing w:after="0" w:afterAutospacing="0" w:line="360" w:lineRule="auto"/>
-        <w:ind w:firstLine="709"/>
-        <w:jc w:val="both"/>
-        <w:rPr>
-          <w:u w:val="single" w:color="FFFFFF" w:themeColor="background1"/>
-        </w:rPr>
-      </w:pPr>
-      <w:r>
-        <w:rPr>
-          <w:rStyle w:val="af7"/>
-          <w:sz w:val="28"/>
-          <w:u w:val="single" w:color="FFFFFF" w:themeColor="background1"/>
-        </w:rPr>
-        <w:t>Кратность связей:</w:t>
-      </w:r>
-    </w:p>
-    <w:p>
-      <w:pPr>
-        <w:pStyle w:val="ds-markdown-paragraph"/>
-        <w:numPr>
-          <w:ilvl w:val="0"/>
-          <w:numId w:val="16"/>
-        </w:numPr>
-        <w:spacing w:before="0" w:after="0" w:afterAutospacing="0" w:line="360" w:lineRule="auto"/>
-        <w:ind w:firstLine="709"/>
-        <w:jc w:val="both"/>
-        <w:rPr>
-          <w:u w:val="single" w:color="FFFFFF" w:themeColor="background1"/>
-        </w:rPr>
-      </w:pPr>
-      <w:proofErr w:type="spellStart"/>
-      <w:r>
-        <w:rPr>
-          <w:sz w:val="28"/>
-          <w:u w:val="single" w:color="FFFFFF" w:themeColor="background1"/>
-        </w:rPr>
-        <w:t>Teacher</w:t>
-      </w:r>
-      <w:proofErr w:type="spellEnd"/>
-      <w:r>
-        <w:rPr>
-          <w:sz w:val="28"/>
-          <w:u w:val="single" w:color="FFFFFF" w:themeColor="background1"/>
-        </w:rPr>
-        <w:t xml:space="preserve"> (1) → </w:t>
-      </w:r>
-      <w:proofErr w:type="spellStart"/>
-      <w:r>
-        <w:rPr>
-          <w:sz w:val="28"/>
-          <w:u w:val="single" w:color="FFFFFF" w:themeColor="background1"/>
-        </w:rPr>
-        <w:t>Topic</w:t>
-      </w:r>
-      <w:proofErr w:type="spellEnd"/>
-      <w:r>
-        <w:rPr>
-          <w:sz w:val="28"/>
-          <w:u w:val="single" w:color="FFFFFF" w:themeColor="background1"/>
-        </w:rPr>
-        <w:t xml:space="preserve"> (*) — один преподаватель может создать несколько тем.</w:t>
-      </w:r>
-    </w:p>
-    <w:p>
-      <w:pPr>
-        <w:pStyle w:val="ds-markdown-paragraph"/>
-        <w:numPr>
-          <w:ilvl w:val="0"/>
-          <w:numId w:val="16"/>
-        </w:numPr>
-        <w:spacing w:before="0" w:after="0" w:afterAutospacing="0" w:line="360" w:lineRule="auto"/>
-        <w:ind w:firstLine="709"/>
-        <w:jc w:val="both"/>
-        <w:rPr>
-          <w:u w:val="single" w:color="FFFFFF" w:themeColor="background1"/>
-        </w:rPr>
-      </w:pPr>
-      <w:proofErr w:type="spellStart"/>
-      <w:r>
-        <w:rPr>
-          <w:sz w:val="28"/>
-          <w:u w:val="single" w:color="FFFFFF" w:themeColor="background1"/>
-        </w:rPr>
-        <w:t>Student</w:t>
-      </w:r>
-      <w:proofErr w:type="spellEnd"/>
-      <w:r>
-        <w:rPr>
-          <w:sz w:val="28"/>
-          <w:u w:val="single" w:color="FFFFFF" w:themeColor="background1"/>
-        </w:rPr>
-        <w:t xml:space="preserve"> (1) → </w:t>
-      </w:r>
-      <w:proofErr w:type="spellStart"/>
-      <w:r>
-        <w:rPr>
-          <w:sz w:val="28"/>
-          <w:u w:val="single" w:color="FFFFFF" w:themeColor="background1"/>
-        </w:rPr>
-        <w:t>Enrollment</w:t>
-      </w:r>
-      <w:proofErr w:type="spellEnd"/>
-      <w:r>
-        <w:rPr>
-          <w:sz w:val="28"/>
-          <w:u w:val="single" w:color="FFFFFF" w:themeColor="background1"/>
-        </w:rPr>
-        <w:t xml:space="preserve"> (*) — один студент может иметь несколько записей в истории.</w:t>
-      </w:r>
-    </w:p>
-    <w:p>
-      <w:pPr>
-        <w:pStyle w:val="ds-markdown-paragraph"/>
-        <w:numPr>
-          <w:ilvl w:val="0"/>
-          <w:numId w:val="16"/>
-        </w:numPr>
-        <w:spacing w:before="0" w:after="0" w:afterAutospacing="0" w:line="360" w:lineRule="auto"/>
-        <w:ind w:firstLine="709"/>
-        <w:jc w:val="both"/>
-        <w:rPr>
-          <w:u w:val="single" w:color="FFFFFF" w:themeColor="background1"/>
-        </w:rPr>
-      </w:pPr>
-      <w:proofErr w:type="spellStart"/>
-      <w:r>
-        <w:rPr>
-          <w:sz w:val="28"/>
-          <w:u w:val="single" w:color="FFFFFF" w:themeColor="background1"/>
-        </w:rPr>
-        <w:t>Topic</w:t>
-      </w:r>
-      <w:proofErr w:type="spellEnd"/>
-      <w:r>
-        <w:rPr>
-          <w:sz w:val="28"/>
-          <w:u w:val="single" w:color="FFFFFF" w:themeColor="background1"/>
-        </w:rPr>
-        <w:t xml:space="preserve"> (1) → </w:t>
-      </w:r>
-      <w:proofErr w:type="spellStart"/>
-      <w:r>
-        <w:rPr>
-          <w:sz w:val="28"/>
-          <w:u w:val="single" w:color="FFFFFF" w:themeColor="background1"/>
-        </w:rPr>
-        <w:t>Enrollment</w:t>
-      </w:r>
-      <w:proofErr w:type="spellEnd"/>
-      <w:r>
-        <w:rPr>
-          <w:sz w:val="28"/>
-          <w:u w:val="single" w:color="FFFFFF" w:themeColor="background1"/>
-        </w:rPr>
-        <w:t xml:space="preserve"> (</w:t>
-      </w:r>
-      <w:proofErr w:type="gramStart"/>
-      <w:r>
-        <w:rPr>
-          <w:sz w:val="28"/>
-          <w:u w:val="single" w:color="FFFFFF" w:themeColor="background1"/>
-        </w:rPr>
-        <w:t>0..</w:t>
-      </w:r>
-      <w:proofErr w:type="gramEnd"/>
-      <w:r>
-        <w:rPr>
-          <w:sz w:val="28"/>
-          <w:u w:val="single" w:color="FFFFFF" w:themeColor="background1"/>
-        </w:rPr>
-        <w:t>1) — одна тема может быть занята не более чем одним студентом.</w:t>
-      </w:r>
-    </w:p>
-    <w:p>
-      <w:pPr>
-        <w:pStyle w:val="ds-markdown-paragraph"/>
-        <w:numPr>
-          <w:ilvl w:val="0"/>
-          <w:numId w:val="16"/>
-        </w:numPr>
-        <w:spacing w:before="0" w:after="0" w:afterAutospacing="0" w:line="360" w:lineRule="auto"/>
-        <w:ind w:firstLine="709"/>
-        <w:jc w:val="both"/>
-        <w:rPr>
-          <w:sz w:val="28"/>
-          <w:u w:val="single" w:color="FFFFFF" w:themeColor="background1"/>
-        </w:rPr>
-      </w:pPr>
-      <w:proofErr w:type="spellStart"/>
-      <w:r>
-        <w:rPr>
-          <w:sz w:val="28"/>
-          <w:u w:val="single" w:color="FFFFFF" w:themeColor="background1"/>
-        </w:rPr>
-        <w:t>DeadlineChecker</w:t>
-      </w:r>
-      <w:proofErr w:type="spellEnd"/>
-      <w:r>
-        <w:rPr>
-          <w:sz w:val="28"/>
-          <w:u w:val="single" w:color="FFFFFF" w:themeColor="background1"/>
-        </w:rPr>
-        <w:t xml:space="preserve"> (1) → </w:t>
-      </w:r>
-      <w:proofErr w:type="spellStart"/>
-      <w:r>
-        <w:rPr>
-          <w:sz w:val="28"/>
-          <w:u w:val="single" w:color="FFFFFF" w:themeColor="background1"/>
-        </w:rPr>
-        <w:t>Deadline</w:t>
-      </w:r>
-      <w:proofErr w:type="spellEnd"/>
-      <w:r>
-        <w:rPr>
-          <w:sz w:val="28"/>
-          <w:u w:val="single" w:color="FFFFFF" w:themeColor="background1"/>
-        </w:rPr>
-        <w:t xml:space="preserve"> (*) — один сервис использует несколько дедлайнов.</w:t>
-      </w:r>
-    </w:p>
-    <w:p>
-      <w:pPr>
-        <w:spacing w:before="100" w:beforeAutospacing="1" w:line="240" w:lineRule="auto"/>
-        <w:ind w:left="720" w:firstLine="0"/>
+        <w:spacing w:before="100" w:beforeAutospacing="1"/>
         <w:jc w:val="left"/>
         <w:rPr>
-          <w:b/>
-          <w:bCs/>
           <w:u w:val="single" w:color="FFFFFF" w:themeColor="background1"/>
         </w:rPr>
       </w:pPr>
@@ -6255,13 +6396,13 @@
         </w:rPr>
         <w:lastRenderedPageBreak/>
         <w:drawing>
-          <wp:anchor distT="0" distB="0" distL="114300" distR="114300" simplePos="0" relativeHeight="251661312" behindDoc="0" locked="0" layoutInCell="1" allowOverlap="1" wp14:anchorId="539041F2" wp14:editId="328DDAB7">
+          <wp:anchor distT="0" distB="0" distL="114300" distR="114300" simplePos="0" relativeHeight="251661312" behindDoc="0" locked="0" layoutInCell="1" allowOverlap="1" wp14:anchorId="539041F2" wp14:editId="5DC6F3AF">
             <wp:simplePos x="0" y="0"/>
             <wp:positionH relativeFrom="margin">
-              <wp:posOffset>-13335</wp:posOffset>
+              <wp:align>left</wp:align>
             </wp:positionH>
             <wp:positionV relativeFrom="paragraph">
-              <wp:posOffset>354330</wp:posOffset>
+              <wp:posOffset>1480185</wp:posOffset>
             </wp:positionV>
             <wp:extent cx="6049010" cy="4164965"/>
             <wp:effectExtent l="0" t="0" r="8890" b="6985"/>
@@ -6318,12 +6459,13 @@
         </w:drawing>
       </w:r>
       <w:r>
-        <w:rPr>
-          <w:b/>
-          <w:bCs/>
-          <w:u w:val="single" w:color="FFFFFF" w:themeColor="background1"/>
-        </w:rPr>
-        <w:t>Прототип интерфейса:</w:t>
+        <w:t xml:space="preserve"> </w:t>
+      </w:r>
+      <w:r>
+        <w:rPr>
+          <w:u w:val="single" w:color="FFFFFF" w:themeColor="background1"/>
+        </w:rPr>
+        <w:t>После определения функциональных возможностей системы был разработан прототип пользовательского интерфейса. Его создание позволило определить расположение элементов управления, оценить удобство работы пользователей и подготовить основу для последующей реализации клиентской части приложения.</w:t>
       </w:r>
     </w:p>
     <w:p>
@@ -6357,7 +6499,6 @@
     <w:p>
       <w:pPr>
         <w:spacing w:before="100" w:beforeAutospacing="1"/>
-        <w:ind w:left="680"/>
         <w:jc w:val="left"/>
         <w:rPr>
           <w:u w:val="single" w:color="FFFFFF" w:themeColor="background1"/>
@@ -6375,7 +6516,6 @@
     <w:p>
       <w:pPr>
         <w:spacing w:before="100" w:beforeAutospacing="1"/>
-        <w:ind w:left="680"/>
         <w:jc w:val="left"/>
         <w:rPr>
           <w:u w:val="single" w:color="FFFFFF" w:themeColor="background1"/>
@@ -6423,7 +6563,6 @@
     <w:p>
       <w:pPr>
         <w:spacing w:before="100" w:beforeAutospacing="1"/>
-        <w:ind w:left="680"/>
         <w:jc w:val="left"/>
         <w:rPr>
           <w:u w:val="single" w:color="FFFFFF" w:themeColor="background1"/>
@@ -6435,15 +6574,8 @@
           <w:u w:val="single" w:color="FFFFFF" w:themeColor="background1"/>
           <w:lang w:val="ru-KZ"/>
         </w:rPr>
-        <w:t xml:space="preserve">При проектировании интерфейса основное внимание уделялось простоте использования, логичному расположению элементов и минимизации количества действий, необходимых для выполнения основных операций. Такое решение обеспечивает удобную работу </w:t>
-      </w:r>
-      <w:r>
-        <w:rPr>
-          <w:u w:val="single" w:color="FFFFFF" w:themeColor="background1"/>
-          <w:lang w:val="ru-KZ"/>
-        </w:rPr>
         <w:lastRenderedPageBreak/>
-        <w:t>пользователей и соответствует требованиям к современным настольным информационным системам.</w:t>
+        <w:t>При проектировании интерфейса основное внимание уделялось простоте использования, логичному расположению элементов и минимизации количества действий, необходимых для выполнения основных операций. Такое решение обеспечивает удобную работу пользователей и соответствует требованиям к современным настольным информационным системам.</w:t>
       </w:r>
     </w:p>
     <w:p>

</xml_diff>

<commit_message>
report second part start
</commit_message>
<xml_diff>
--- a/docs/report.docx
+++ b/docs/report.docx
@@ -5547,6 +5547,7 @@
       </w:pPr>
       <w:r>
         <w:rPr>
+          <w:noProof/>
           <w:sz w:val="28"/>
           <w:szCs w:val="28"/>
           <w:u w:val="single" w:color="FFFFFF" w:themeColor="background1"/>
@@ -5651,7 +5652,6 @@
           <w:sz w:val="28"/>
           <w:szCs w:val="28"/>
           <w:u w:val="single" w:color="FFFFFF" w:themeColor="background1"/>
-          <w:lang w:val="en-US"/>
         </w:rPr>
         <w:t>2</w:t>
       </w:r>
@@ -6154,7 +6154,6 @@
               <w:t> (группа). Методы: </w:t>
             </w:r>
             <w:proofErr w:type="spellStart"/>
-            <w:proofErr w:type="gramStart"/>
             <w:r>
               <w:rPr>
                 <w:sz w:val="24"/>
@@ -6170,16 +6169,7 @@
                 <w:szCs w:val="24"/>
                 <w:highlight w:val="none"/>
               </w:rPr>
-              <w:t>(</w:t>
-            </w:r>
-            <w:proofErr w:type="gramEnd"/>
-            <w:r>
-              <w:rPr>
-                <w:sz w:val="24"/>
-                <w:szCs w:val="24"/>
-                <w:highlight w:val="none"/>
-              </w:rPr>
-              <w:t>) </w:t>
+              <w:t>() </w:t>
             </w:r>
             <w:r>
               <w:rPr>
@@ -6360,16 +6350,7 @@
                 <w:szCs w:val="24"/>
                 <w:highlight w:val="none"/>
               </w:rPr>
-              <w:t>create_</w:t>
-            </w:r>
-            <w:proofErr w:type="gramStart"/>
-            <w:r>
-              <w:rPr>
-                <w:sz w:val="24"/>
-                <w:szCs w:val="24"/>
-                <w:highlight w:val="none"/>
-              </w:rPr>
-              <w:t>topic</w:t>
+              <w:t>create_topic</w:t>
             </w:r>
             <w:proofErr w:type="spellEnd"/>
             <w:r>
@@ -6378,16 +6359,7 @@
                 <w:szCs w:val="24"/>
                 <w:highlight w:val="none"/>
               </w:rPr>
-              <w:t>(</w:t>
-            </w:r>
-            <w:proofErr w:type="gramEnd"/>
-            <w:r>
-              <w:rPr>
-                <w:sz w:val="24"/>
-                <w:szCs w:val="24"/>
-                <w:highlight w:val="none"/>
-              </w:rPr>
-              <w:t>)</w:t>
+              <w:t>()</w:t>
             </w:r>
             <w:r>
               <w:rPr>
@@ -6552,27 +6524,7 @@
                 <w:highlight w:val="none"/>
                 <w:lang w:val="en-US"/>
               </w:rPr>
-              <w:t>: manage_</w:t>
-            </w:r>
-            <w:proofErr w:type="gramStart"/>
-            <w:r>
-              <w:rPr>
-                <w:sz w:val="24"/>
-                <w:szCs w:val="24"/>
-                <w:highlight w:val="none"/>
-                <w:lang w:val="en-US"/>
-              </w:rPr>
-              <w:t>students(</w:t>
-            </w:r>
-            <w:proofErr w:type="gramEnd"/>
-            <w:r>
-              <w:rPr>
-                <w:sz w:val="24"/>
-                <w:szCs w:val="24"/>
-                <w:highlight w:val="none"/>
-                <w:lang w:val="en-US"/>
-              </w:rPr>
-              <w:t>), manage_teachers(), manage_topics(), manage_deadlines(), generate_order(), change_supervisor().</w:t>
+              <w:t>: manage_students(), manage_teachers(), manage_topics(), manage_deadlines(), generate_order(), change_supervisor().</w:t>
             </w:r>
           </w:p>
         </w:tc>
@@ -6709,16 +6661,7 @@
                 <w:szCs w:val="24"/>
                 <w:highlight w:val="none"/>
               </w:rPr>
-              <w:t>get_</w:t>
-            </w:r>
-            <w:proofErr w:type="gramStart"/>
-            <w:r>
-              <w:rPr>
-                <w:sz w:val="24"/>
-                <w:szCs w:val="24"/>
-                <w:highlight w:val="none"/>
-              </w:rPr>
-              <w:t>status</w:t>
+              <w:t>get_status</w:t>
             </w:r>
             <w:proofErr w:type="spellEnd"/>
             <w:r>
@@ -6727,16 +6670,7 @@
                 <w:szCs w:val="24"/>
                 <w:highlight w:val="none"/>
               </w:rPr>
-              <w:t>(</w:t>
-            </w:r>
-            <w:proofErr w:type="gramEnd"/>
-            <w:r>
-              <w:rPr>
-                <w:sz w:val="24"/>
-                <w:szCs w:val="24"/>
-                <w:highlight w:val="none"/>
-              </w:rPr>
-              <w:t>) </w:t>
+              <w:t>() </w:t>
             </w:r>
             <w:r>
               <w:rPr>
@@ -7126,27 +7060,7 @@
                 <w:highlight w:val="none"/>
                 <w:lang w:val="en-US"/>
               </w:rPr>
-              <w:t>: can_add_</w:t>
-            </w:r>
-            <w:proofErr w:type="gramStart"/>
-            <w:r>
-              <w:rPr>
-                <w:sz w:val="24"/>
-                <w:szCs w:val="24"/>
-                <w:highlight w:val="none"/>
-                <w:lang w:val="en-US"/>
-              </w:rPr>
-              <w:t>topic(</w:t>
-            </w:r>
-            <w:proofErr w:type="gramEnd"/>
-            <w:r>
-              <w:rPr>
-                <w:sz w:val="24"/>
-                <w:szCs w:val="24"/>
-                <w:highlight w:val="none"/>
-                <w:lang w:val="en-US"/>
-              </w:rPr>
-              <w:t xml:space="preserve">), can_enroll(), can_change_topic(), can_generate_order(). </w:t>
+              <w:t xml:space="preserve">: can_add_topic(), can_enroll(), can_change_topic(), can_generate_order(). </w:t>
             </w:r>
             <w:r>
               <w:rPr>
@@ -7248,27 +7162,7 @@
                 <w:highlight w:val="none"/>
                 <w:lang w:val="en-US"/>
               </w:rPr>
-              <w:t>: hash_</w:t>
-            </w:r>
-            <w:proofErr w:type="gramStart"/>
-            <w:r>
-              <w:rPr>
-                <w:sz w:val="24"/>
-                <w:szCs w:val="24"/>
-                <w:highlight w:val="none"/>
-                <w:lang w:val="en-US"/>
-              </w:rPr>
-              <w:t>password(</w:t>
-            </w:r>
-            <w:proofErr w:type="gramEnd"/>
-            <w:r>
-              <w:rPr>
-                <w:sz w:val="24"/>
-                <w:szCs w:val="24"/>
-                <w:highlight w:val="none"/>
-                <w:lang w:val="en-US"/>
-              </w:rPr>
-              <w:t>), verify_password(), create_access_token(), decode_token(), get_current_user(), get_current_admin(), get_current_teacher().</w:t>
+              <w:t>: hash_password(), verify_password(), create_access_token(), decode_token(), get_current_user(), get_current_admin(), get_current_teacher().</w:t>
             </w:r>
           </w:p>
         </w:tc>
@@ -7284,6 +7178,7 @@
           <w:rStyle w:val="af7"/>
           <w:sz w:val="28"/>
           <w:u w:val="single" w:color="FFFFFF" w:themeColor="background1"/>
+          <w:lang w:val="en-US"/>
         </w:rPr>
       </w:pPr>
     </w:p>
@@ -8254,18 +8149,7 @@
                 <w:highlight w:val="none"/>
                 <w:lang w:val="en-US"/>
               </w:rPr>
-              <w:t>&gt;</w:t>
-            </w:r>
-            <w:r>
-              <w:rPr>
-                <w:b/>
-                <w:bCs/>
-                <w:sz w:val="24"/>
-                <w:szCs w:val="24"/>
-                <w:highlight w:val="none"/>
-                <w:lang w:val="en-US"/>
-              </w:rPr>
-              <w:t xml:space="preserve"> </w:t>
+              <w:t xml:space="preserve">&gt; </w:t>
             </w:r>
             <w:proofErr w:type="spellStart"/>
             <w:r>
@@ -8458,18 +8342,7 @@
                 <w:highlight w:val="none"/>
                 <w:lang w:val="en-US"/>
               </w:rPr>
-              <w:t>&gt;</w:t>
-            </w:r>
-            <w:r>
-              <w:rPr>
-                <w:b/>
-                <w:bCs/>
-                <w:sz w:val="24"/>
-                <w:szCs w:val="24"/>
-                <w:highlight w:val="none"/>
-                <w:lang w:val="en-US"/>
-              </w:rPr>
-              <w:t xml:space="preserve"> </w:t>
+              <w:t xml:space="preserve">&gt; </w:t>
             </w:r>
             <w:proofErr w:type="spellStart"/>
             <w:r>
@@ -8573,25 +8446,7 @@
                 <w:szCs w:val="24"/>
                 <w:highlight w:val="none"/>
               </w:rPr>
-              <w:t xml:space="preserve"> </w:t>
-            </w:r>
-            <w:proofErr w:type="gramStart"/>
-            <w:r>
-              <w:rPr>
-                <w:sz w:val="24"/>
-                <w:szCs w:val="24"/>
-                <w:highlight w:val="none"/>
-              </w:rPr>
-              <w:t>0..</w:t>
-            </w:r>
-            <w:proofErr w:type="gramEnd"/>
-            <w:r>
-              <w:rPr>
-                <w:sz w:val="24"/>
-                <w:szCs w:val="24"/>
-                <w:highlight w:val="none"/>
-              </w:rPr>
-              <w:t>1</w:t>
+              <w:t xml:space="preserve"> 0..1</w:t>
             </w:r>
           </w:p>
         </w:tc>
@@ -8696,18 +8551,7 @@
                 <w:highlight w:val="none"/>
                 <w:lang w:val="en-US"/>
               </w:rPr>
-              <w:t>&gt;</w:t>
-            </w:r>
-            <w:r>
-              <w:rPr>
-                <w:b/>
-                <w:bCs/>
-                <w:sz w:val="24"/>
-                <w:szCs w:val="24"/>
-                <w:highlight w:val="none"/>
-                <w:lang w:val="en-US"/>
-              </w:rPr>
-              <w:t xml:space="preserve"> </w:t>
+              <w:t xml:space="preserve">&gt; </w:t>
             </w:r>
             <w:proofErr w:type="spellStart"/>
             <w:r>
@@ -8890,17 +8734,7 @@
                 <w:szCs w:val="24"/>
                 <w:highlight w:val="none"/>
               </w:rPr>
-              <w:t xml:space="preserve"> </w:t>
-            </w:r>
-            <w:r>
-              <w:rPr>
-                <w:b/>
-                <w:bCs/>
-                <w:sz w:val="24"/>
-                <w:szCs w:val="24"/>
-                <w:highlight w:val="none"/>
-              </w:rPr>
-              <w:t>=</w:t>
+              <w:t xml:space="preserve"> =</w:t>
             </w:r>
             <w:r>
               <w:rPr>
@@ -9059,7 +8893,6 @@
           <w:rStyle w:val="af7"/>
           <w:sz w:val="28"/>
           <w:u w:val="single" w:color="FFFFFF" w:themeColor="background1"/>
-          <w:lang w:val="en-US"/>
         </w:rPr>
       </w:pPr>
     </w:p>
@@ -9343,18 +9176,7 @@
                 <w:highlight w:val="none"/>
                 <w:lang w:val="en-US"/>
               </w:rPr>
-              <w:t>&gt;</w:t>
-            </w:r>
-            <w:r>
-              <w:rPr>
-                <w:b/>
-                <w:bCs/>
-                <w:sz w:val="24"/>
-                <w:szCs w:val="24"/>
-                <w:highlight w:val="none"/>
-                <w:lang w:val="en-US"/>
-              </w:rPr>
-              <w:t xml:space="preserve"> *</w:t>
+              <w:t>&gt; *</w:t>
             </w:r>
           </w:p>
         </w:tc>
@@ -9550,18 +9372,7 @@
                 <w:highlight w:val="none"/>
                 <w:lang w:val="en-US"/>
               </w:rPr>
-              <w:t>&gt;</w:t>
-            </w:r>
-            <w:r>
-              <w:rPr>
-                <w:b/>
-                <w:bCs/>
-                <w:sz w:val="24"/>
-                <w:szCs w:val="24"/>
-                <w:highlight w:val="none"/>
-                <w:lang w:val="en-US"/>
-              </w:rPr>
-              <w:t xml:space="preserve"> 1</w:t>
+              <w:t>&gt; 1</w:t>
             </w:r>
           </w:p>
         </w:tc>
@@ -9757,18 +9568,7 @@
                 <w:highlight w:val="none"/>
                 <w:lang w:val="en-US"/>
               </w:rPr>
-              <w:t>&gt;</w:t>
-            </w:r>
-            <w:r>
-              <w:rPr>
-                <w:b/>
-                <w:bCs/>
-                <w:sz w:val="24"/>
-                <w:szCs w:val="24"/>
-                <w:highlight w:val="none"/>
-                <w:lang w:val="en-US"/>
-              </w:rPr>
-              <w:t xml:space="preserve"> *</w:t>
+              <w:t>&gt; *</w:t>
             </w:r>
           </w:p>
         </w:tc>
@@ -9964,18 +9764,7 @@
                 <w:highlight w:val="none"/>
                 <w:lang w:val="en-US"/>
               </w:rPr>
-              <w:t>&gt;</w:t>
-            </w:r>
-            <w:r>
-              <w:rPr>
-                <w:b/>
-                <w:bCs/>
-                <w:sz w:val="24"/>
-                <w:szCs w:val="24"/>
-                <w:highlight w:val="none"/>
-                <w:lang w:val="en-US"/>
-              </w:rPr>
-              <w:t xml:space="preserve"> 1</w:t>
+              <w:t>&gt; 1</w:t>
             </w:r>
           </w:p>
         </w:tc>
@@ -10171,42 +9960,7 @@
                 <w:highlight w:val="none"/>
                 <w:lang w:val="en-US"/>
               </w:rPr>
-              <w:t>&gt;</w:t>
-            </w:r>
-            <w:r>
-              <w:rPr>
-                <w:b/>
-                <w:bCs/>
-                <w:sz w:val="24"/>
-                <w:szCs w:val="24"/>
-                <w:highlight w:val="none"/>
-                <w:lang w:val="en-US"/>
-              </w:rPr>
-              <w:t xml:space="preserve"> </w:t>
-            </w:r>
-            <w:proofErr w:type="gramStart"/>
-            <w:r>
-              <w:rPr>
-                <w:b/>
-                <w:bCs/>
-                <w:sz w:val="24"/>
-                <w:szCs w:val="24"/>
-                <w:highlight w:val="none"/>
-                <w:lang w:val="en-US"/>
-              </w:rPr>
-              <w:t>0..</w:t>
-            </w:r>
-            <w:proofErr w:type="gramEnd"/>
-            <w:r>
-              <w:rPr>
-                <w:b/>
-                <w:bCs/>
-                <w:sz w:val="24"/>
-                <w:szCs w:val="24"/>
-                <w:highlight w:val="none"/>
-                <w:lang w:val="en-US"/>
-              </w:rPr>
-              <w:t>1</w:t>
+              <w:t>&gt; 0..1</w:t>
             </w:r>
           </w:p>
         </w:tc>
@@ -10391,18 +10145,7 @@
                 <w:highlight w:val="none"/>
                 <w:lang w:val="en-US"/>
               </w:rPr>
-              <w:t>&gt;</w:t>
-            </w:r>
-            <w:r>
-              <w:rPr>
-                <w:b/>
-                <w:bCs/>
-                <w:sz w:val="24"/>
-                <w:szCs w:val="24"/>
-                <w:highlight w:val="none"/>
-                <w:lang w:val="en-US"/>
-              </w:rPr>
-              <w:t xml:space="preserve"> 1</w:t>
+              <w:t>&gt; 1</w:t>
             </w:r>
           </w:p>
         </w:tc>
@@ -10598,18 +10341,7 @@
                 <w:highlight w:val="none"/>
                 <w:lang w:val="en-US"/>
               </w:rPr>
-              <w:t>&gt;</w:t>
-            </w:r>
-            <w:r>
-              <w:rPr>
-                <w:b/>
-                <w:bCs/>
-                <w:sz w:val="24"/>
-                <w:szCs w:val="24"/>
-                <w:highlight w:val="none"/>
-                <w:lang w:val="en-US"/>
-              </w:rPr>
-              <w:t xml:space="preserve"> *</w:t>
+              <w:t>&gt; *</w:t>
             </w:r>
           </w:p>
         </w:tc>
@@ -10714,6 +10446,9 @@
         </w:rPr>
       </w:pPr>
       <w:r>
+        <w:rPr>
+          <w:noProof/>
+        </w:rPr>
         <w:lastRenderedPageBreak/>
         <w:drawing>
           <wp:anchor distT="0" distB="0" distL="114300" distR="114300" simplePos="0" relativeHeight="251662336" behindDoc="0" locked="0" layoutInCell="1" allowOverlap="1" wp14:anchorId="6C1BE70D" wp14:editId="1A0D0CC6">
@@ -11156,6 +10891,7 @@
       </w:pPr>
       <w:r>
         <w:rPr>
+          <w:noProof/>
           <w:u w:val="single" w:color="FFFFFF" w:themeColor="background1"/>
         </w:rPr>
         <w:lastRenderedPageBreak/>
@@ -12155,7 +11891,6 @@
       <w:pPr>
         <w:pStyle w:val="1"/>
         <w:ind w:firstLine="709"/>
-        <w:jc w:val="both"/>
       </w:pPr>
       <w:bookmarkStart w:id="11" w:name="_Toc233319898"/>
       <w:r>
@@ -12200,37 +11935,456 @@
     </w:p>
     <w:p>
       <w:pPr>
+        <w:pStyle w:val="af3"/>
+        <w:jc w:val="center"/>
+        <w:rPr>
+          <w:b/>
+        </w:rPr>
+      </w:pPr>
+      <w:bookmarkStart w:id="19" w:name="_Toc233319900"/>
+      <w:r>
+        <w:rPr>
+          <w:b/>
+        </w:rPr>
+        <w:t xml:space="preserve">2.1 </w:t>
+      </w:r>
+      <w:r>
+        <w:rPr>
+          <w:b/>
+        </w:rPr>
+        <w:t>Реализация подсистемы хранения данных и автоматизированного тестирования</w:t>
+      </w:r>
+      <w:bookmarkEnd w:id="19"/>
+      <w:r>
+        <w:rPr>
+          <w:b/>
+        </w:rPr>
+        <w:t>.</w:t>
+      </w:r>
+    </w:p>
+    <w:p>
+      <w:r>
+        <w:t>В рамках командной разработки мной был реализован ключевой серверный модуль, отвечающий за организацию хранения данных, а также разработан комплекс автоматизированных тестов для обеспечения надежности бизнес-логики приложения.</w:t>
+      </w:r>
+    </w:p>
+    <w:p>
+      <w:pPr>
+        <w:rPr>
+          <w:b/>
+          <w:bCs/>
+        </w:rPr>
+      </w:pPr>
+      <w:r>
+        <w:rPr>
+          <w:b/>
+          <w:bCs/>
+        </w:rPr>
+        <w:t>Реализация модели базы данных</w:t>
+      </w:r>
+    </w:p>
+    <w:p>
+      <w:r>
+        <w:t xml:space="preserve">Для взаимодействия с СУБД </w:t>
+      </w:r>
+      <w:proofErr w:type="spellStart"/>
+      <w:r>
+        <w:t>SQLite</w:t>
+      </w:r>
+      <w:proofErr w:type="spellEnd"/>
+      <w:r>
+        <w:t xml:space="preserve"> была спроектирована и реализована объектно-реляционная модель (ORM) с использованием библиотеки </w:t>
+      </w:r>
+      <w:proofErr w:type="spellStart"/>
+      <w:r>
+        <w:t>SQLAlchemy</w:t>
+      </w:r>
+      <w:proofErr w:type="spellEnd"/>
+      <w:r>
+        <w:t>. Данный подход позволил абстрагировать бизнес-логику от прямых SQL-запросов, обеспечить кроссплатформенность кода и упростить его поддержку.</w:t>
+      </w:r>
+    </w:p>
+    <w:p>
+      <w:pPr>
+        <w:rPr>
+          <w:b/>
+          <w:bCs/>
+        </w:rPr>
+      </w:pPr>
+      <w:r>
+        <w:rPr>
+          <w:b/>
+          <w:bCs/>
+        </w:rPr>
+        <w:t>Были описаны и связаны следующие основные сущности:</w:t>
+      </w:r>
+    </w:p>
+    <w:p>
+      <w:pPr>
+        <w:pStyle w:val="af4"/>
+        <w:numPr>
+          <w:ilvl w:val="1"/>
+          <w:numId w:val="11"/>
+        </w:numPr>
+      </w:pPr>
+      <w:r>
+        <w:t xml:space="preserve">User (базовый класс), а также наследники </w:t>
+      </w:r>
+      <w:proofErr w:type="spellStart"/>
+      <w:r>
+        <w:t>Student</w:t>
+      </w:r>
+      <w:proofErr w:type="spellEnd"/>
+      <w:r>
+        <w:t xml:space="preserve">, </w:t>
+      </w:r>
+      <w:proofErr w:type="spellStart"/>
+      <w:r>
+        <w:t>Teacher</w:t>
+      </w:r>
+      <w:proofErr w:type="spellEnd"/>
+      <w:r>
+        <w:t xml:space="preserve">, </w:t>
+      </w:r>
+      <w:proofErr w:type="spellStart"/>
+      <w:r>
+        <w:t>Admin</w:t>
+      </w:r>
+      <w:proofErr w:type="spellEnd"/>
+      <w:r>
+        <w:t xml:space="preserve"> — обеспечивают строгое разграничение прав доступа и хранение учетных данных.</w:t>
+      </w:r>
+    </w:p>
+    <w:p>
+      <w:pPr>
+        <w:pStyle w:val="af4"/>
+        <w:numPr>
+          <w:ilvl w:val="1"/>
+          <w:numId w:val="11"/>
+        </w:numPr>
+      </w:pPr>
+      <w:proofErr w:type="spellStart"/>
+      <w:r>
+        <w:t>Topic</w:t>
+      </w:r>
+      <w:proofErr w:type="spellEnd"/>
+      <w:r>
+        <w:t xml:space="preserve"> и </w:t>
+      </w:r>
+      <w:proofErr w:type="spellStart"/>
+      <w:r>
+        <w:t>Enrollment</w:t>
+      </w:r>
+      <w:proofErr w:type="spellEnd"/>
+      <w:r>
+        <w:t xml:space="preserve"> — реализуют логику распределения тем. Особое внимание было уделено целостности данных: настроены внешние ключи (Foreign </w:t>
+      </w:r>
+      <w:proofErr w:type="spellStart"/>
+      <w:r>
+        <w:t>Keys</w:t>
+      </w:r>
+      <w:proofErr w:type="spellEnd"/>
+      <w:r>
+        <w:t>) и уникальные ограничения, предотвращающие дублирование записей студентов на одну и ту же тему.</w:t>
+      </w:r>
+    </w:p>
+    <w:p>
+      <w:pPr>
+        <w:pStyle w:val="af4"/>
+        <w:numPr>
+          <w:ilvl w:val="1"/>
+          <w:numId w:val="11"/>
+        </w:numPr>
+      </w:pPr>
+      <w:proofErr w:type="spellStart"/>
+      <w:r>
+        <w:t>Deadline</w:t>
+      </w:r>
+      <w:proofErr w:type="spellEnd"/>
+      <w:r>
+        <w:t xml:space="preserve"> — хранит глобальные временные ограничения системы.</w:t>
+      </w:r>
+    </w:p>
+    <w:p>
+      <w:r>
+        <w:t xml:space="preserve">Для корректной работы асинхронного веб-фреймворка </w:t>
+      </w:r>
+      <w:proofErr w:type="spellStart"/>
+      <w:r>
+        <w:t>FastAPI</w:t>
+      </w:r>
+      <w:proofErr w:type="spellEnd"/>
+      <w:r>
+        <w:t xml:space="preserve"> была настроена система управления сессиями базы данных через механизм </w:t>
+      </w:r>
+      <w:proofErr w:type="spellStart"/>
+      <w:r>
+        <w:t>Dependency</w:t>
+      </w:r>
+      <w:proofErr w:type="spellEnd"/>
+      <w:r>
+        <w:t xml:space="preserve"> </w:t>
+      </w:r>
+      <w:proofErr w:type="spellStart"/>
+      <w:r>
+        <w:t>Injection</w:t>
+      </w:r>
+      <w:proofErr w:type="spellEnd"/>
+      <w:r>
+        <w:t xml:space="preserve"> (</w:t>
+      </w:r>
+      <w:proofErr w:type="spellStart"/>
+      <w:r>
+        <w:t>Depends</w:t>
+      </w:r>
+      <w:proofErr w:type="spellEnd"/>
+      <w:r>
+        <w:t>(</w:t>
+      </w:r>
+      <w:proofErr w:type="spellStart"/>
+      <w:r>
+        <w:t>get_db</w:t>
+      </w:r>
+      <w:proofErr w:type="spellEnd"/>
+      <w:r>
+        <w:t>)), что гарантирует безопасное открытие и закрытие соединений при каждом HTTP-запросе.</w:t>
+      </w:r>
+    </w:p>
+    <w:p>
+      <w:r>
+        <w:t>Настройка окружения и изоляция тестов</w:t>
+      </w:r>
+    </w:p>
+    <w:p>
+      <w:r>
+        <w:t xml:space="preserve">Для верификации корректности работы API и предотвращения регрессионных ошибок был внедрен фреймворк </w:t>
+      </w:r>
+      <w:proofErr w:type="spellStart"/>
+      <w:r>
+        <w:t>pytest</w:t>
+      </w:r>
+      <w:proofErr w:type="spellEnd"/>
+      <w:r>
+        <w:t xml:space="preserve">. Ключевой задачей при </w:t>
+      </w:r>
+      <w:r>
+        <w:lastRenderedPageBreak/>
+        <w:t>настройке тестового окружения (файл conftest.py) было обеспечение полной изоляции тестов от рабочей базы данных.</w:t>
+      </w:r>
+    </w:p>
+    <w:p>
+      <w:pPr>
+        <w:rPr>
+          <w:b/>
+          <w:bCs/>
+        </w:rPr>
+      </w:pPr>
+      <w:r>
+        <w:rPr>
+          <w:b/>
+          <w:bCs/>
+        </w:rPr>
+        <w:t>Было реализовано следующее:</w:t>
+      </w:r>
+    </w:p>
+    <w:p>
+      <w:pPr>
+        <w:pStyle w:val="af4"/>
+        <w:numPr>
+          <w:ilvl w:val="1"/>
+          <w:numId w:val="10"/>
+        </w:numPr>
+      </w:pPr>
+      <w:r>
+        <w:t>Изоляция данных: Для тестов используется временная база данных в памяти (</w:t>
+      </w:r>
+      <w:proofErr w:type="spellStart"/>
+      <w:r>
+        <w:t>sqlite</w:t>
+      </w:r>
+      <w:proofErr w:type="spellEnd"/>
+      <w:r>
+        <w:t>:///:</w:t>
+      </w:r>
+      <w:proofErr w:type="spellStart"/>
+      <w:r>
+        <w:t>memory</w:t>
+      </w:r>
+      <w:proofErr w:type="spellEnd"/>
+      <w:r>
+        <w:t>:). Перед каждым тестом создается структура таблиц, а после завершения теста происходит принудительный откат транзакции (</w:t>
+      </w:r>
+      <w:proofErr w:type="spellStart"/>
+      <w:r>
+        <w:t>transaction.rollback</w:t>
+      </w:r>
+      <w:proofErr w:type="spellEnd"/>
+      <w:r>
+        <w:t>()). Это гарантирует, что тесты не влияют друг на друга и не загрязняют базу данных.</w:t>
+      </w:r>
+    </w:p>
+    <w:p>
+      <w:pPr>
+        <w:pStyle w:val="af4"/>
+        <w:numPr>
+          <w:ilvl w:val="1"/>
+          <w:numId w:val="10"/>
+        </w:numPr>
+      </w:pPr>
+      <w:proofErr w:type="spellStart"/>
+      <w:r>
+        <w:t>Фикстуры</w:t>
+      </w:r>
+      <w:proofErr w:type="spellEnd"/>
+      <w:r>
+        <w:t xml:space="preserve"> (</w:t>
+      </w:r>
+      <w:proofErr w:type="spellStart"/>
+      <w:r>
+        <w:t>Fixtures</w:t>
+      </w:r>
+      <w:proofErr w:type="spellEnd"/>
+      <w:r>
+        <w:t xml:space="preserve">): Разработаны </w:t>
+      </w:r>
+      <w:proofErr w:type="spellStart"/>
+      <w:r>
+        <w:t>переиспользуемые</w:t>
+      </w:r>
+      <w:proofErr w:type="spellEnd"/>
+      <w:r>
+        <w:t xml:space="preserve"> </w:t>
+      </w:r>
+      <w:proofErr w:type="spellStart"/>
+      <w:r>
+        <w:t>фикстуры</w:t>
+      </w:r>
+      <w:proofErr w:type="spellEnd"/>
+      <w:r>
+        <w:t xml:space="preserve"> для генерации тестовых данных (студенты, преподаватели, администраторы) и эмуляции HTTP-клиента (</w:t>
+      </w:r>
+      <w:proofErr w:type="spellStart"/>
+      <w:r>
+        <w:t>TestClient</w:t>
+      </w:r>
+      <w:proofErr w:type="spellEnd"/>
+      <w:r>
+        <w:t>) с заголовками авторизации (JWT-токены).</w:t>
+      </w:r>
+    </w:p>
+    <w:p>
+      <w:pPr>
+        <w:rPr>
+          <w:b/>
+          <w:bCs/>
+        </w:rPr>
+      </w:pPr>
+      <w:r>
+        <w:rPr>
+          <w:b/>
+          <w:bCs/>
+        </w:rPr>
+        <w:t>Разработка тестовых сценариев</w:t>
+      </w:r>
+    </w:p>
+    <w:p>
+      <w:r>
+        <w:t>Нами был покрыт тестами весь критически важный функционал приложения. Мною были написаны следующие наборы тестов:</w:t>
+      </w:r>
+    </w:p>
+    <w:p>
+      <w:pPr>
+        <w:pStyle w:val="af4"/>
+        <w:numPr>
+          <w:ilvl w:val="0"/>
+          <w:numId w:val="20"/>
+        </w:numPr>
+      </w:pPr>
+      <w:r>
+        <w:t xml:space="preserve">Интеграционные тесты </w:t>
+      </w:r>
+      <w:proofErr w:type="spellStart"/>
+      <w:r>
+        <w:t>парсинга</w:t>
+      </w:r>
+      <w:proofErr w:type="spellEnd"/>
+      <w:r>
+        <w:t xml:space="preserve"> Excel (test_excel_service.py): Реализована проверка сервисов импорта данных на основе реальных университетских файлов (.</w:t>
+      </w:r>
+      <w:proofErr w:type="spellStart"/>
+      <w:r>
+        <w:t>xlsx</w:t>
+      </w:r>
+      <w:proofErr w:type="spellEnd"/>
+      <w:r>
+        <w:t>). Тесты подтверждают корректность считывания ФИО, курсов, групп и тем, а также обработку отсутствующих файлов.</w:t>
+      </w:r>
+    </w:p>
+    <w:p>
+      <w:pPr>
+        <w:pStyle w:val="af4"/>
+        <w:numPr>
+          <w:ilvl w:val="0"/>
+          <w:numId w:val="20"/>
+        </w:numPr>
+      </w:pPr>
+      <w:r>
+        <w:t>Тесты бизнес-логики записи на темы (test_enrollments.py): Покрыты основные сценарии взаимодействия студента и преподавателя. Протестированы успешная запись на тему, отклонение попытки записи на уже занятую тему, а также сценарии подтверждения и отклонения заявок преподавателем.</w:t>
+      </w:r>
+    </w:p>
+    <w:p>
+      <w:pPr>
+        <w:pStyle w:val="af4"/>
+        <w:numPr>
+          <w:ilvl w:val="0"/>
+          <w:numId w:val="20"/>
+        </w:numPr>
+      </w:pPr>
+      <w:r>
+        <w:t>Тесты генерации документации (test_order_service.py): Реализована проверка сервиса формирования приказов. Тесты подтверждают успешное создание файлов формата .</w:t>
+      </w:r>
+      <w:proofErr w:type="spellStart"/>
+      <w:r>
+        <w:t>docx</w:t>
+      </w:r>
+      <w:proofErr w:type="spellEnd"/>
+      <w:r>
+        <w:t>, корректность их сохранения и обработку пользовательских путей.</w:t>
+      </w:r>
+    </w:p>
+    <w:p>
+      <w:pPr>
+        <w:pStyle w:val="af4"/>
+        <w:numPr>
+          <w:ilvl w:val="0"/>
+          <w:numId w:val="20"/>
+        </w:numPr>
+      </w:pPr>
+      <w:r>
+        <w:lastRenderedPageBreak/>
+        <w:t>Тесты безопасности и авторизации (test_auth.py): Проверены сценарии аутентификации, включая успешный вход в систему и блокировку попыток входа с неверно указанной ролью пользователя.</w:t>
+      </w:r>
+    </w:p>
+    <w:p>
+      <w:r>
+        <w:t xml:space="preserve">Внедрение данного комплекса тестов позволило значительно повысить отказоустойчивость приложения и ускорить процесс внесения изменений в код, так как любые нарушения логики мгновенно обнаруживаются на этапе запуска </w:t>
+      </w:r>
+      <w:proofErr w:type="spellStart"/>
+      <w:r>
+        <w:t>pytest</w:t>
+      </w:r>
+      <w:proofErr w:type="spellEnd"/>
+      <w:r>
+        <w:t>.</w:t>
+      </w:r>
+    </w:p>
+    <w:p>
+      <w:pPr>
         <w:pStyle w:val="2"/>
         <w:ind w:firstLine="709"/>
         <w:jc w:val="both"/>
-      </w:pPr>
-      <w:bookmarkStart w:id="19" w:name="_Toc233319900"/>
-      <w:r>
-        <w:t>Создание интерфейса приложения</w:t>
-      </w:r>
-      <w:bookmarkEnd w:id="19"/>
-    </w:p>
-    <w:p>
-      <w:pPr>
-        <w:ind w:firstLine="709"/>
-        <w:rPr>
-          <w:i/>
-          <w:color w:val="C00000"/>
-        </w:rPr>
-      </w:pPr>
-      <w:r>
-        <w:rPr>
-          <w:i/>
-          <w:color w:val="C00000"/>
-        </w:rPr>
-        <w:t>Описать процесс создания интерфейса, привести скриншоты, обосновать необходимость элементов интерфейса</w:t>
-      </w:r>
-    </w:p>
-    <w:p>
-      <w:pPr>
-        <w:pStyle w:val="2"/>
-        <w:ind w:firstLine="709"/>
-        <w:jc w:val="both"/>
+        <w:rPr>
+          <w:lang w:val="en-US"/>
+        </w:rPr>
       </w:pPr>
       <w:bookmarkStart w:id="20" w:name="_Toc233319901"/>
       <w:r>
@@ -12239,19 +12393,239 @@
       <w:bookmarkEnd w:id="20"/>
     </w:p>
     <w:p>
-      <w:pPr>
-        <w:ind w:firstLine="709"/>
-        <w:rPr>
-          <w:i/>
-          <w:color w:val="C00000"/>
-        </w:rPr>
-      </w:pPr>
-      <w:r>
-        <w:rPr>
-          <w:i/>
-          <w:color w:val="C00000"/>
-        </w:rPr>
-        <w:t>Описать реализованную функциональность приложения, требования к входным данным, формат результата</w:t>
+      <w:r>
+        <w:t>На этапе реализации были разработаны и интегрированы все основные модули серверной и клиентской частей приложения в соответствии с требованиями, сформулированными на этапе проектирования.</w:t>
+      </w:r>
+    </w:p>
+    <w:p>
+      <w:r>
+        <w:t>Реализованная функциональность</w:t>
+      </w:r>
+    </w:p>
+    <w:p>
+      <w:r>
+        <w:t>1.</w:t>
+      </w:r>
+      <w:r>
+        <w:tab/>
+        <w:t xml:space="preserve">Модуль авторизации и безопасности. Реализована система аутентификации пользователей на основе </w:t>
+      </w:r>
+      <w:r>
+        <w:rPr>
+          <w:lang w:val="en-US"/>
+        </w:rPr>
+        <w:t>JWT</w:t>
+      </w:r>
+      <w:r>
+        <w:t xml:space="preserve">-токенов с хэшированием паролей алгоритмом </w:t>
+      </w:r>
+      <w:proofErr w:type="spellStart"/>
+      <w:r>
+        <w:rPr>
+          <w:lang w:val="en-US"/>
+        </w:rPr>
+        <w:t>bcrypt</w:t>
+      </w:r>
+      <w:proofErr w:type="spellEnd"/>
+      <w:r>
+        <w:t xml:space="preserve">. При входе в систему пользователь получает токен доступа, который передаётся при каждом последующем </w:t>
+      </w:r>
+      <w:r>
+        <w:rPr>
+          <w:lang w:val="en-US"/>
+        </w:rPr>
+        <w:t>HTTP</w:t>
+      </w:r>
+      <w:r>
+        <w:t xml:space="preserve">-запросе. В зависимости от роли пользователя (студент, преподаватель, администратор) сервер автоматически ограничивает доступ к защищённым </w:t>
+      </w:r>
+      <w:proofErr w:type="spellStart"/>
+      <w:r>
+        <w:t>эндпоинтам</w:t>
+      </w:r>
+      <w:proofErr w:type="spellEnd"/>
+      <w:r>
+        <w:t>.</w:t>
+      </w:r>
+    </w:p>
+    <w:p>
+      <w:r>
+        <w:t>2.</w:t>
+      </w:r>
+      <w:r>
+        <w:tab/>
+        <w:t xml:space="preserve">Модуль управления пользователями. Администратор может добавлять, редактировать и удалять записи о студентах и преподавателях. Поддерживается как ручной ввод данных через графический интерфейс, так и массовая загрузка из файлов формата </w:t>
+      </w:r>
+      <w:r>
+        <w:rPr>
+          <w:lang w:val="en-US"/>
+        </w:rPr>
+        <w:t>Microsoft</w:t>
+      </w:r>
+      <w:r>
+        <w:t xml:space="preserve"> </w:t>
+      </w:r>
+      <w:r>
+        <w:rPr>
+          <w:lang w:val="en-US"/>
+        </w:rPr>
+        <w:t>Excel</w:t>
+      </w:r>
+      <w:r>
+        <w:t xml:space="preserve">. При загрузке из </w:t>
+      </w:r>
+      <w:r>
+        <w:rPr>
+          <w:lang w:val="en-US"/>
+        </w:rPr>
+        <w:t>Excel</w:t>
+      </w:r>
+      <w:r>
+        <w:t xml:space="preserve"> выполняется валидация данных: проверяется наличие обязательных полей, корректность формата и отсутствие дубликатов.</w:t>
+      </w:r>
+    </w:p>
+    <w:p>
+      <w:r>
+        <w:t>3.</w:t>
+      </w:r>
+      <w:r>
+        <w:tab/>
+        <w:t>Модуль управления темами. Преподаватель имеет возможность создавать темы научных работ, указывая уровень (курсовая, ВКР, курсовая/ВКР), название и описание. Каждая тема автоматически связывается с учётной записью создавшего её преподавателя. Предусмотрена возможность просмотра списка собственных тем с отображением текущего статуса (свободна, ожидание подтверждения, занята) и количества поданных заявок.</w:t>
+      </w:r>
+    </w:p>
+    <w:p>
+      <w:r>
+        <w:lastRenderedPageBreak/>
+        <w:t>4.</w:t>
+      </w:r>
+      <w:r>
+        <w:tab/>
+        <w:t>Модуль записи студентов на темы. Студент может просматривать каталог доступных тем с фильтрацией по уровню работы, соответствующему его курсу обучения. Запись на свободную тему формирует заявку со статусом «ожидание». Преподаватель рассматривает поступившие заявки и принимает решение о подтверждении или отклонении. После подтверждения тема автоматически переходит в статус «занята» и становится недоступной для других студентов. Система контролирует, чтобы каждый студент имел не более одной активной (подтверждённой) записи.</w:t>
+      </w:r>
+    </w:p>
+    <w:p>
+      <w:r>
+        <w:t>5.</w:t>
+      </w:r>
+      <w:r>
+        <w:tab/>
+        <w:t xml:space="preserve">Модуль контроля дедлайнов. Реализован сервисный класс </w:t>
+      </w:r>
+      <w:proofErr w:type="spellStart"/>
+      <w:r>
+        <w:rPr>
+          <w:lang w:val="en-US"/>
+        </w:rPr>
+        <w:t>DeadlineChecker</w:t>
+      </w:r>
+      <w:proofErr w:type="spellEnd"/>
+      <w:r>
+        <w:t>, который перед выполнением каждой ключевой операции проверяет соответствие текущей даты установленным дедлайнам. Выделяются следующие временные окна: период ввода тем преподавателями (сентябрь), период записи студентов (до ноября), период смены темы (до середины февраля), формирование предварительного приказа (декабрь) и окончательного приказа (апрель). При попытке выполнить операцию вне допустимого периода система возвращает информативное сообщение об ошибке.</w:t>
+      </w:r>
+    </w:p>
+    <w:p>
+      <w:r>
+        <w:t>6.</w:t>
+      </w:r>
+      <w:r>
+        <w:tab/>
+        <w:t xml:space="preserve">Модуль генерации документации. На основе данных, хранящихся в базе данных, администратор может сформировать предварительный и окончательный приказы в формате </w:t>
+      </w:r>
+      <w:r>
+        <w:rPr>
+          <w:lang w:val="en-US"/>
+        </w:rPr>
+        <w:t>Microsoft</w:t>
+      </w:r>
+      <w:r>
+        <w:t xml:space="preserve"> </w:t>
+      </w:r>
+      <w:r>
+        <w:rPr>
+          <w:lang w:val="en-US"/>
+        </w:rPr>
+        <w:t>Word</w:t>
+      </w:r>
+      <w:r>
+        <w:t>. Документ создаётся на основе заранее подготовленного шаблона, в который автоматически подставляются актуальные списки студентов, темы и научные руководители.</w:t>
+      </w:r>
+    </w:p>
+    <w:p>
+      <w:r>
+        <w:t>Требования к входным данным</w:t>
+      </w:r>
+    </w:p>
+    <w:p>
+      <w:r>
+        <w:t>1.</w:t>
+      </w:r>
+      <w:r>
+        <w:tab/>
+        <w:t xml:space="preserve">Файлы для импорта студентов и преподавателей должны быть в формате </w:t>
+      </w:r>
+      <w:r>
+        <w:rPr>
+          <w:lang w:val="en-US"/>
+        </w:rPr>
+        <w:t>Microsoft</w:t>
+      </w:r>
+      <w:r>
+        <w:t xml:space="preserve"> </w:t>
+      </w:r>
+      <w:r>
+        <w:rPr>
+          <w:lang w:val="en-US"/>
+        </w:rPr>
+        <w:t>Excel</w:t>
+      </w:r>
+      <w:r>
+        <w:t xml:space="preserve"> (.</w:t>
+      </w:r>
+      <w:r>
+        <w:rPr>
+          <w:lang w:val="en-US"/>
+        </w:rPr>
+        <w:t>xlsx</w:t>
+      </w:r>
+      <w:r>
+        <w:t>). Каждый файл должен содержать один лист с таблицей, в первой строке которой расположены заголовки столбцов.</w:t>
+      </w:r>
+    </w:p>
+    <w:p>
+      <w:r>
+        <w:t>2.</w:t>
+      </w:r>
+      <w:r>
+        <w:tab/>
+        <w:t>Для файла студентов обязательными являются следующие столбцы: «ФИО» (полное имя студента), «Курс» (целое число от 1 до 4), «Группа» (буквенно-цифровой идентификатор группы). Допускается наличие дополнительных столбцов, которые игнорируются при импорте.</w:t>
+      </w:r>
+    </w:p>
+    <w:p>
+      <w:r>
+        <w:lastRenderedPageBreak/>
+        <w:t>3.</w:t>
+      </w:r>
+      <w:r>
+        <w:tab/>
+        <w:t>Для файла преподавателей обязательными являются следующие столбцы: «ФИО». Необязательными являются столбцы: «Тема» (дипломной или курсовой работы), «Дедлайн» (если есть курсовая работа должен быть и дедлайн).</w:t>
+      </w:r>
+    </w:p>
+    <w:p>
+      <w:r>
+        <w:t>4.</w:t>
+      </w:r>
+      <w:r>
+        <w:tab/>
+        <w:t>При создании темы преподавателем обязательными полями являются: «Название темы». Необязательным полем является «Выбор студента».</w:t>
+      </w:r>
+    </w:p>
+    <w:p>
+      <w:r>
+        <w:t>5.</w:t>
+      </w:r>
+      <w:r>
+        <w:tab/>
+        <w:t>Данные для авторизации включают логин, пароль и статус (администратор, преподаватель или студент).</w:t>
       </w:r>
     </w:p>
     <w:p>
@@ -12271,89 +12645,95 @@
       </w:pPr>
       <w:bookmarkStart w:id="21" w:name="_Toc233319902"/>
       <w:r>
-        <w:t>Заключение</w:t>
+        <w:t>Заключени</w:t>
       </w:r>
       <w:bookmarkEnd w:id="21"/>
+      <w:r>
+        <w:t>Е</w:t>
+      </w:r>
     </w:p>
     <w:p>
       <w:pPr>
+        <w:pStyle w:val="af3"/>
+        <w:rPr>
+          <w:lang w:val="ru-KZ"/>
+        </w:rPr>
+      </w:pPr>
+      <w:r>
+        <w:rPr>
+          <w:lang w:val="ru-KZ"/>
+        </w:rPr>
+        <w:t>В ходе практики было разработано клиент-серверное приложение для автоматизации процесса распределения тем курсовых и выпускных квалификационных работ. Система включает серверную часть на базе FastAPI, графический интерфейс на Tkinter и реляционную базу данных SQLite, развернутые в контейнерах Docker, что обеспечивает надежное хранение данных, строгое разграничение прав доступа и автоматическую генерацию необходимой документации.</w:t>
+      </w:r>
+    </w:p>
+    <w:p>
+      <w:pPr>
+        <w:pStyle w:val="af3"/>
+        <w:rPr>
+          <w:lang w:val="ru-KZ"/>
+        </w:rPr>
+      </w:pPr>
+      <w:r>
+        <w:rPr>
+          <w:lang w:val="ru-KZ"/>
+        </w:rPr>
+        <w:t>В дальнейшем планируется доработка и расширение функционала приложения, а именно: переход на веб-интерфейс для обеспечения удобного удаленного доступа, внедрение модуля автоматических уведомлений при изменении статусов заявок, а также интеграция с внутренними информационными системами университета для синхронизации актуальных списков обучающихся.</w:t>
+      </w:r>
+    </w:p>
+    <w:p>
+      <w:pPr>
+        <w:pStyle w:val="af3"/>
+        <w:rPr>
+          <w:lang w:val="ru-KZ"/>
+        </w:rPr>
+      </w:pPr>
+      <w:r>
+        <w:rPr>
+          <w:lang w:val="ru-KZ"/>
+        </w:rPr>
+        <w:t>За время прохождения практики мною были решены все задачи, обозначенные ранее.</w:t>
+      </w:r>
+    </w:p>
+    <w:p>
+      <w:pPr>
+        <w:pStyle w:val="af3"/>
+        <w:rPr>
+          <w:lang w:val="ru-KZ"/>
+        </w:rPr>
+      </w:pPr>
+      <w:r>
+        <w:rPr>
+          <w:lang w:val="ru-KZ"/>
+        </w:rPr>
+        <w:t xml:space="preserve">В ходе выполнения задачи разработки и интеграции программных модулей возникла небольшая проблема, а именно: сложности с синхронизацией командной работы и контролем версий кода. Из-за недостаточной координации участники команды периодически перезаписывали изменения друг друга, что </w:t>
+      </w:r>
+      <w:r>
+        <w:rPr>
+          <w:lang w:val="ru-KZ"/>
+        </w:rPr>
+        <w:lastRenderedPageBreak/>
+        <w:t>приводило к конфликтам слияния, необходимости частых откатов и вынуждало работать в режиме последовательных блокировок (фактически по очереди). Кроме того, на личном уровне возникла проблема поддержания актуальности тестов: при изменении структуры базы данных и бизнес-логики тесты устаревали и требовали постоянной ручной правки под актуальный вид данных. По вышеупомянутым причинам было организовано внедрение строгого регламента работы с системой контроля версий Git (переход на модель ветвления с использованием Pull Request'ов и обязательного ревью кода перед слиянием), что полностью исключило потерю и перезапись изменений. Для решения проблемы с тестами было выделено отдельное время на их рефакторинг, а также внедрено правило обязательного обновления тестовой среды параллельно с изменением структуры данных и логики приложения.</w:t>
+      </w:r>
+    </w:p>
+    <w:p>
+      <w:pPr>
+        <w:pStyle w:val="1"/>
         <w:ind w:firstLine="709"/>
+        <w:jc w:val="both"/>
+        <w:rPr>
+          <w:b w:val="0"/>
+          <w:i/>
+          <w:caps w:val="0"/>
+          <w:color w:val="C00000"/>
+          <w:szCs w:val="28"/>
+        </w:rPr>
+      </w:pPr>
+      <w:r>
         <w:rPr>
           <w:i/>
           <w:color w:val="C00000"/>
-          <w:highlight w:val="none"/>
-        </w:rPr>
-      </w:pPr>
-      <w:r>
-        <w:rPr>
-          <w:i/>
-          <w:color w:val="C00000"/>
-        </w:rPr>
-        <w:t>В ходе практики было разработано</w:t>
-      </w:r>
-      <w:proofErr w:type="gramStart"/>
-      <w:r>
-        <w:rPr>
-          <w:i/>
-          <w:color w:val="C00000"/>
-        </w:rPr>
-        <w:t xml:space="preserve"> ….</w:t>
-      </w:r>
-      <w:proofErr w:type="gramEnd"/>
-      <w:r>
-        <w:rPr>
-          <w:i/>
-          <w:color w:val="C00000"/>
-        </w:rPr>
-        <w:t>.</w:t>
-      </w:r>
-    </w:p>
-    <w:p>
-      <w:pPr>
-        <w:ind w:firstLine="709"/>
-        <w:rPr>
-          <w:i/>
-          <w:color w:val="C00000"/>
-        </w:rPr>
-      </w:pPr>
-      <w:r>
-        <w:rPr>
-          <w:i/>
-          <w:color w:val="C00000"/>
-        </w:rPr>
-        <w:t>В дальнейшем планируется ……….</w:t>
-      </w:r>
-    </w:p>
-    <w:p>
-      <w:pPr>
-        <w:ind w:firstLine="709"/>
-        <w:rPr>
-          <w:i/>
-          <w:color w:val="C00000"/>
-        </w:rPr>
-      </w:pPr>
-      <w:r>
-        <w:rPr>
-          <w:i/>
-          <w:color w:val="C00000"/>
-        </w:rPr>
-        <w:t xml:space="preserve">За время прохождения практики мною были решены все задачи, обозначенные ранее. </w:t>
-      </w:r>
-    </w:p>
-    <w:p>
-      <w:pPr>
-        <w:ind w:firstLine="709"/>
-        <w:rPr>
-          <w:i/>
-          <w:color w:val="C00000"/>
-        </w:rPr>
-      </w:pPr>
-      <w:r>
-        <w:rPr>
-          <w:i/>
-          <w:color w:val="C00000"/>
-        </w:rPr>
-        <w:t xml:space="preserve">В ходе выполнения задачи разработки …… небольшая проблема, а именно: По вышеупомянутым причинам было организовано ………. </w:t>
+        </w:rPr>
+        <w:t xml:space="preserve"> </w:t>
       </w:r>
     </w:p>
     <w:p>
@@ -13443,7 +13823,6 @@
         <w:rPr>
           <w:rStyle w:val="a7"/>
           <w:color w:val="FF0000"/>
-          <w:lang w:val="en-US"/>
         </w:rPr>
       </w:pPr>
       <w:proofErr w:type="spellStart"/>
@@ -13647,6 +14026,95 @@
 <file path=word/numbering.xml><?xml version="1.0" encoding="utf-8"?>
 <w:numbering xmlns:wpc="http://schemas.microsoft.com/office/word/2010/wordprocessingCanvas" xmlns:cx="http://schemas.microsoft.com/office/drawing/2014/chartex" xmlns:cx1="http://schemas.microsoft.com/office/drawing/2015/9/8/chartex" xmlns:cx2="http://schemas.microsoft.com/office/drawing/2015/10/21/chartex" xmlns:cx3="http://schemas.microsoft.com/office/drawing/2016/5/9/chartex" xmlns:cx4="http://schemas.microsoft.com/office/drawing/2016/5/10/chartex" xmlns:cx5="http://schemas.microsoft.com/office/drawing/2016/5/11/chartex" xmlns:cx6="http://schemas.microsoft.com/office/drawing/2016/5/12/chartex" xmlns:cx7="http://schemas.microsoft.com/office/drawing/2016/5/13/chartex" xmlns:cx8="http://schemas.microsoft.com/office/drawing/2016/5/14/chartex" xmlns:mc="http://schemas.openxmlformats.org/markup-compatibility/2006" xmlns:aink="http://schemas.microsoft.com/office/drawing/2016/ink" xmlns:am3d="http://schemas.microsoft.com/office/drawing/2017/model3d" xmlns:o="urn:schemas-microsoft-com:office:office" xmlns:oel="http://schemas.microsoft.com/office/2019/extlst" xmlns:r="http://schemas.openxmlformats.org/officeDocument/2006/relationships" xmlns:m="http://schemas.openxmlformats.org/officeDocument/2006/math" xmlns:v="urn:schemas-microsoft-com:vml" xmlns:wp14="http://schemas.microsoft.com/office/word/2010/wordprocessingDrawing" xmlns:wp="http://schemas.openxmlformats.org/drawingml/2006/wordprocessingDrawing" xmlns:w10="urn:schemas-microsoft-com:office:word" xmlns:w="http://schemas.openxmlformats.org/wordprocessingml/2006/main" xmlns:w14="http://schemas.microsoft.com/office/word/2010/wordml" xmlns:w15="http://schemas.microsoft.com/office/word/2012/wordml" xmlns:w16cex="http://schemas.microsoft.com/office/word/2018/wordml/cex" xmlns:w16cid="http://schemas.microsoft.com/office/word/2016/wordml/cid" xmlns:w16="http://schemas.microsoft.com/office/word/2018/wordml" xmlns:w16sdtdh="http://schemas.microsoft.com/office/word/2020/wordml/sdtdatahash" xmlns:w16se="http://schemas.microsoft.com/office/word/2015/wordml/symex" xmlns:wpg="http://schemas.microsoft.com/office/word/2010/wordprocessingGroup" xmlns:wpi="http://schemas.microsoft.com/office/word/2010/wordprocessingInk" xmlns:wne="http://schemas.microsoft.com/office/word/2006/wordml" xmlns:wps="http://schemas.microsoft.com/office/word/2010/wordprocessingShape" mc:Ignorable="w14 w15 w16se w16cid w16 w16cex w16sdtdh wp14">
   <w:abstractNum w:abstractNumId="0" w15:restartNumberingAfterBreak="0">
+    <w:nsid w:val="01082EC4"/>
+    <w:multiLevelType w:val="hybridMultilevel"/>
+    <w:tmpl w:val="7DF20E3A"/>
+    <w:lvl w:ilvl="0" w:tplc="3690928C">
+      <w:start w:val="1"/>
+      <w:numFmt w:val="decimal"/>
+      <w:lvlText w:val="%1."/>
+      <w:lvlJc w:val="left"/>
+      <w:pPr>
+        <w:ind w:left="1080" w:hanging="360"/>
+      </w:pPr>
+      <w:rPr>
+        <w:rFonts w:hint="default"/>
+      </w:rPr>
+    </w:lvl>
+    <w:lvl w:ilvl="1" w:tplc="0C000019" w:tentative="1">
+      <w:start w:val="1"/>
+      <w:numFmt w:val="lowerLetter"/>
+      <w:lvlText w:val="%2."/>
+      <w:lvlJc w:val="left"/>
+      <w:pPr>
+        <w:ind w:left="1800" w:hanging="360"/>
+      </w:pPr>
+    </w:lvl>
+    <w:lvl w:ilvl="2" w:tplc="0C00001B" w:tentative="1">
+      <w:start w:val="1"/>
+      <w:numFmt w:val="lowerRoman"/>
+      <w:lvlText w:val="%3."/>
+      <w:lvlJc w:val="right"/>
+      <w:pPr>
+        <w:ind w:left="2520" w:hanging="180"/>
+      </w:pPr>
+    </w:lvl>
+    <w:lvl w:ilvl="3" w:tplc="0C00000F" w:tentative="1">
+      <w:start w:val="1"/>
+      <w:numFmt w:val="decimal"/>
+      <w:lvlText w:val="%4."/>
+      <w:lvlJc w:val="left"/>
+      <w:pPr>
+        <w:ind w:left="3240" w:hanging="360"/>
+      </w:pPr>
+    </w:lvl>
+    <w:lvl w:ilvl="4" w:tplc="0C000019" w:tentative="1">
+      <w:start w:val="1"/>
+      <w:numFmt w:val="lowerLetter"/>
+      <w:lvlText w:val="%5."/>
+      <w:lvlJc w:val="left"/>
+      <w:pPr>
+        <w:ind w:left="3960" w:hanging="360"/>
+      </w:pPr>
+    </w:lvl>
+    <w:lvl w:ilvl="5" w:tplc="0C00001B" w:tentative="1">
+      <w:start w:val="1"/>
+      <w:numFmt w:val="lowerRoman"/>
+      <w:lvlText w:val="%6."/>
+      <w:lvlJc w:val="right"/>
+      <w:pPr>
+        <w:ind w:left="4680" w:hanging="180"/>
+      </w:pPr>
+    </w:lvl>
+    <w:lvl w:ilvl="6" w:tplc="0C00000F" w:tentative="1">
+      <w:start w:val="1"/>
+      <w:numFmt w:val="decimal"/>
+      <w:lvlText w:val="%7."/>
+      <w:lvlJc w:val="left"/>
+      <w:pPr>
+        <w:ind w:left="5400" w:hanging="360"/>
+      </w:pPr>
+    </w:lvl>
+    <w:lvl w:ilvl="7" w:tplc="0C000019" w:tentative="1">
+      <w:start w:val="1"/>
+      <w:numFmt w:val="lowerLetter"/>
+      <w:lvlText w:val="%8."/>
+      <w:lvlJc w:val="left"/>
+      <w:pPr>
+        <w:ind w:left="6120" w:hanging="360"/>
+      </w:pPr>
+    </w:lvl>
+    <w:lvl w:ilvl="8" w:tplc="0C00001B" w:tentative="1">
+      <w:start w:val="1"/>
+      <w:numFmt w:val="lowerRoman"/>
+      <w:lvlText w:val="%9."/>
+      <w:lvlJc w:val="right"/>
+      <w:pPr>
+        <w:ind w:left="6840" w:hanging="180"/>
+      </w:pPr>
+    </w:lvl>
+  </w:abstractNum>
+  <w:abstractNum w:abstractNumId="1" w15:restartNumberingAfterBreak="0">
     <w:nsid w:val="0BF971B2"/>
     <w:multiLevelType w:val="multilevel"/>
     <w:tmpl w:val="295656E2"/>
@@ -13764,7 +14232,7 @@
       </w:pPr>
     </w:lvl>
   </w:abstractNum>
-  <w:abstractNum w:abstractNumId="1" w15:restartNumberingAfterBreak="0">
+  <w:abstractNum w:abstractNumId="2" w15:restartNumberingAfterBreak="0">
     <w:nsid w:val="0E840B45"/>
     <w:multiLevelType w:val="multilevel"/>
     <w:tmpl w:val="1DC0B652"/>
@@ -13904,7 +14372,7 @@
       </w:rPr>
     </w:lvl>
   </w:abstractNum>
-  <w:abstractNum w:abstractNumId="2" w15:restartNumberingAfterBreak="0">
+  <w:abstractNum w:abstractNumId="3" w15:restartNumberingAfterBreak="0">
     <w:nsid w:val="112C75E0"/>
     <w:multiLevelType w:val="multilevel"/>
     <w:tmpl w:val="B4DAA8E6"/>
@@ -14024,7 +14492,7 @@
       </w:pPr>
     </w:lvl>
   </w:abstractNum>
-  <w:abstractNum w:abstractNumId="3" w15:restartNumberingAfterBreak="0">
+  <w:abstractNum w:abstractNumId="4" w15:restartNumberingAfterBreak="0">
     <w:nsid w:val="131C473D"/>
     <w:multiLevelType w:val="multilevel"/>
     <w:tmpl w:val="55865BF8"/>
@@ -14173,7 +14641,7 @@
       </w:rPr>
     </w:lvl>
   </w:abstractNum>
-  <w:abstractNum w:abstractNumId="4" w15:restartNumberingAfterBreak="0">
+  <w:abstractNum w:abstractNumId="5" w15:restartNumberingAfterBreak="0">
     <w:nsid w:val="1A2E0D9F"/>
     <w:multiLevelType w:val="multilevel"/>
     <w:tmpl w:val="74ECDC4A"/>
@@ -14286,7 +14754,7 @@
       </w:pPr>
     </w:lvl>
   </w:abstractNum>
-  <w:abstractNum w:abstractNumId="5" w15:restartNumberingAfterBreak="0">
+  <w:abstractNum w:abstractNumId="6" w15:restartNumberingAfterBreak="0">
     <w:nsid w:val="1AD76B0D"/>
     <w:multiLevelType w:val="hybridMultilevel"/>
     <w:tmpl w:val="66E0254C"/>
@@ -14375,7 +14843,7 @@
       </w:pPr>
     </w:lvl>
   </w:abstractNum>
-  <w:abstractNum w:abstractNumId="6" w15:restartNumberingAfterBreak="0">
+  <w:abstractNum w:abstractNumId="7" w15:restartNumberingAfterBreak="0">
     <w:nsid w:val="1B6065B1"/>
     <w:multiLevelType w:val="hybridMultilevel"/>
     <w:tmpl w:val="0122F506"/>
@@ -14464,10 +14932,10 @@
       </w:pPr>
     </w:lvl>
   </w:abstractNum>
-  <w:abstractNum w:abstractNumId="7" w15:restartNumberingAfterBreak="0">
+  <w:abstractNum w:abstractNumId="8" w15:restartNumberingAfterBreak="0">
     <w:nsid w:val="1DD81A47"/>
     <w:multiLevelType w:val="multilevel"/>
-    <w:tmpl w:val="B2A4E9AE"/>
+    <w:tmpl w:val="9C12FFA4"/>
     <w:lvl w:ilvl="0">
       <w:start w:val="1"/>
       <w:numFmt w:val="decimal"/>
@@ -14480,17 +14948,17 @@
         <w:ind w:left="720" w:hanging="360"/>
       </w:pPr>
     </w:lvl>
-    <w:lvl w:ilvl="1" w:tentative="1">
+    <w:lvl w:ilvl="1">
       <w:start w:val="1"/>
       <w:numFmt w:val="decimal"/>
       <w:lvlText w:val="%2."/>
       <w:lvlJc w:val="left"/>
       <w:pPr>
-        <w:tabs>
-          <w:tab w:val="num" w:pos="1440"/>
-        </w:tabs>
         <w:ind w:left="1440" w:hanging="360"/>
       </w:pPr>
+      <w:rPr>
+        <w:rFonts w:hint="default"/>
+      </w:rPr>
     </w:lvl>
     <w:lvl w:ilvl="2" w:tentative="1">
       <w:start w:val="1"/>
@@ -14577,7 +15045,7 @@
       </w:pPr>
     </w:lvl>
   </w:abstractNum>
-  <w:abstractNum w:abstractNumId="8" w15:restartNumberingAfterBreak="0">
+  <w:abstractNum w:abstractNumId="9" w15:restartNumberingAfterBreak="0">
     <w:nsid w:val="203245FE"/>
     <w:multiLevelType w:val="multilevel"/>
     <w:tmpl w:val="E0BAC584"/>
@@ -14726,10 +15194,366 @@
       </w:rPr>
     </w:lvl>
   </w:abstractNum>
-  <w:abstractNum w:abstractNumId="9" w15:restartNumberingAfterBreak="0">
+  <w:abstractNum w:abstractNumId="10" w15:restartNumberingAfterBreak="0">
     <w:nsid w:val="25945D4F"/>
     <w:multiLevelType w:val="multilevel"/>
-    <w:tmpl w:val="CEBC8232"/>
+    <w:tmpl w:val="367E0FD4"/>
+    <w:lvl w:ilvl="0">
+      <w:start w:val="1"/>
+      <w:numFmt w:val="bullet"/>
+      <w:lvlText w:val=""/>
+      <w:lvlJc w:val="left"/>
+      <w:pPr>
+        <w:tabs>
+          <w:tab w:val="num" w:pos="720"/>
+        </w:tabs>
+        <w:ind w:left="720" w:hanging="360"/>
+      </w:pPr>
+      <w:rPr>
+        <w:rFonts w:ascii="Symbol" w:hAnsi="Symbol" w:hint="default"/>
+        <w:sz w:val="20"/>
+      </w:rPr>
+    </w:lvl>
+    <w:lvl w:ilvl="1">
+      <w:start w:val="1"/>
+      <w:numFmt w:val="decimal"/>
+      <w:lvlText w:val="%2."/>
+      <w:lvlJc w:val="left"/>
+      <w:pPr>
+        <w:ind w:left="1440" w:hanging="360"/>
+      </w:pPr>
+      <w:rPr>
+        <w:rFonts w:hint="default"/>
+      </w:rPr>
+    </w:lvl>
+    <w:lvl w:ilvl="2" w:tentative="1">
+      <w:start w:val="1"/>
+      <w:numFmt w:val="bullet"/>
+      <w:lvlText w:val=""/>
+      <w:lvlJc w:val="left"/>
+      <w:pPr>
+        <w:tabs>
+          <w:tab w:val="num" w:pos="2160"/>
+        </w:tabs>
+        <w:ind w:left="2160" w:hanging="360"/>
+      </w:pPr>
+      <w:rPr>
+        <w:rFonts w:ascii="Wingdings" w:hAnsi="Wingdings" w:hint="default"/>
+        <w:sz w:val="20"/>
+      </w:rPr>
+    </w:lvl>
+    <w:lvl w:ilvl="3" w:tentative="1">
+      <w:start w:val="1"/>
+      <w:numFmt w:val="bullet"/>
+      <w:lvlText w:val=""/>
+      <w:lvlJc w:val="left"/>
+      <w:pPr>
+        <w:tabs>
+          <w:tab w:val="num" w:pos="2880"/>
+        </w:tabs>
+        <w:ind w:left="2880" w:hanging="360"/>
+      </w:pPr>
+      <w:rPr>
+        <w:rFonts w:ascii="Wingdings" w:hAnsi="Wingdings" w:hint="default"/>
+        <w:sz w:val="20"/>
+      </w:rPr>
+    </w:lvl>
+    <w:lvl w:ilvl="4" w:tentative="1">
+      <w:start w:val="1"/>
+      <w:numFmt w:val="bullet"/>
+      <w:lvlText w:val=""/>
+      <w:lvlJc w:val="left"/>
+      <w:pPr>
+        <w:tabs>
+          <w:tab w:val="num" w:pos="3600"/>
+        </w:tabs>
+        <w:ind w:left="3600" w:hanging="360"/>
+      </w:pPr>
+      <w:rPr>
+        <w:rFonts w:ascii="Wingdings" w:hAnsi="Wingdings" w:hint="default"/>
+        <w:sz w:val="20"/>
+      </w:rPr>
+    </w:lvl>
+    <w:lvl w:ilvl="5" w:tentative="1">
+      <w:start w:val="1"/>
+      <w:numFmt w:val="bullet"/>
+      <w:lvlText w:val=""/>
+      <w:lvlJc w:val="left"/>
+      <w:pPr>
+        <w:tabs>
+          <w:tab w:val="num" w:pos="4320"/>
+        </w:tabs>
+        <w:ind w:left="4320" w:hanging="360"/>
+      </w:pPr>
+      <w:rPr>
+        <w:rFonts w:ascii="Wingdings" w:hAnsi="Wingdings" w:hint="default"/>
+        <w:sz w:val="20"/>
+      </w:rPr>
+    </w:lvl>
+    <w:lvl w:ilvl="6" w:tentative="1">
+      <w:start w:val="1"/>
+      <w:numFmt w:val="bullet"/>
+      <w:lvlText w:val=""/>
+      <w:lvlJc w:val="left"/>
+      <w:pPr>
+        <w:tabs>
+          <w:tab w:val="num" w:pos="5040"/>
+        </w:tabs>
+        <w:ind w:left="5040" w:hanging="360"/>
+      </w:pPr>
+      <w:rPr>
+        <w:rFonts w:ascii="Wingdings" w:hAnsi="Wingdings" w:hint="default"/>
+        <w:sz w:val="20"/>
+      </w:rPr>
+    </w:lvl>
+    <w:lvl w:ilvl="7" w:tentative="1">
+      <w:start w:val="1"/>
+      <w:numFmt w:val="bullet"/>
+      <w:lvlText w:val=""/>
+      <w:lvlJc w:val="left"/>
+      <w:pPr>
+        <w:tabs>
+          <w:tab w:val="num" w:pos="5760"/>
+        </w:tabs>
+        <w:ind w:left="5760" w:hanging="360"/>
+      </w:pPr>
+      <w:rPr>
+        <w:rFonts w:ascii="Wingdings" w:hAnsi="Wingdings" w:hint="default"/>
+        <w:sz w:val="20"/>
+      </w:rPr>
+    </w:lvl>
+    <w:lvl w:ilvl="8" w:tentative="1">
+      <w:start w:val="1"/>
+      <w:numFmt w:val="bullet"/>
+      <w:lvlText w:val=""/>
+      <w:lvlJc w:val="left"/>
+      <w:pPr>
+        <w:tabs>
+          <w:tab w:val="num" w:pos="6480"/>
+        </w:tabs>
+        <w:ind w:left="6480" w:hanging="360"/>
+      </w:pPr>
+      <w:rPr>
+        <w:rFonts w:ascii="Wingdings" w:hAnsi="Wingdings" w:hint="default"/>
+        <w:sz w:val="20"/>
+      </w:rPr>
+    </w:lvl>
+  </w:abstractNum>
+  <w:abstractNum w:abstractNumId="11" w15:restartNumberingAfterBreak="0">
+    <w:nsid w:val="3A1F6D91"/>
+    <w:multiLevelType w:val="hybridMultilevel"/>
+    <w:tmpl w:val="C79416FC"/>
+    <w:lvl w:ilvl="0" w:tplc="0C00000F">
+      <w:start w:val="1"/>
+      <w:numFmt w:val="decimal"/>
+      <w:lvlText w:val="%1."/>
+      <w:lvlJc w:val="left"/>
+      <w:pPr>
+        <w:ind w:left="720" w:hanging="360"/>
+      </w:pPr>
+      <w:rPr>
+        <w:rFonts w:hint="default"/>
+      </w:rPr>
+    </w:lvl>
+    <w:lvl w:ilvl="1" w:tplc="0C000019" w:tentative="1">
+      <w:start w:val="1"/>
+      <w:numFmt w:val="lowerLetter"/>
+      <w:lvlText w:val="%2."/>
+      <w:lvlJc w:val="left"/>
+      <w:pPr>
+        <w:ind w:left="1440" w:hanging="360"/>
+      </w:pPr>
+    </w:lvl>
+    <w:lvl w:ilvl="2" w:tplc="0C00001B" w:tentative="1">
+      <w:start w:val="1"/>
+      <w:numFmt w:val="lowerRoman"/>
+      <w:lvlText w:val="%3."/>
+      <w:lvlJc w:val="right"/>
+      <w:pPr>
+        <w:ind w:left="2160" w:hanging="180"/>
+      </w:pPr>
+    </w:lvl>
+    <w:lvl w:ilvl="3" w:tplc="0C00000F" w:tentative="1">
+      <w:start w:val="1"/>
+      <w:numFmt w:val="decimal"/>
+      <w:lvlText w:val="%4."/>
+      <w:lvlJc w:val="left"/>
+      <w:pPr>
+        <w:ind w:left="2880" w:hanging="360"/>
+      </w:pPr>
+    </w:lvl>
+    <w:lvl w:ilvl="4" w:tplc="0C000019" w:tentative="1">
+      <w:start w:val="1"/>
+      <w:numFmt w:val="lowerLetter"/>
+      <w:lvlText w:val="%5."/>
+      <w:lvlJc w:val="left"/>
+      <w:pPr>
+        <w:ind w:left="3600" w:hanging="360"/>
+      </w:pPr>
+    </w:lvl>
+    <w:lvl w:ilvl="5" w:tplc="0C00001B" w:tentative="1">
+      <w:start w:val="1"/>
+      <w:numFmt w:val="lowerRoman"/>
+      <w:lvlText w:val="%6."/>
+      <w:lvlJc w:val="right"/>
+      <w:pPr>
+        <w:ind w:left="4320" w:hanging="180"/>
+      </w:pPr>
+    </w:lvl>
+    <w:lvl w:ilvl="6" w:tplc="0C00000F" w:tentative="1">
+      <w:start w:val="1"/>
+      <w:numFmt w:val="decimal"/>
+      <w:lvlText w:val="%7."/>
+      <w:lvlJc w:val="left"/>
+      <w:pPr>
+        <w:ind w:left="5040" w:hanging="360"/>
+      </w:pPr>
+    </w:lvl>
+    <w:lvl w:ilvl="7" w:tplc="0C000019" w:tentative="1">
+      <w:start w:val="1"/>
+      <w:numFmt w:val="lowerLetter"/>
+      <w:lvlText w:val="%8."/>
+      <w:lvlJc w:val="left"/>
+      <w:pPr>
+        <w:ind w:left="5760" w:hanging="360"/>
+      </w:pPr>
+    </w:lvl>
+    <w:lvl w:ilvl="8" w:tplc="0C00001B" w:tentative="1">
+      <w:start w:val="1"/>
+      <w:numFmt w:val="lowerRoman"/>
+      <w:lvlText w:val="%9."/>
+      <w:lvlJc w:val="right"/>
+      <w:pPr>
+        <w:ind w:left="6480" w:hanging="180"/>
+      </w:pPr>
+    </w:lvl>
+  </w:abstractNum>
+  <w:abstractNum w:abstractNumId="12" w15:restartNumberingAfterBreak="0">
+    <w:nsid w:val="3C4F65C8"/>
+    <w:multiLevelType w:val="multilevel"/>
+    <w:tmpl w:val="0D328BD2"/>
+    <w:lvl w:ilvl="0">
+      <w:start w:val="1"/>
+      <w:numFmt w:val="none"/>
+      <w:suff w:val="nothing"/>
+      <w:lvlText w:val=""/>
+      <w:lvlJc w:val="left"/>
+      <w:pPr>
+        <w:tabs>
+          <w:tab w:val="num" w:pos="0"/>
+        </w:tabs>
+        <w:ind w:left="0" w:firstLine="0"/>
+      </w:pPr>
+    </w:lvl>
+    <w:lvl w:ilvl="1">
+      <w:start w:val="1"/>
+      <w:numFmt w:val="none"/>
+      <w:suff w:val="nothing"/>
+      <w:lvlText w:val=""/>
+      <w:lvlJc w:val="left"/>
+      <w:pPr>
+        <w:tabs>
+          <w:tab w:val="num" w:pos="0"/>
+        </w:tabs>
+        <w:ind w:left="0" w:firstLine="0"/>
+      </w:pPr>
+    </w:lvl>
+    <w:lvl w:ilvl="2">
+      <w:start w:val="1"/>
+      <w:numFmt w:val="none"/>
+      <w:suff w:val="nothing"/>
+      <w:lvlText w:val=""/>
+      <w:lvlJc w:val="left"/>
+      <w:pPr>
+        <w:tabs>
+          <w:tab w:val="num" w:pos="0"/>
+        </w:tabs>
+        <w:ind w:left="0" w:firstLine="0"/>
+      </w:pPr>
+    </w:lvl>
+    <w:lvl w:ilvl="3">
+      <w:start w:val="1"/>
+      <w:numFmt w:val="none"/>
+      <w:suff w:val="nothing"/>
+      <w:lvlText w:val=""/>
+      <w:lvlJc w:val="left"/>
+      <w:pPr>
+        <w:tabs>
+          <w:tab w:val="num" w:pos="0"/>
+        </w:tabs>
+        <w:ind w:left="0" w:firstLine="0"/>
+      </w:pPr>
+    </w:lvl>
+    <w:lvl w:ilvl="4">
+      <w:start w:val="1"/>
+      <w:numFmt w:val="none"/>
+      <w:suff w:val="nothing"/>
+      <w:lvlText w:val=""/>
+      <w:lvlJc w:val="left"/>
+      <w:pPr>
+        <w:tabs>
+          <w:tab w:val="num" w:pos="0"/>
+        </w:tabs>
+        <w:ind w:left="0" w:firstLine="0"/>
+      </w:pPr>
+    </w:lvl>
+    <w:lvl w:ilvl="5">
+      <w:start w:val="1"/>
+      <w:numFmt w:val="none"/>
+      <w:suff w:val="nothing"/>
+      <w:lvlText w:val=""/>
+      <w:lvlJc w:val="left"/>
+      <w:pPr>
+        <w:tabs>
+          <w:tab w:val="num" w:pos="0"/>
+        </w:tabs>
+        <w:ind w:left="0" w:firstLine="0"/>
+      </w:pPr>
+    </w:lvl>
+    <w:lvl w:ilvl="6">
+      <w:start w:val="1"/>
+      <w:numFmt w:val="none"/>
+      <w:suff w:val="nothing"/>
+      <w:lvlText w:val=""/>
+      <w:lvlJc w:val="left"/>
+      <w:pPr>
+        <w:tabs>
+          <w:tab w:val="num" w:pos="0"/>
+        </w:tabs>
+        <w:ind w:left="0" w:firstLine="0"/>
+      </w:pPr>
+    </w:lvl>
+    <w:lvl w:ilvl="7">
+      <w:start w:val="1"/>
+      <w:numFmt w:val="none"/>
+      <w:suff w:val="nothing"/>
+      <w:lvlText w:val=""/>
+      <w:lvlJc w:val="left"/>
+      <w:pPr>
+        <w:tabs>
+          <w:tab w:val="num" w:pos="0"/>
+        </w:tabs>
+        <w:ind w:left="0" w:firstLine="0"/>
+      </w:pPr>
+    </w:lvl>
+    <w:lvl w:ilvl="8">
+      <w:start w:val="1"/>
+      <w:numFmt w:val="none"/>
+      <w:suff w:val="nothing"/>
+      <w:lvlText w:val=""/>
+      <w:lvlJc w:val="left"/>
+      <w:pPr>
+        <w:tabs>
+          <w:tab w:val="num" w:pos="0"/>
+        </w:tabs>
+        <w:ind w:left="0" w:firstLine="0"/>
+      </w:pPr>
+    </w:lvl>
+  </w:abstractNum>
+  <w:abstractNum w:abstractNumId="13" w15:restartNumberingAfterBreak="0">
+    <w:nsid w:val="4CDF5908"/>
+    <w:multiLevelType w:val="multilevel"/>
+    <w:tmpl w:val="97D8ADFC"/>
     <w:lvl w:ilvl="0">
       <w:start w:val="1"/>
       <w:numFmt w:val="bullet"/>
@@ -14875,221 +15699,10 @@
       </w:rPr>
     </w:lvl>
   </w:abstractNum>
-  <w:abstractNum w:abstractNumId="10" w15:restartNumberingAfterBreak="0">
-    <w:nsid w:val="3A1F6D91"/>
-    <w:multiLevelType w:val="hybridMultilevel"/>
-    <w:tmpl w:val="C79416FC"/>
-    <w:lvl w:ilvl="0" w:tplc="0C00000F">
-      <w:start w:val="1"/>
-      <w:numFmt w:val="decimal"/>
-      <w:lvlText w:val="%1."/>
-      <w:lvlJc w:val="left"/>
-      <w:pPr>
-        <w:ind w:left="720" w:hanging="360"/>
-      </w:pPr>
-      <w:rPr>
-        <w:rFonts w:hint="default"/>
-      </w:rPr>
-    </w:lvl>
-    <w:lvl w:ilvl="1" w:tplc="0C000019" w:tentative="1">
-      <w:start w:val="1"/>
-      <w:numFmt w:val="lowerLetter"/>
-      <w:lvlText w:val="%2."/>
-      <w:lvlJc w:val="left"/>
-      <w:pPr>
-        <w:ind w:left="1440" w:hanging="360"/>
-      </w:pPr>
-    </w:lvl>
-    <w:lvl w:ilvl="2" w:tplc="0C00001B" w:tentative="1">
-      <w:start w:val="1"/>
-      <w:numFmt w:val="lowerRoman"/>
-      <w:lvlText w:val="%3."/>
-      <w:lvlJc w:val="right"/>
-      <w:pPr>
-        <w:ind w:left="2160" w:hanging="180"/>
-      </w:pPr>
-    </w:lvl>
-    <w:lvl w:ilvl="3" w:tplc="0C00000F" w:tentative="1">
-      <w:start w:val="1"/>
-      <w:numFmt w:val="decimal"/>
-      <w:lvlText w:val="%4."/>
-      <w:lvlJc w:val="left"/>
-      <w:pPr>
-        <w:ind w:left="2880" w:hanging="360"/>
-      </w:pPr>
-    </w:lvl>
-    <w:lvl w:ilvl="4" w:tplc="0C000019" w:tentative="1">
-      <w:start w:val="1"/>
-      <w:numFmt w:val="lowerLetter"/>
-      <w:lvlText w:val="%5."/>
-      <w:lvlJc w:val="left"/>
-      <w:pPr>
-        <w:ind w:left="3600" w:hanging="360"/>
-      </w:pPr>
-    </w:lvl>
-    <w:lvl w:ilvl="5" w:tplc="0C00001B" w:tentative="1">
-      <w:start w:val="1"/>
-      <w:numFmt w:val="lowerRoman"/>
-      <w:lvlText w:val="%6."/>
-      <w:lvlJc w:val="right"/>
-      <w:pPr>
-        <w:ind w:left="4320" w:hanging="180"/>
-      </w:pPr>
-    </w:lvl>
-    <w:lvl w:ilvl="6" w:tplc="0C00000F" w:tentative="1">
-      <w:start w:val="1"/>
-      <w:numFmt w:val="decimal"/>
-      <w:lvlText w:val="%7."/>
-      <w:lvlJc w:val="left"/>
-      <w:pPr>
-        <w:ind w:left="5040" w:hanging="360"/>
-      </w:pPr>
-    </w:lvl>
-    <w:lvl w:ilvl="7" w:tplc="0C000019" w:tentative="1">
-      <w:start w:val="1"/>
-      <w:numFmt w:val="lowerLetter"/>
-      <w:lvlText w:val="%8."/>
-      <w:lvlJc w:val="left"/>
-      <w:pPr>
-        <w:ind w:left="5760" w:hanging="360"/>
-      </w:pPr>
-    </w:lvl>
-    <w:lvl w:ilvl="8" w:tplc="0C00001B" w:tentative="1">
-      <w:start w:val="1"/>
-      <w:numFmt w:val="lowerRoman"/>
-      <w:lvlText w:val="%9."/>
-      <w:lvlJc w:val="right"/>
-      <w:pPr>
-        <w:ind w:left="6480" w:hanging="180"/>
-      </w:pPr>
-    </w:lvl>
-  </w:abstractNum>
-  <w:abstractNum w:abstractNumId="11" w15:restartNumberingAfterBreak="0">
-    <w:nsid w:val="3C4F65C8"/>
+  <w:abstractNum w:abstractNumId="14" w15:restartNumberingAfterBreak="0">
+    <w:nsid w:val="4D12701D"/>
     <w:multiLevelType w:val="multilevel"/>
-    <w:tmpl w:val="0D328BD2"/>
-    <w:lvl w:ilvl="0">
-      <w:start w:val="1"/>
-      <w:numFmt w:val="none"/>
-      <w:suff w:val="nothing"/>
-      <w:lvlText w:val=""/>
-      <w:lvlJc w:val="left"/>
-      <w:pPr>
-        <w:tabs>
-          <w:tab w:val="num" w:pos="0"/>
-        </w:tabs>
-        <w:ind w:left="0" w:firstLine="0"/>
-      </w:pPr>
-    </w:lvl>
-    <w:lvl w:ilvl="1">
-      <w:start w:val="1"/>
-      <w:numFmt w:val="none"/>
-      <w:suff w:val="nothing"/>
-      <w:lvlText w:val=""/>
-      <w:lvlJc w:val="left"/>
-      <w:pPr>
-        <w:tabs>
-          <w:tab w:val="num" w:pos="0"/>
-        </w:tabs>
-        <w:ind w:left="0" w:firstLine="0"/>
-      </w:pPr>
-    </w:lvl>
-    <w:lvl w:ilvl="2">
-      <w:start w:val="1"/>
-      <w:numFmt w:val="none"/>
-      <w:suff w:val="nothing"/>
-      <w:lvlText w:val=""/>
-      <w:lvlJc w:val="left"/>
-      <w:pPr>
-        <w:tabs>
-          <w:tab w:val="num" w:pos="0"/>
-        </w:tabs>
-        <w:ind w:left="0" w:firstLine="0"/>
-      </w:pPr>
-    </w:lvl>
-    <w:lvl w:ilvl="3">
-      <w:start w:val="1"/>
-      <w:numFmt w:val="none"/>
-      <w:suff w:val="nothing"/>
-      <w:lvlText w:val=""/>
-      <w:lvlJc w:val="left"/>
-      <w:pPr>
-        <w:tabs>
-          <w:tab w:val="num" w:pos="0"/>
-        </w:tabs>
-        <w:ind w:left="0" w:firstLine="0"/>
-      </w:pPr>
-    </w:lvl>
-    <w:lvl w:ilvl="4">
-      <w:start w:val="1"/>
-      <w:numFmt w:val="none"/>
-      <w:suff w:val="nothing"/>
-      <w:lvlText w:val=""/>
-      <w:lvlJc w:val="left"/>
-      <w:pPr>
-        <w:tabs>
-          <w:tab w:val="num" w:pos="0"/>
-        </w:tabs>
-        <w:ind w:left="0" w:firstLine="0"/>
-      </w:pPr>
-    </w:lvl>
-    <w:lvl w:ilvl="5">
-      <w:start w:val="1"/>
-      <w:numFmt w:val="none"/>
-      <w:suff w:val="nothing"/>
-      <w:lvlText w:val=""/>
-      <w:lvlJc w:val="left"/>
-      <w:pPr>
-        <w:tabs>
-          <w:tab w:val="num" w:pos="0"/>
-        </w:tabs>
-        <w:ind w:left="0" w:firstLine="0"/>
-      </w:pPr>
-    </w:lvl>
-    <w:lvl w:ilvl="6">
-      <w:start w:val="1"/>
-      <w:numFmt w:val="none"/>
-      <w:suff w:val="nothing"/>
-      <w:lvlText w:val=""/>
-      <w:lvlJc w:val="left"/>
-      <w:pPr>
-        <w:tabs>
-          <w:tab w:val="num" w:pos="0"/>
-        </w:tabs>
-        <w:ind w:left="0" w:firstLine="0"/>
-      </w:pPr>
-    </w:lvl>
-    <w:lvl w:ilvl="7">
-      <w:start w:val="1"/>
-      <w:numFmt w:val="none"/>
-      <w:suff w:val="nothing"/>
-      <w:lvlText w:val=""/>
-      <w:lvlJc w:val="left"/>
-      <w:pPr>
-        <w:tabs>
-          <w:tab w:val="num" w:pos="0"/>
-        </w:tabs>
-        <w:ind w:left="0" w:firstLine="0"/>
-      </w:pPr>
-    </w:lvl>
-    <w:lvl w:ilvl="8">
-      <w:start w:val="1"/>
-      <w:numFmt w:val="none"/>
-      <w:suff w:val="nothing"/>
-      <w:lvlText w:val=""/>
-      <w:lvlJc w:val="left"/>
-      <w:pPr>
-        <w:tabs>
-          <w:tab w:val="num" w:pos="0"/>
-        </w:tabs>
-        <w:ind w:left="0" w:firstLine="0"/>
-      </w:pPr>
-    </w:lvl>
-  </w:abstractNum>
-  <w:abstractNum w:abstractNumId="12" w15:restartNumberingAfterBreak="0">
-    <w:nsid w:val="4CDF5908"/>
-    <w:multiLevelType w:val="multilevel"/>
-    <w:tmpl w:val="97D8ADFC"/>
+    <w:tmpl w:val="B64863EC"/>
     <w:lvl w:ilvl="0">
       <w:start w:val="1"/>
       <w:numFmt w:val="bullet"/>
@@ -15235,10 +15848,10 @@
       </w:rPr>
     </w:lvl>
   </w:abstractNum>
-  <w:abstractNum w:abstractNumId="13" w15:restartNumberingAfterBreak="0">
-    <w:nsid w:val="4D12701D"/>
+  <w:abstractNum w:abstractNumId="15" w15:restartNumberingAfterBreak="0">
+    <w:nsid w:val="7315455C"/>
     <w:multiLevelType w:val="multilevel"/>
-    <w:tmpl w:val="B64863EC"/>
+    <w:tmpl w:val="50CAA6CC"/>
     <w:lvl w:ilvl="0">
       <w:start w:val="1"/>
       <w:numFmt w:val="bullet"/>
@@ -15384,10 +15997,263 @@
       </w:rPr>
     </w:lvl>
   </w:abstractNum>
-  <w:abstractNum w:abstractNumId="14" w15:restartNumberingAfterBreak="0">
-    <w:nsid w:val="7315455C"/>
+  <w:abstractNum w:abstractNumId="16" w15:restartNumberingAfterBreak="0">
+    <w:nsid w:val="76C940E9"/>
     <w:multiLevelType w:val="multilevel"/>
-    <w:tmpl w:val="50CAA6CC"/>
+    <w:tmpl w:val="F96652AC"/>
+    <w:lvl w:ilvl="0">
+      <w:start w:val="1"/>
+      <w:numFmt w:val="decimal"/>
+      <w:lvlText w:val="%1."/>
+      <w:lvlJc w:val="left"/>
+      <w:pPr>
+        <w:tabs>
+          <w:tab w:val="num" w:pos="720"/>
+        </w:tabs>
+        <w:ind w:left="720" w:hanging="360"/>
+      </w:pPr>
+    </w:lvl>
+    <w:lvl w:ilvl="1" w:tentative="1">
+      <w:start w:val="1"/>
+      <w:numFmt w:val="decimal"/>
+      <w:lvlText w:val="%2."/>
+      <w:lvlJc w:val="left"/>
+      <w:pPr>
+        <w:tabs>
+          <w:tab w:val="num" w:pos="1440"/>
+        </w:tabs>
+        <w:ind w:left="1440" w:hanging="360"/>
+      </w:pPr>
+    </w:lvl>
+    <w:lvl w:ilvl="2" w:tentative="1">
+      <w:start w:val="1"/>
+      <w:numFmt w:val="decimal"/>
+      <w:lvlText w:val="%3."/>
+      <w:lvlJc w:val="left"/>
+      <w:pPr>
+        <w:tabs>
+          <w:tab w:val="num" w:pos="2160"/>
+        </w:tabs>
+        <w:ind w:left="2160" w:hanging="360"/>
+      </w:pPr>
+    </w:lvl>
+    <w:lvl w:ilvl="3" w:tentative="1">
+      <w:start w:val="1"/>
+      <w:numFmt w:val="decimal"/>
+      <w:lvlText w:val="%4."/>
+      <w:lvlJc w:val="left"/>
+      <w:pPr>
+        <w:tabs>
+          <w:tab w:val="num" w:pos="2880"/>
+        </w:tabs>
+        <w:ind w:left="2880" w:hanging="360"/>
+      </w:pPr>
+    </w:lvl>
+    <w:lvl w:ilvl="4" w:tentative="1">
+      <w:start w:val="1"/>
+      <w:numFmt w:val="decimal"/>
+      <w:lvlText w:val="%5."/>
+      <w:lvlJc w:val="left"/>
+      <w:pPr>
+        <w:tabs>
+          <w:tab w:val="num" w:pos="3600"/>
+        </w:tabs>
+        <w:ind w:left="3600" w:hanging="360"/>
+      </w:pPr>
+    </w:lvl>
+    <w:lvl w:ilvl="5" w:tentative="1">
+      <w:start w:val="1"/>
+      <w:numFmt w:val="decimal"/>
+      <w:lvlText w:val="%6."/>
+      <w:lvlJc w:val="left"/>
+      <w:pPr>
+        <w:tabs>
+          <w:tab w:val="num" w:pos="4320"/>
+        </w:tabs>
+        <w:ind w:left="4320" w:hanging="360"/>
+      </w:pPr>
+    </w:lvl>
+    <w:lvl w:ilvl="6" w:tentative="1">
+      <w:start w:val="1"/>
+      <w:numFmt w:val="decimal"/>
+      <w:lvlText w:val="%7."/>
+      <w:lvlJc w:val="left"/>
+      <w:pPr>
+        <w:tabs>
+          <w:tab w:val="num" w:pos="5040"/>
+        </w:tabs>
+        <w:ind w:left="5040" w:hanging="360"/>
+      </w:pPr>
+    </w:lvl>
+    <w:lvl w:ilvl="7" w:tentative="1">
+      <w:start w:val="1"/>
+      <w:numFmt w:val="decimal"/>
+      <w:lvlText w:val="%8."/>
+      <w:lvlJc w:val="left"/>
+      <w:pPr>
+        <w:tabs>
+          <w:tab w:val="num" w:pos="5760"/>
+        </w:tabs>
+        <w:ind w:left="5760" w:hanging="360"/>
+      </w:pPr>
+    </w:lvl>
+    <w:lvl w:ilvl="8" w:tentative="1">
+      <w:start w:val="1"/>
+      <w:numFmt w:val="decimal"/>
+      <w:lvlText w:val="%9."/>
+      <w:lvlJc w:val="left"/>
+      <w:pPr>
+        <w:tabs>
+          <w:tab w:val="num" w:pos="6480"/>
+        </w:tabs>
+        <w:ind w:left="6480" w:hanging="360"/>
+      </w:pPr>
+    </w:lvl>
+  </w:abstractNum>
+  <w:abstractNum w:abstractNumId="17" w15:restartNumberingAfterBreak="0">
+    <w:nsid w:val="79D07753"/>
+    <w:multiLevelType w:val="multilevel"/>
+    <w:tmpl w:val="1A9E79EE"/>
+    <w:lvl w:ilvl="0">
+      <w:start w:val="1"/>
+      <w:numFmt w:val="bullet"/>
+      <w:lvlText w:val=""/>
+      <w:lvlJc w:val="left"/>
+      <w:pPr>
+        <w:tabs>
+          <w:tab w:val="num" w:pos="0"/>
+        </w:tabs>
+        <w:ind w:left="1080" w:hanging="360"/>
+      </w:pPr>
+      <w:rPr>
+        <w:rFonts w:ascii="Symbol" w:hAnsi="Symbol" w:cs="Symbol" w:hint="default"/>
+      </w:rPr>
+    </w:lvl>
+    <w:lvl w:ilvl="1">
+      <w:start w:val="1"/>
+      <w:numFmt w:val="bullet"/>
+      <w:lvlText w:val="o"/>
+      <w:lvlJc w:val="left"/>
+      <w:pPr>
+        <w:tabs>
+          <w:tab w:val="num" w:pos="0"/>
+        </w:tabs>
+        <w:ind w:left="1800" w:hanging="360"/>
+      </w:pPr>
+      <w:rPr>
+        <w:rFonts w:ascii="Courier New" w:hAnsi="Courier New" w:cs="Courier New" w:hint="default"/>
+      </w:rPr>
+    </w:lvl>
+    <w:lvl w:ilvl="2">
+      <w:start w:val="1"/>
+      <w:numFmt w:val="bullet"/>
+      <w:lvlText w:val=""/>
+      <w:lvlJc w:val="left"/>
+      <w:pPr>
+        <w:tabs>
+          <w:tab w:val="num" w:pos="0"/>
+        </w:tabs>
+        <w:ind w:left="2520" w:hanging="360"/>
+      </w:pPr>
+      <w:rPr>
+        <w:rFonts w:ascii="Wingdings" w:hAnsi="Wingdings" w:cs="Wingdings" w:hint="default"/>
+      </w:rPr>
+    </w:lvl>
+    <w:lvl w:ilvl="3">
+      <w:start w:val="1"/>
+      <w:numFmt w:val="bullet"/>
+      <w:lvlText w:val=""/>
+      <w:lvlJc w:val="left"/>
+      <w:pPr>
+        <w:tabs>
+          <w:tab w:val="num" w:pos="0"/>
+        </w:tabs>
+        <w:ind w:left="3240" w:hanging="360"/>
+      </w:pPr>
+      <w:rPr>
+        <w:rFonts w:ascii="Symbol" w:hAnsi="Symbol" w:cs="Symbol" w:hint="default"/>
+      </w:rPr>
+    </w:lvl>
+    <w:lvl w:ilvl="4">
+      <w:start w:val="1"/>
+      <w:numFmt w:val="bullet"/>
+      <w:lvlText w:val="o"/>
+      <w:lvlJc w:val="left"/>
+      <w:pPr>
+        <w:tabs>
+          <w:tab w:val="num" w:pos="0"/>
+        </w:tabs>
+        <w:ind w:left="3960" w:hanging="360"/>
+      </w:pPr>
+      <w:rPr>
+        <w:rFonts w:ascii="Courier New" w:hAnsi="Courier New" w:cs="Courier New" w:hint="default"/>
+      </w:rPr>
+    </w:lvl>
+    <w:lvl w:ilvl="5">
+      <w:start w:val="1"/>
+      <w:numFmt w:val="bullet"/>
+      <w:lvlText w:val=""/>
+      <w:lvlJc w:val="left"/>
+      <w:pPr>
+        <w:tabs>
+          <w:tab w:val="num" w:pos="0"/>
+        </w:tabs>
+        <w:ind w:left="4680" w:hanging="360"/>
+      </w:pPr>
+      <w:rPr>
+        <w:rFonts w:ascii="Wingdings" w:hAnsi="Wingdings" w:cs="Wingdings" w:hint="default"/>
+      </w:rPr>
+    </w:lvl>
+    <w:lvl w:ilvl="6">
+      <w:start w:val="1"/>
+      <w:numFmt w:val="bullet"/>
+      <w:lvlText w:val=""/>
+      <w:lvlJc w:val="left"/>
+      <w:pPr>
+        <w:tabs>
+          <w:tab w:val="num" w:pos="0"/>
+        </w:tabs>
+        <w:ind w:left="5400" w:hanging="360"/>
+      </w:pPr>
+      <w:rPr>
+        <w:rFonts w:ascii="Symbol" w:hAnsi="Symbol" w:cs="Symbol" w:hint="default"/>
+      </w:rPr>
+    </w:lvl>
+    <w:lvl w:ilvl="7">
+      <w:start w:val="1"/>
+      <w:numFmt w:val="bullet"/>
+      <w:lvlText w:val="o"/>
+      <w:lvlJc w:val="left"/>
+      <w:pPr>
+        <w:tabs>
+          <w:tab w:val="num" w:pos="0"/>
+        </w:tabs>
+        <w:ind w:left="6120" w:hanging="360"/>
+      </w:pPr>
+      <w:rPr>
+        <w:rFonts w:ascii="Courier New" w:hAnsi="Courier New" w:cs="Courier New" w:hint="default"/>
+      </w:rPr>
+    </w:lvl>
+    <w:lvl w:ilvl="8">
+      <w:start w:val="1"/>
+      <w:numFmt w:val="bullet"/>
+      <w:lvlText w:val=""/>
+      <w:lvlJc w:val="left"/>
+      <w:pPr>
+        <w:tabs>
+          <w:tab w:val="num" w:pos="0"/>
+        </w:tabs>
+        <w:ind w:left="6840" w:hanging="360"/>
+      </w:pPr>
+      <w:rPr>
+        <w:rFonts w:ascii="Wingdings" w:hAnsi="Wingdings" w:cs="Wingdings" w:hint="default"/>
+      </w:rPr>
+    </w:lvl>
+  </w:abstractNum>
+  <w:abstractNum w:abstractNumId="18" w15:restartNumberingAfterBreak="0">
+    <w:nsid w:val="7EB1275D"/>
+    <w:multiLevelType w:val="multilevel"/>
+    <w:tmpl w:val="B3CAE0E6"/>
     <w:lvl w:ilvl="0">
       <w:start w:val="1"/>
       <w:numFmt w:val="bullet"/>
@@ -15533,468 +16399,69 @@
       </w:rPr>
     </w:lvl>
   </w:abstractNum>
-  <w:abstractNum w:abstractNumId="15" w15:restartNumberingAfterBreak="0">
-    <w:nsid w:val="76C940E9"/>
-    <w:multiLevelType w:val="multilevel"/>
-    <w:tmpl w:val="F96652AC"/>
-    <w:lvl w:ilvl="0">
-      <w:start w:val="1"/>
-      <w:numFmt w:val="decimal"/>
-      <w:lvlText w:val="%1."/>
-      <w:lvlJc w:val="left"/>
-      <w:pPr>
-        <w:tabs>
-          <w:tab w:val="num" w:pos="720"/>
-        </w:tabs>
-        <w:ind w:left="720" w:hanging="360"/>
-      </w:pPr>
-    </w:lvl>
-    <w:lvl w:ilvl="1" w:tentative="1">
-      <w:start w:val="1"/>
-      <w:numFmt w:val="decimal"/>
-      <w:lvlText w:val="%2."/>
-      <w:lvlJc w:val="left"/>
-      <w:pPr>
-        <w:tabs>
-          <w:tab w:val="num" w:pos="1440"/>
-        </w:tabs>
-        <w:ind w:left="1440" w:hanging="360"/>
-      </w:pPr>
-    </w:lvl>
-    <w:lvl w:ilvl="2" w:tentative="1">
-      <w:start w:val="1"/>
-      <w:numFmt w:val="decimal"/>
-      <w:lvlText w:val="%3."/>
-      <w:lvlJc w:val="left"/>
-      <w:pPr>
-        <w:tabs>
-          <w:tab w:val="num" w:pos="2160"/>
-        </w:tabs>
-        <w:ind w:left="2160" w:hanging="360"/>
-      </w:pPr>
-    </w:lvl>
-    <w:lvl w:ilvl="3" w:tentative="1">
-      <w:start w:val="1"/>
-      <w:numFmt w:val="decimal"/>
-      <w:lvlText w:val="%4."/>
-      <w:lvlJc w:val="left"/>
-      <w:pPr>
-        <w:tabs>
-          <w:tab w:val="num" w:pos="2880"/>
-        </w:tabs>
-        <w:ind w:left="2880" w:hanging="360"/>
-      </w:pPr>
-    </w:lvl>
-    <w:lvl w:ilvl="4" w:tentative="1">
-      <w:start w:val="1"/>
-      <w:numFmt w:val="decimal"/>
-      <w:lvlText w:val="%5."/>
-      <w:lvlJc w:val="left"/>
-      <w:pPr>
-        <w:tabs>
-          <w:tab w:val="num" w:pos="3600"/>
-        </w:tabs>
-        <w:ind w:left="3600" w:hanging="360"/>
-      </w:pPr>
-    </w:lvl>
-    <w:lvl w:ilvl="5" w:tentative="1">
-      <w:start w:val="1"/>
-      <w:numFmt w:val="decimal"/>
-      <w:lvlText w:val="%6."/>
-      <w:lvlJc w:val="left"/>
-      <w:pPr>
-        <w:tabs>
-          <w:tab w:val="num" w:pos="4320"/>
-        </w:tabs>
-        <w:ind w:left="4320" w:hanging="360"/>
-      </w:pPr>
-    </w:lvl>
-    <w:lvl w:ilvl="6" w:tentative="1">
-      <w:start w:val="1"/>
-      <w:numFmt w:val="decimal"/>
-      <w:lvlText w:val="%7."/>
-      <w:lvlJc w:val="left"/>
-      <w:pPr>
-        <w:tabs>
-          <w:tab w:val="num" w:pos="5040"/>
-        </w:tabs>
-        <w:ind w:left="5040" w:hanging="360"/>
-      </w:pPr>
-    </w:lvl>
-    <w:lvl w:ilvl="7" w:tentative="1">
-      <w:start w:val="1"/>
-      <w:numFmt w:val="decimal"/>
-      <w:lvlText w:val="%8."/>
-      <w:lvlJc w:val="left"/>
-      <w:pPr>
-        <w:tabs>
-          <w:tab w:val="num" w:pos="5760"/>
-        </w:tabs>
-        <w:ind w:left="5760" w:hanging="360"/>
-      </w:pPr>
-    </w:lvl>
-    <w:lvl w:ilvl="8" w:tentative="1">
-      <w:start w:val="1"/>
-      <w:numFmt w:val="decimal"/>
-      <w:lvlText w:val="%9."/>
-      <w:lvlJc w:val="left"/>
-      <w:pPr>
-        <w:tabs>
-          <w:tab w:val="num" w:pos="6480"/>
-        </w:tabs>
-        <w:ind w:left="6480" w:hanging="360"/>
-      </w:pPr>
-    </w:lvl>
-  </w:abstractNum>
-  <w:abstractNum w:abstractNumId="16" w15:restartNumberingAfterBreak="0">
-    <w:nsid w:val="79D07753"/>
-    <w:multiLevelType w:val="multilevel"/>
-    <w:tmpl w:val="1A9E79EE"/>
-    <w:lvl w:ilvl="0">
-      <w:start w:val="1"/>
-      <w:numFmt w:val="bullet"/>
-      <w:lvlText w:val=""/>
-      <w:lvlJc w:val="left"/>
-      <w:pPr>
-        <w:tabs>
-          <w:tab w:val="num" w:pos="0"/>
-        </w:tabs>
-        <w:ind w:left="1080" w:hanging="360"/>
-      </w:pPr>
-      <w:rPr>
-        <w:rFonts w:ascii="Symbol" w:hAnsi="Symbol" w:cs="Symbol" w:hint="default"/>
-      </w:rPr>
-    </w:lvl>
-    <w:lvl w:ilvl="1">
-      <w:start w:val="1"/>
-      <w:numFmt w:val="bullet"/>
-      <w:lvlText w:val="o"/>
-      <w:lvlJc w:val="left"/>
-      <w:pPr>
-        <w:tabs>
-          <w:tab w:val="num" w:pos="0"/>
-        </w:tabs>
-        <w:ind w:left="1800" w:hanging="360"/>
-      </w:pPr>
-      <w:rPr>
-        <w:rFonts w:ascii="Courier New" w:hAnsi="Courier New" w:cs="Courier New" w:hint="default"/>
-      </w:rPr>
-    </w:lvl>
-    <w:lvl w:ilvl="2">
-      <w:start w:val="1"/>
-      <w:numFmt w:val="bullet"/>
-      <w:lvlText w:val=""/>
-      <w:lvlJc w:val="left"/>
-      <w:pPr>
-        <w:tabs>
-          <w:tab w:val="num" w:pos="0"/>
-        </w:tabs>
-        <w:ind w:left="2520" w:hanging="360"/>
-      </w:pPr>
-      <w:rPr>
-        <w:rFonts w:ascii="Wingdings" w:hAnsi="Wingdings" w:cs="Wingdings" w:hint="default"/>
-      </w:rPr>
-    </w:lvl>
-    <w:lvl w:ilvl="3">
-      <w:start w:val="1"/>
-      <w:numFmt w:val="bullet"/>
-      <w:lvlText w:val=""/>
-      <w:lvlJc w:val="left"/>
-      <w:pPr>
-        <w:tabs>
-          <w:tab w:val="num" w:pos="0"/>
-        </w:tabs>
-        <w:ind w:left="3240" w:hanging="360"/>
-      </w:pPr>
-      <w:rPr>
-        <w:rFonts w:ascii="Symbol" w:hAnsi="Symbol" w:cs="Symbol" w:hint="default"/>
-      </w:rPr>
-    </w:lvl>
-    <w:lvl w:ilvl="4">
-      <w:start w:val="1"/>
-      <w:numFmt w:val="bullet"/>
-      <w:lvlText w:val="o"/>
-      <w:lvlJc w:val="left"/>
-      <w:pPr>
-        <w:tabs>
-          <w:tab w:val="num" w:pos="0"/>
-        </w:tabs>
-        <w:ind w:left="3960" w:hanging="360"/>
-      </w:pPr>
-      <w:rPr>
-        <w:rFonts w:ascii="Courier New" w:hAnsi="Courier New" w:cs="Courier New" w:hint="default"/>
-      </w:rPr>
-    </w:lvl>
-    <w:lvl w:ilvl="5">
-      <w:start w:val="1"/>
-      <w:numFmt w:val="bullet"/>
-      <w:lvlText w:val=""/>
-      <w:lvlJc w:val="left"/>
-      <w:pPr>
-        <w:tabs>
-          <w:tab w:val="num" w:pos="0"/>
-        </w:tabs>
-        <w:ind w:left="4680" w:hanging="360"/>
-      </w:pPr>
-      <w:rPr>
-        <w:rFonts w:ascii="Wingdings" w:hAnsi="Wingdings" w:cs="Wingdings" w:hint="default"/>
-      </w:rPr>
-    </w:lvl>
-    <w:lvl w:ilvl="6">
-      <w:start w:val="1"/>
-      <w:numFmt w:val="bullet"/>
-      <w:lvlText w:val=""/>
-      <w:lvlJc w:val="left"/>
-      <w:pPr>
-        <w:tabs>
-          <w:tab w:val="num" w:pos="0"/>
-        </w:tabs>
-        <w:ind w:left="5400" w:hanging="360"/>
-      </w:pPr>
-      <w:rPr>
-        <w:rFonts w:ascii="Symbol" w:hAnsi="Symbol" w:cs="Symbol" w:hint="default"/>
-      </w:rPr>
-    </w:lvl>
-    <w:lvl w:ilvl="7">
-      <w:start w:val="1"/>
-      <w:numFmt w:val="bullet"/>
-      <w:lvlText w:val="o"/>
-      <w:lvlJc w:val="left"/>
-      <w:pPr>
-        <w:tabs>
-          <w:tab w:val="num" w:pos="0"/>
-        </w:tabs>
-        <w:ind w:left="6120" w:hanging="360"/>
-      </w:pPr>
-      <w:rPr>
-        <w:rFonts w:ascii="Courier New" w:hAnsi="Courier New" w:cs="Courier New" w:hint="default"/>
-      </w:rPr>
-    </w:lvl>
-    <w:lvl w:ilvl="8">
-      <w:start w:val="1"/>
-      <w:numFmt w:val="bullet"/>
-      <w:lvlText w:val=""/>
-      <w:lvlJc w:val="left"/>
-      <w:pPr>
-        <w:tabs>
-          <w:tab w:val="num" w:pos="0"/>
-        </w:tabs>
-        <w:ind w:left="6840" w:hanging="360"/>
-      </w:pPr>
-      <w:rPr>
-        <w:rFonts w:ascii="Wingdings" w:hAnsi="Wingdings" w:cs="Wingdings" w:hint="default"/>
-      </w:rPr>
-    </w:lvl>
-  </w:abstractNum>
-  <w:abstractNum w:abstractNumId="17" w15:restartNumberingAfterBreak="0">
-    <w:nsid w:val="7EB1275D"/>
-    <w:multiLevelType w:val="multilevel"/>
-    <w:tmpl w:val="B3CAE0E6"/>
-    <w:lvl w:ilvl="0">
-      <w:start w:val="1"/>
-      <w:numFmt w:val="bullet"/>
-      <w:lvlText w:val=""/>
-      <w:lvlJc w:val="left"/>
-      <w:pPr>
-        <w:tabs>
-          <w:tab w:val="num" w:pos="720"/>
-        </w:tabs>
-        <w:ind w:left="720" w:hanging="360"/>
-      </w:pPr>
-      <w:rPr>
-        <w:rFonts w:ascii="Symbol" w:hAnsi="Symbol" w:hint="default"/>
-        <w:sz w:val="20"/>
-      </w:rPr>
-    </w:lvl>
-    <w:lvl w:ilvl="1" w:tentative="1">
-      <w:start w:val="1"/>
-      <w:numFmt w:val="bullet"/>
-      <w:lvlText w:val="o"/>
-      <w:lvlJc w:val="left"/>
-      <w:pPr>
-        <w:tabs>
-          <w:tab w:val="num" w:pos="1440"/>
-        </w:tabs>
-        <w:ind w:left="1440" w:hanging="360"/>
-      </w:pPr>
-      <w:rPr>
-        <w:rFonts w:ascii="Courier New" w:hAnsi="Courier New" w:hint="default"/>
-        <w:sz w:val="20"/>
-      </w:rPr>
-    </w:lvl>
-    <w:lvl w:ilvl="2" w:tentative="1">
-      <w:start w:val="1"/>
-      <w:numFmt w:val="bullet"/>
-      <w:lvlText w:val=""/>
-      <w:lvlJc w:val="left"/>
-      <w:pPr>
-        <w:tabs>
-          <w:tab w:val="num" w:pos="2160"/>
-        </w:tabs>
-        <w:ind w:left="2160" w:hanging="360"/>
-      </w:pPr>
-      <w:rPr>
-        <w:rFonts w:ascii="Wingdings" w:hAnsi="Wingdings" w:hint="default"/>
-        <w:sz w:val="20"/>
-      </w:rPr>
-    </w:lvl>
-    <w:lvl w:ilvl="3" w:tentative="1">
-      <w:start w:val="1"/>
-      <w:numFmt w:val="bullet"/>
-      <w:lvlText w:val=""/>
-      <w:lvlJc w:val="left"/>
-      <w:pPr>
-        <w:tabs>
-          <w:tab w:val="num" w:pos="2880"/>
-        </w:tabs>
-        <w:ind w:left="2880" w:hanging="360"/>
-      </w:pPr>
-      <w:rPr>
-        <w:rFonts w:ascii="Wingdings" w:hAnsi="Wingdings" w:hint="default"/>
-        <w:sz w:val="20"/>
-      </w:rPr>
-    </w:lvl>
-    <w:lvl w:ilvl="4" w:tentative="1">
-      <w:start w:val="1"/>
-      <w:numFmt w:val="bullet"/>
-      <w:lvlText w:val=""/>
-      <w:lvlJc w:val="left"/>
-      <w:pPr>
-        <w:tabs>
-          <w:tab w:val="num" w:pos="3600"/>
-        </w:tabs>
-        <w:ind w:left="3600" w:hanging="360"/>
-      </w:pPr>
-      <w:rPr>
-        <w:rFonts w:ascii="Wingdings" w:hAnsi="Wingdings" w:hint="default"/>
-        <w:sz w:val="20"/>
-      </w:rPr>
-    </w:lvl>
-    <w:lvl w:ilvl="5" w:tentative="1">
-      <w:start w:val="1"/>
-      <w:numFmt w:val="bullet"/>
-      <w:lvlText w:val=""/>
-      <w:lvlJc w:val="left"/>
-      <w:pPr>
-        <w:tabs>
-          <w:tab w:val="num" w:pos="4320"/>
-        </w:tabs>
-        <w:ind w:left="4320" w:hanging="360"/>
-      </w:pPr>
-      <w:rPr>
-        <w:rFonts w:ascii="Wingdings" w:hAnsi="Wingdings" w:hint="default"/>
-        <w:sz w:val="20"/>
-      </w:rPr>
-    </w:lvl>
-    <w:lvl w:ilvl="6" w:tentative="1">
-      <w:start w:val="1"/>
-      <w:numFmt w:val="bullet"/>
-      <w:lvlText w:val=""/>
-      <w:lvlJc w:val="left"/>
-      <w:pPr>
-        <w:tabs>
-          <w:tab w:val="num" w:pos="5040"/>
-        </w:tabs>
-        <w:ind w:left="5040" w:hanging="360"/>
-      </w:pPr>
-      <w:rPr>
-        <w:rFonts w:ascii="Wingdings" w:hAnsi="Wingdings" w:hint="default"/>
-        <w:sz w:val="20"/>
-      </w:rPr>
-    </w:lvl>
-    <w:lvl w:ilvl="7" w:tentative="1">
-      <w:start w:val="1"/>
-      <w:numFmt w:val="bullet"/>
-      <w:lvlText w:val=""/>
-      <w:lvlJc w:val="left"/>
-      <w:pPr>
-        <w:tabs>
-          <w:tab w:val="num" w:pos="5760"/>
-        </w:tabs>
-        <w:ind w:left="5760" w:hanging="360"/>
-      </w:pPr>
-      <w:rPr>
-        <w:rFonts w:ascii="Wingdings" w:hAnsi="Wingdings" w:hint="default"/>
-        <w:sz w:val="20"/>
-      </w:rPr>
-    </w:lvl>
-    <w:lvl w:ilvl="8" w:tentative="1">
-      <w:start w:val="1"/>
-      <w:numFmt w:val="bullet"/>
-      <w:lvlText w:val=""/>
-      <w:lvlJc w:val="left"/>
-      <w:pPr>
-        <w:tabs>
-          <w:tab w:val="num" w:pos="6480"/>
-        </w:tabs>
-        <w:ind w:left="6480" w:hanging="360"/>
-      </w:pPr>
-      <w:rPr>
-        <w:rFonts w:ascii="Wingdings" w:hAnsi="Wingdings" w:hint="default"/>
-        <w:sz w:val="20"/>
-      </w:rPr>
-    </w:lvl>
-  </w:abstractNum>
   <w:num w:numId="1" w16cid:durableId="1860926494">
+    <w:abstractNumId w:val="2"/>
+  </w:num>
+  <w:num w:numId="2" w16cid:durableId="477303400">
+    <w:abstractNumId w:val="17"/>
+  </w:num>
+  <w:num w:numId="3" w16cid:durableId="1819346471">
+    <w:abstractNumId w:val="3"/>
+  </w:num>
+  <w:num w:numId="4" w16cid:durableId="701328027">
     <w:abstractNumId w:val="1"/>
   </w:num>
-  <w:num w:numId="2" w16cid:durableId="477303400">
-    <w:abstractNumId w:val="16"/>
-  </w:num>
-  <w:num w:numId="3" w16cid:durableId="1819346471">
-    <w:abstractNumId w:val="2"/>
-  </w:num>
-  <w:num w:numId="4" w16cid:durableId="701328027">
-    <w:abstractNumId w:val="0"/>
-  </w:num>
   <w:num w:numId="5" w16cid:durableId="126972834">
-    <w:abstractNumId w:val="11"/>
+    <w:abstractNumId w:val="12"/>
   </w:num>
   <w:num w:numId="6" w16cid:durableId="1787771079">
-    <w:abstractNumId w:val="2"/>
+    <w:abstractNumId w:val="3"/>
     <w:lvlOverride w:ilvl="0"/>
     <w:lvlOverride w:ilvl="1">
       <w:startOverride w:val="1"/>
     </w:lvlOverride>
   </w:num>
   <w:num w:numId="7" w16cid:durableId="259797195">
+    <w:abstractNumId w:val="5"/>
+  </w:num>
+  <w:num w:numId="8" w16cid:durableId="984940862">
+    <w:abstractNumId w:val="18"/>
+  </w:num>
+  <w:num w:numId="9" w16cid:durableId="1557856420">
+    <w:abstractNumId w:val="13"/>
+  </w:num>
+  <w:num w:numId="10" w16cid:durableId="1029798247">
+    <w:abstractNumId w:val="10"/>
+  </w:num>
+  <w:num w:numId="11" w16cid:durableId="838545592">
+    <w:abstractNumId w:val="8"/>
+  </w:num>
+  <w:num w:numId="12" w16cid:durableId="390857734">
+    <w:abstractNumId w:val="9"/>
+  </w:num>
+  <w:num w:numId="13" w16cid:durableId="1062142460">
+    <w:abstractNumId w:val="16"/>
+  </w:num>
+  <w:num w:numId="14" w16cid:durableId="693573212">
     <w:abstractNumId w:val="4"/>
   </w:num>
-  <w:num w:numId="8" w16cid:durableId="984940862">
-    <w:abstractNumId w:val="17"/>
+  <w:num w:numId="15" w16cid:durableId="827940717">
+    <w:abstractNumId w:val="14"/>
   </w:num>
-  <w:num w:numId="9" w16cid:durableId="1557856420">
-    <w:abstractNumId w:val="12"/>
+  <w:num w:numId="16" w16cid:durableId="456531053">
+    <w:abstractNumId w:val="15"/>
   </w:num>
-  <w:num w:numId="10" w16cid:durableId="1029798247">
-    <w:abstractNumId w:val="9"/>
+  <w:num w:numId="17" w16cid:durableId="1990940660">
+    <w:abstractNumId w:val="11"/>
   </w:num>
-  <w:num w:numId="11" w16cid:durableId="838545592">
+  <w:num w:numId="18" w16cid:durableId="646908067">
+    <w:abstractNumId w:val="6"/>
+  </w:num>
+  <w:num w:numId="19" w16cid:durableId="1330674545">
     <w:abstractNumId w:val="7"/>
   </w:num>
-  <w:num w:numId="12" w16cid:durableId="390857734">
-    <w:abstractNumId w:val="8"/>
-  </w:num>
-  <w:num w:numId="13" w16cid:durableId="1062142460">
-    <w:abstractNumId w:val="15"/>
-  </w:num>
-  <w:num w:numId="14" w16cid:durableId="693573212">
-    <w:abstractNumId w:val="3"/>
-  </w:num>
-  <w:num w:numId="15" w16cid:durableId="827940717">
-    <w:abstractNumId w:val="13"/>
-  </w:num>
-  <w:num w:numId="16" w16cid:durableId="456531053">
-    <w:abstractNumId w:val="14"/>
-  </w:num>
-  <w:num w:numId="17" w16cid:durableId="1990940660">
-    <w:abstractNumId w:val="10"/>
-  </w:num>
-  <w:num w:numId="18" w16cid:durableId="646908067">
-    <w:abstractNumId w:val="5"/>
-  </w:num>
-  <w:num w:numId="19" w16cid:durableId="1330674545">
-    <w:abstractNumId w:val="6"/>
+  <w:num w:numId="20" w16cid:durableId="931358517">
+    <w:abstractNumId w:val="0"/>
   </w:num>
 </w:numbering>
 </file>
@@ -16537,7 +17004,6 @@
   <w:style w:type="character" w:default="1" w:styleId="a0">
     <w:name w:val="Default Paragraph Font"/>
     <w:uiPriority w:val="1"/>
-    <w:semiHidden/>
     <w:unhideWhenUsed/>
   </w:style>
   <w:style w:type="table" w:default="1" w:styleId="a1">

</xml_diff>